<commit_message>
Reformatea resúmenes: Arial 12 negro, títulos en negrilla sin secciones plegables, sin advertencias
Co-Authored-By: Claude Sonnet 5.5 <noreply@anthropic.com>
Claude-Session: https://claude.ai/code/session_013iWwbBbHxw2c1QtKDe5PjZ
</commit_message>
<xml_diff>
--- a/Modulo12_Resumen.docx
+++ b/Modulo12_Resumen.docx
@@ -9,12 +9,12 @@
       </w:pPr>
       <w:r>
         <w:rPr>
-          <w:rFonts w:ascii="Calibri" w:cs="Calibri" w:eastAsia="Calibri" w:hAnsi="Calibri"/>
-          <w:b/>
-          <w:bCs/>
-          <w:color w:val="1F4E79"/>
-          <w:sz w:val="40"/>
-          <w:szCs w:val="40"/>
+          <w:rFonts w:ascii="Arial" w:cs="Arial" w:eastAsia="Arial" w:hAnsi="Arial"/>
+          <w:b/>
+          <w:bCs/>
+          <w:color w:val="000000"/>
+          <w:sz w:val="24"/>
+          <w:szCs w:val="24"/>
         </w:rPr>
         <w:t xml:space="preserve">Módulo 12: Defensa del sistema y la red</w:t>
       </w:r>
@@ -26,10 +26,8 @@
       </w:pPr>
       <w:r>
         <w:rPr>
-          <w:rFonts w:ascii="Calibri" w:cs="Calibri" w:eastAsia="Calibri" w:hAnsi="Calibri"/>
-          <w:i/>
-          <w:iCs/>
-          <w:color w:val="595959"/>
+          <w:rFonts w:ascii="Arial" w:cs="Arial" w:eastAsia="Arial" w:hAnsi="Arial"/>
+          <w:color w:val="000000"/>
           <w:sz w:val="24"/>
           <w:szCs w:val="24"/>
         </w:rPr>
@@ -38,15 +36,16 @@
     </w:p>
     <w:p>
       <w:pPr>
-        <w:pStyle w:val="Heading1"/>
         <w:pBdr>
-          <w:bottom w:val="single" w:color="1F4E79" w:sz="8" w:space="2"/>
+          <w:bottom w:val="single" w:color="000000" w:sz="8" w:space="2"/>
         </w:pBdr>
         <w:spacing w:after="120" w:before="280"/>
       </w:pPr>
       <w:r>
         <w:rPr>
-          <w:rFonts w:ascii="Calibri" w:cs="Calibri" w:eastAsia="Calibri" w:hAnsi="Calibri"/>
+          <w:rFonts w:ascii="Arial" w:cs="Arial" w:eastAsia="Arial" w:hAnsi="Arial"/>
+          <w:b/>
+          <w:bCs/>
         </w:rPr>
         <w:t xml:space="preserve">1. Seguridad física</w:t>
       </w:r>
@@ -62,13 +61,13 @@
       </w:pPr>
       <w:r>
         <w:rPr>
-          <w:rFonts w:ascii="Calibri" w:cs="Calibri" w:eastAsia="Calibri" w:hAnsi="Calibri"/>
+          <w:rFonts w:ascii="Arial" w:cs="Arial" w:eastAsia="Arial" w:hAnsi="Arial"/>
         </w:rPr>
         <w:t xml:space="preserve">Lo más común para proteger el acceso físico son las </w:t>
       </w:r>
       <w:r>
         <w:rPr>
-          <w:rFonts w:ascii="Calibri" w:cs="Calibri" w:eastAsia="Calibri" w:hAnsi="Calibri"/>
+          <w:rFonts w:ascii="Arial" w:cs="Arial" w:eastAsia="Arial" w:hAnsi="Arial"/>
           <w:b/>
           <w:bCs/>
         </w:rPr>
@@ -76,7 +75,7 @@
       </w:r>
       <w:r>
         <w:rPr>
-          <w:rFonts w:ascii="Calibri" w:cs="Calibri" w:eastAsia="Calibri" w:hAnsi="Calibri"/>
+          <w:rFonts w:ascii="Arial" w:cs="Arial" w:eastAsia="Arial" w:hAnsi="Arial"/>
         </w:rPr>
         <w:t xml:space="preserve">.</w:t>
       </w:r>
@@ -92,7 +91,7 @@
       </w:pPr>
       <w:r>
         <w:rPr>
-          <w:rFonts w:ascii="Calibri" w:cs="Calibri" w:eastAsia="Calibri" w:hAnsi="Calibri"/>
+          <w:rFonts w:ascii="Arial" w:cs="Arial" w:eastAsia="Arial" w:hAnsi="Arial"/>
           <w:b/>
           <w:bCs/>
         </w:rPr>
@@ -100,7 +99,7 @@
       </w:r>
       <w:r>
         <w:rPr>
-          <w:rFonts w:ascii="Calibri" w:cs="Calibri" w:eastAsia="Calibri" w:hAnsi="Calibri"/>
+          <w:rFonts w:ascii="Arial" w:cs="Arial" w:eastAsia="Arial" w:hAnsi="Arial"/>
         </w:rPr>
         <w:t xml:space="preserve"> características fisiológicas o de comportamiento de la persona. Se usa rostro, huellas, geometría de la mano, iris, retina, firma y voz.</w:t>
       </w:r>
@@ -116,13 +115,13 @@
       </w:pPr>
       <w:r>
         <w:rPr>
-          <w:rFonts w:ascii="Calibri" w:cs="Calibri" w:eastAsia="Calibri" w:hAnsi="Calibri"/>
+          <w:rFonts w:ascii="Arial" w:cs="Arial" w:eastAsia="Arial" w:hAnsi="Arial"/>
         </w:rPr>
         <w:t xml:space="preserve">La precisión de la biometría se mide con el </w:t>
       </w:r>
       <w:r>
         <w:rPr>
-          <w:rFonts w:ascii="Calibri" w:cs="Calibri" w:eastAsia="Calibri" w:hAnsi="Calibri"/>
+          <w:rFonts w:ascii="Arial" w:cs="Arial" w:eastAsia="Arial" w:hAnsi="Arial"/>
           <w:b/>
           <w:bCs/>
         </w:rPr>
@@ -130,7 +129,7 @@
       </w:r>
       <w:r>
         <w:rPr>
-          <w:rFonts w:ascii="Calibri" w:cs="Calibri" w:eastAsia="Calibri" w:hAnsi="Calibri"/>
+          <w:rFonts w:ascii="Arial" w:cs="Arial" w:eastAsia="Arial" w:hAnsi="Arial"/>
         </w:rPr>
         <w:t xml:space="preserve">, el índice de error de conexión cruzada. Es el método más usado.</w:t>
       </w:r>
@@ -146,7 +145,7 @@
       </w:pPr>
       <w:r>
         <w:rPr>
-          <w:rFonts w:ascii="Calibri" w:cs="Calibri" w:eastAsia="Calibri" w:hAnsi="Calibri"/>
+          <w:rFonts w:ascii="Arial" w:cs="Arial" w:eastAsia="Arial" w:hAnsi="Arial"/>
           <w:b/>
           <w:bCs/>
         </w:rPr>
@@ -154,7 +153,7 @@
       </w:r>
       <w:r>
         <w:rPr>
-          <w:rFonts w:ascii="Calibri" w:cs="Calibri" w:eastAsia="Calibri" w:hAnsi="Calibri"/>
+          <w:rFonts w:ascii="Arial" w:cs="Arial" w:eastAsia="Arial" w:hAnsi="Arial"/>
         </w:rPr>
         <w:t xml:space="preserve"> deja entrar a áreas con puntos de ingreso automatizados.</w:t>
       </w:r>
@@ -170,7 +169,7 @@
       </w:pPr>
       <w:r>
         <w:rPr>
-          <w:rFonts w:ascii="Calibri" w:cs="Calibri" w:eastAsia="Calibri" w:hAnsi="Calibri"/>
+          <w:rFonts w:ascii="Arial" w:cs="Arial" w:eastAsia="Arial" w:hAnsi="Arial"/>
           <w:b/>
           <w:bCs/>
         </w:rPr>
@@ -178,13 +177,13 @@
       </w:r>
       <w:r>
         <w:rPr>
-          <w:rFonts w:ascii="Calibri" w:cs="Calibri" w:eastAsia="Calibri" w:hAnsi="Calibri"/>
+          <w:rFonts w:ascii="Arial" w:cs="Arial" w:eastAsia="Arial" w:hAnsi="Arial"/>
         </w:rPr>
         <w:t xml:space="preserve"> dan respuesta instantánea y adecuada. La </w:t>
       </w:r>
       <w:r>
         <w:rPr>
-          <w:rFonts w:ascii="Calibri" w:cs="Calibri" w:eastAsia="Calibri" w:hAnsi="Calibri"/>
+          <w:rFonts w:ascii="Arial" w:cs="Arial" w:eastAsia="Arial" w:hAnsi="Arial"/>
           <w:b/>
           <w:bCs/>
         </w:rPr>
@@ -192,7 +191,7 @@
       </w:r>
       <w:r>
         <w:rPr>
-          <w:rFonts w:ascii="Calibri" w:cs="Calibri" w:eastAsia="Calibri" w:hAnsi="Calibri"/>
+          <w:rFonts w:ascii="Arial" w:cs="Arial" w:eastAsia="Arial" w:hAnsi="Arial"/>
         </w:rPr>
         <w:t xml:space="preserve"> y la vigilancia electrónica los complementan o, a veces, los reemplazan.</w:t>
       </w:r>
@@ -208,7 +207,7 @@
       </w:pPr>
       <w:r>
         <w:rPr>
-          <w:rFonts w:ascii="Calibri" w:cs="Calibri" w:eastAsia="Calibri" w:hAnsi="Calibri"/>
+          <w:rFonts w:ascii="Arial" w:cs="Arial" w:eastAsia="Arial" w:hAnsi="Arial"/>
           <w:b/>
           <w:bCs/>
         </w:rPr>
@@ -216,13 +215,13 @@
       </w:r>
       <w:r>
         <w:rPr>
-          <w:rFonts w:ascii="Calibri" w:cs="Calibri" w:eastAsia="Calibri" w:hAnsi="Calibri"/>
+          <w:rFonts w:ascii="Arial" w:cs="Arial" w:eastAsia="Arial" w:hAnsi="Arial"/>
         </w:rPr>
         <w:t xml:space="preserve"> rastrean cualquier activo que salga de una zona segura. Los sistemas nuevos leen </w:t>
       </w:r>
       <w:r>
         <w:rPr>
-          <w:rFonts w:ascii="Calibri" w:cs="Calibri" w:eastAsia="Calibri" w:hAnsi="Calibri"/>
+          <w:rFonts w:ascii="Arial" w:cs="Arial" w:eastAsia="Arial" w:hAnsi="Arial"/>
           <w:b/>
           <w:bCs/>
         </w:rPr>
@@ -230,34 +229,36 @@
       </w:r>
       <w:r>
         <w:rPr>
-          <w:rFonts w:ascii="Calibri" w:cs="Calibri" w:eastAsia="Calibri" w:hAnsi="Calibri"/>
+          <w:rFonts w:ascii="Arial" w:cs="Arial" w:eastAsia="Arial" w:hAnsi="Arial"/>
         </w:rPr>
         <w:t xml:space="preserve">.</w:t>
       </w:r>
     </w:p>
     <w:p>
       <w:pPr>
-        <w:pStyle w:val="Heading1"/>
         <w:pBdr>
-          <w:bottom w:val="single" w:color="1F4E79" w:sz="8" w:space="2"/>
+          <w:bottom w:val="single" w:color="000000" w:sz="8" w:space="2"/>
         </w:pBdr>
         <w:spacing w:after="120" w:before="280"/>
       </w:pPr>
       <w:r>
         <w:rPr>
-          <w:rFonts w:ascii="Calibri" w:cs="Calibri" w:eastAsia="Calibri" w:hAnsi="Calibri"/>
+          <w:rFonts w:ascii="Arial" w:cs="Arial" w:eastAsia="Arial" w:hAnsi="Arial"/>
+          <w:b/>
+          <w:bCs/>
         </w:rPr>
         <w:t xml:space="preserve">2. Seguridad de aplicación</w:t>
       </w:r>
     </w:p>
     <w:p>
       <w:pPr>
-        <w:pStyle w:val="Heading3"/>
         <w:spacing w:after="80" w:before="160"/>
       </w:pPr>
       <w:r>
         <w:rPr>
-          <w:rFonts w:ascii="Calibri" w:cs="Calibri" w:eastAsia="Calibri" w:hAnsi="Calibri"/>
+          <w:rFonts w:ascii="Arial" w:cs="Arial" w:eastAsia="Arial" w:hAnsi="Arial"/>
+          <w:b/>
+          <w:bCs/>
         </w:rPr>
         <w:t xml:space="preserve">Ciclo de desarrollo seguro</w:t>
       </w:r>
@@ -273,7 +274,7 @@
       </w:pPr>
       <w:r>
         <w:rPr>
-          <w:rFonts w:ascii="Calibri" w:cs="Calibri" w:eastAsia="Calibri" w:hAnsi="Calibri"/>
+          <w:rFonts w:ascii="Arial" w:cs="Arial" w:eastAsia="Arial" w:hAnsi="Arial"/>
         </w:rPr>
         <w:t xml:space="preserve">Desarrollo y prueba</w:t>
       </w:r>
@@ -289,7 +290,7 @@
       </w:pPr>
       <w:r>
         <w:rPr>
-          <w:rFonts w:ascii="Calibri" w:cs="Calibri" w:eastAsia="Calibri" w:hAnsi="Calibri"/>
+          <w:rFonts w:ascii="Arial" w:cs="Arial" w:eastAsia="Arial" w:hAnsi="Arial"/>
         </w:rPr>
         <w:t xml:space="preserve">Preparación y producción</w:t>
       </w:r>
@@ -305,19 +306,20 @@
       </w:pPr>
       <w:r>
         <w:rPr>
-          <w:rFonts w:ascii="Calibri" w:cs="Calibri" w:eastAsia="Calibri" w:hAnsi="Calibri"/>
+          <w:rFonts w:ascii="Arial" w:cs="Arial" w:eastAsia="Arial" w:hAnsi="Arial"/>
         </w:rPr>
         <w:t xml:space="preserve">Aprovisionamiento y desaprovisionamiento</w:t>
       </w:r>
     </w:p>
     <w:p>
       <w:pPr>
-        <w:pStyle w:val="Heading3"/>
         <w:spacing w:after="80" w:before="160"/>
       </w:pPr>
       <w:r>
         <w:rPr>
-          <w:rFonts w:ascii="Calibri" w:cs="Calibri" w:eastAsia="Calibri" w:hAnsi="Calibri"/>
+          <w:rFonts w:ascii="Arial" w:cs="Arial" w:eastAsia="Arial" w:hAnsi="Arial"/>
+          <w:b/>
+          <w:bCs/>
         </w:rPr>
         <w:t xml:space="preserve">Técnicas al codificar</w:t>
       </w:r>
@@ -333,7 +335,7 @@
       </w:pPr>
       <w:r>
         <w:rPr>
-          <w:rFonts w:ascii="Calibri" w:cs="Calibri" w:eastAsia="Calibri" w:hAnsi="Calibri"/>
+          <w:rFonts w:ascii="Arial" w:cs="Arial" w:eastAsia="Arial" w:hAnsi="Arial"/>
         </w:rPr>
         <w:t xml:space="preserve">Normalización</w:t>
       </w:r>
@@ -349,7 +351,7 @@
       </w:pPr>
       <w:r>
         <w:rPr>
-          <w:rFonts w:ascii="Calibri" w:cs="Calibri" w:eastAsia="Calibri" w:hAnsi="Calibri"/>
+          <w:rFonts w:ascii="Arial" w:cs="Arial" w:eastAsia="Arial" w:hAnsi="Arial"/>
         </w:rPr>
         <w:t xml:space="preserve">Stored procedure</w:t>
       </w:r>
@@ -365,7 +367,7 @@
       </w:pPr>
       <w:r>
         <w:rPr>
-          <w:rFonts w:ascii="Calibri" w:cs="Calibri" w:eastAsia="Calibri" w:hAnsi="Calibri"/>
+          <w:rFonts w:ascii="Arial" w:cs="Arial" w:eastAsia="Arial" w:hAnsi="Arial"/>
         </w:rPr>
         <w:t xml:space="preserve">Ofuscación y camuflaje</w:t>
       </w:r>
@@ -381,19 +383,20 @@
       </w:pPr>
       <w:r>
         <w:rPr>
-          <w:rFonts w:ascii="Calibri" w:cs="Calibri" w:eastAsia="Calibri" w:hAnsi="Calibri"/>
+          <w:rFonts w:ascii="Arial" w:cs="Arial" w:eastAsia="Arial" w:hAnsi="Arial"/>
         </w:rPr>
         <w:t xml:space="preserve">Reutilización de código y SDK</w:t>
       </w:r>
     </w:p>
     <w:p>
       <w:pPr>
-        <w:pStyle w:val="Heading3"/>
         <w:spacing w:after="80" w:before="160"/>
       </w:pPr>
       <w:r>
         <w:rPr>
-          <w:rFonts w:ascii="Calibri" w:cs="Calibri" w:eastAsia="Calibri" w:hAnsi="Calibri"/>
+          <w:rFonts w:ascii="Arial" w:cs="Arial" w:eastAsia="Arial" w:hAnsi="Arial"/>
+          <w:b/>
+          <w:bCs/>
         </w:rPr>
         <w:t xml:space="preserve">Control de datos de entrada</w:t>
       </w:r>
@@ -409,13 +412,13 @@
       </w:pPr>
       <w:r>
         <w:rPr>
-          <w:rFonts w:ascii="Calibri" w:cs="Calibri" w:eastAsia="Calibri" w:hAnsi="Calibri"/>
+          <w:rFonts w:ascii="Arial" w:cs="Arial" w:eastAsia="Arial" w:hAnsi="Arial"/>
         </w:rPr>
         <w:t xml:space="preserve">Sirve para mantener la </w:t>
       </w:r>
       <w:r>
         <w:rPr>
-          <w:rFonts w:ascii="Calibri" w:cs="Calibri" w:eastAsia="Calibri" w:hAnsi="Calibri"/>
+          <w:rFonts w:ascii="Arial" w:cs="Arial" w:eastAsia="Arial" w:hAnsi="Arial"/>
           <w:b/>
           <w:bCs/>
         </w:rPr>
@@ -423,7 +426,7 @@
       </w:r>
       <w:r>
         <w:rPr>
-          <w:rFonts w:ascii="Calibri" w:cs="Calibri" w:eastAsia="Calibri" w:hAnsi="Calibri"/>
+          <w:rFonts w:ascii="Arial" w:cs="Arial" w:eastAsia="Arial" w:hAnsi="Arial"/>
         </w:rPr>
         <w:t xml:space="preserve">.</w:t>
       </w:r>
@@ -439,7 +442,7 @@
       </w:pPr>
       <w:r>
         <w:rPr>
-          <w:rFonts w:ascii="Calibri" w:cs="Calibri" w:eastAsia="Calibri" w:hAnsi="Calibri"/>
+          <w:rFonts w:ascii="Arial" w:cs="Arial" w:eastAsia="Arial" w:hAnsi="Arial"/>
         </w:rPr>
         <w:t xml:space="preserve">Muchos ataques insertan datos con formato incorrecto.</w:t>
       </w:r>
@@ -455,13 +458,13 @@
       </w:pPr>
       <w:r>
         <w:rPr>
-          <w:rFonts w:ascii="Calibri" w:cs="Calibri" w:eastAsia="Calibri" w:hAnsi="Calibri"/>
+          <w:rFonts w:ascii="Arial" w:cs="Arial" w:eastAsia="Arial" w:hAnsi="Arial"/>
         </w:rPr>
         <w:t xml:space="preserve">La </w:t>
       </w:r>
       <w:r>
         <w:rPr>
-          <w:rFonts w:ascii="Calibri" w:cs="Calibri" w:eastAsia="Calibri" w:hAnsi="Calibri"/>
+          <w:rFonts w:ascii="Arial" w:cs="Arial" w:eastAsia="Arial" w:hAnsi="Arial"/>
           <w:b/>
           <w:bCs/>
         </w:rPr>
@@ -469,7 +472,7 @@
       </w:r>
       <w:r>
         <w:rPr>
-          <w:rFonts w:ascii="Calibri" w:cs="Calibri" w:eastAsia="Calibri" w:hAnsi="Calibri"/>
+          <w:rFonts w:ascii="Arial" w:cs="Arial" w:eastAsia="Arial" w:hAnsi="Arial"/>
         </w:rPr>
         <w:t xml:space="preserve"> verifica que los datos cumplan los parámetros que definió el diseñador de la BD.</w:t>
       </w:r>
@@ -485,19 +488,20 @@
       </w:pPr>
       <w:r>
         <w:rPr>
-          <w:rFonts w:ascii="Calibri" w:cs="Calibri" w:eastAsia="Calibri" w:hAnsi="Calibri"/>
+          <w:rFonts w:ascii="Arial" w:cs="Arial" w:eastAsia="Arial" w:hAnsi="Arial"/>
         </w:rPr>
         <w:t xml:space="preserve">Esto garantiza integridad, exactitud y coherencia.</w:t>
       </w:r>
     </w:p>
     <w:p>
       <w:pPr>
-        <w:pStyle w:val="Heading3"/>
         <w:spacing w:after="80" w:before="160"/>
       </w:pPr>
       <w:r>
         <w:rPr>
-          <w:rFonts w:ascii="Calibri" w:cs="Calibri" w:eastAsia="Calibri" w:hAnsi="Calibri"/>
+          <w:rFonts w:ascii="Arial" w:cs="Arial" w:eastAsia="Arial" w:hAnsi="Arial"/>
+          <w:b/>
+          <w:bCs/>
         </w:rPr>
         <w:t xml:space="preserve">Control de integridad</w:t>
       </w:r>
@@ -513,13 +517,13 @@
       </w:pPr>
       <w:r>
         <w:rPr>
-          <w:rFonts w:ascii="Calibri" w:cs="Calibri" w:eastAsia="Calibri" w:hAnsi="Calibri"/>
+          <w:rFonts w:ascii="Arial" w:cs="Arial" w:eastAsia="Arial" w:hAnsi="Arial"/>
         </w:rPr>
         <w:t xml:space="preserve">Usa una </w:t>
       </w:r>
       <w:r>
         <w:rPr>
-          <w:rFonts w:ascii="Calibri" w:cs="Calibri" w:eastAsia="Calibri" w:hAnsi="Calibri"/>
+          <w:rFonts w:ascii="Arial" w:cs="Arial" w:eastAsia="Arial" w:hAnsi="Arial"/>
           <w:b/>
           <w:bCs/>
         </w:rPr>
@@ -527,7 +531,7 @@
       </w:r>
       <w:r>
         <w:rPr>
-          <w:rFonts w:ascii="Calibri" w:cs="Calibri" w:eastAsia="Calibri" w:hAnsi="Calibri"/>
+          <w:rFonts w:ascii="Arial" w:cs="Arial" w:eastAsia="Arial" w:hAnsi="Arial"/>
         </w:rPr>
         <w:t xml:space="preserve"> para sacar una "foto" de los datos y comprobar que no cambiaron.</w:t>
       </w:r>
@@ -543,13 +547,13 @@
       </w:pPr>
       <w:r>
         <w:rPr>
-          <w:rFonts w:ascii="Calibri" w:cs="Calibri" w:eastAsia="Calibri" w:hAnsi="Calibri"/>
+          <w:rFonts w:ascii="Arial" w:cs="Arial" w:eastAsia="Arial" w:hAnsi="Arial"/>
         </w:rPr>
         <w:t xml:space="preserve">El </w:t>
       </w:r>
       <w:r>
         <w:rPr>
-          <w:rFonts w:ascii="Calibri" w:cs="Calibri" w:eastAsia="Calibri" w:hAnsi="Calibri"/>
+          <w:rFonts w:ascii="Arial" w:cs="Arial" w:eastAsia="Arial" w:hAnsi="Arial"/>
           <w:b/>
           <w:bCs/>
         </w:rPr>
@@ -557,7 +561,7 @@
       </w:r>
       <w:r>
         <w:rPr>
-          <w:rFonts w:ascii="Calibri" w:cs="Calibri" w:eastAsia="Calibri" w:hAnsi="Calibri"/>
+          <w:rFonts w:ascii="Arial" w:cs="Arial" w:eastAsia="Arial" w:hAnsi="Arial"/>
         </w:rPr>
         <w:t xml:space="preserve"> es un ejemplo de hash.</w:t>
       </w:r>
@@ -573,13 +577,13 @@
       </w:pPr>
       <w:r>
         <w:rPr>
-          <w:rFonts w:ascii="Calibri" w:cs="Calibri" w:eastAsia="Calibri" w:hAnsi="Calibri"/>
+          <w:rFonts w:ascii="Arial" w:cs="Arial" w:eastAsia="Arial" w:hAnsi="Arial"/>
         </w:rPr>
         <w:t xml:space="preserve">La </w:t>
       </w:r>
       <w:r>
         <w:rPr>
-          <w:rFonts w:ascii="Calibri" w:cs="Calibri" w:eastAsia="Calibri" w:hAnsi="Calibri"/>
+          <w:rFonts w:ascii="Arial" w:cs="Arial" w:eastAsia="Arial" w:hAnsi="Arial"/>
           <w:b/>
           <w:bCs/>
         </w:rPr>
@@ -587,7 +591,7 @@
       </w:r>
       <w:r>
         <w:rPr>
-          <w:rFonts w:ascii="Calibri" w:cs="Calibri" w:eastAsia="Calibri" w:hAnsi="Calibri"/>
+          <w:rFonts w:ascii="Arial" w:cs="Arial" w:eastAsia="Arial" w:hAnsi="Arial"/>
         </w:rPr>
         <w:t xml:space="preserve"> demuestra que el software es auténtico.</w:t>
       </w:r>
@@ -603,13 +607,13 @@
       </w:pPr>
       <w:r>
         <w:rPr>
-          <w:rFonts w:ascii="Calibri" w:cs="Calibri" w:eastAsia="Calibri" w:hAnsi="Calibri"/>
+          <w:rFonts w:ascii="Arial" w:cs="Arial" w:eastAsia="Arial" w:hAnsi="Arial"/>
         </w:rPr>
         <w:t xml:space="preserve">Usar </w:t>
       </w:r>
       <w:r>
         <w:rPr>
-          <w:rFonts w:ascii="Calibri" w:cs="Calibri" w:eastAsia="Calibri" w:hAnsi="Calibri"/>
+          <w:rFonts w:ascii="Arial" w:cs="Arial" w:eastAsia="Arial" w:hAnsi="Arial"/>
           <w:b/>
           <w:bCs/>
         </w:rPr>
@@ -617,19 +621,20 @@
       </w:r>
       <w:r>
         <w:rPr>
-          <w:rFonts w:ascii="Calibri" w:cs="Calibri" w:eastAsia="Calibri" w:hAnsi="Calibri"/>
+          <w:rFonts w:ascii="Arial" w:cs="Arial" w:eastAsia="Arial" w:hAnsi="Arial"/>
         </w:rPr>
         <w:t xml:space="preserve"> protege la información.</w:t>
       </w:r>
     </w:p>
     <w:p>
       <w:pPr>
-        <w:pStyle w:val="Heading3"/>
         <w:spacing w:after="80" w:before="160"/>
       </w:pPr>
       <w:r>
         <w:rPr>
-          <w:rFonts w:ascii="Calibri" w:cs="Calibri" w:eastAsia="Calibri" w:hAnsi="Calibri"/>
+          <w:rFonts w:ascii="Arial" w:cs="Arial" w:eastAsia="Arial" w:hAnsi="Arial"/>
+          <w:b/>
+          <w:bCs/>
         </w:rPr>
         <w:t xml:space="preserve">Medidas de la organización</w:t>
       </w:r>
@@ -645,7 +650,7 @@
       </w:pPr>
       <w:r>
         <w:rPr>
-          <w:rFonts w:ascii="Calibri" w:cs="Calibri" w:eastAsia="Calibri" w:hAnsi="Calibri"/>
+          <w:rFonts w:ascii="Arial" w:cs="Arial" w:eastAsia="Arial" w:hAnsi="Arial"/>
         </w:rPr>
         <w:t xml:space="preserve">Políticas de acceso</w:t>
       </w:r>
@@ -661,7 +666,7 @@
       </w:pPr>
       <w:r>
         <w:rPr>
-          <w:rFonts w:ascii="Calibri" w:cs="Calibri" w:eastAsia="Calibri" w:hAnsi="Calibri"/>
+          <w:rFonts w:ascii="Arial" w:cs="Arial" w:eastAsia="Arial" w:hAnsi="Arial"/>
         </w:rPr>
         <w:t xml:space="preserve">Continuidad del negocio y recuperación ante desastres</w:t>
       </w:r>
@@ -677,7 +682,7 @@
       </w:pPr>
       <w:r>
         <w:rPr>
-          <w:rFonts w:ascii="Calibri" w:cs="Calibri" w:eastAsia="Calibri" w:hAnsi="Calibri"/>
+          <w:rFonts w:ascii="Arial" w:cs="Arial" w:eastAsia="Arial" w:hAnsi="Arial"/>
         </w:rPr>
         <w:t xml:space="preserve">Políticas de parches y actualizaciones</w:t>
       </w:r>
@@ -693,7 +698,7 @@
       </w:pPr>
       <w:r>
         <w:rPr>
-          <w:rFonts w:ascii="Calibri" w:cs="Calibri" w:eastAsia="Calibri" w:hAnsi="Calibri"/>
+          <w:rFonts w:ascii="Arial" w:cs="Arial" w:eastAsia="Arial" w:hAnsi="Arial"/>
         </w:rPr>
         <w:t xml:space="preserve">Control de MFA y de archivos de registro (logs)</w:t>
       </w:r>
@@ -709,7 +714,7 @@
       </w:pPr>
       <w:r>
         <w:rPr>
-          <w:rFonts w:ascii="Calibri" w:cs="Calibri" w:eastAsia="Calibri" w:hAnsi="Calibri"/>
+          <w:rFonts w:ascii="Arial" w:cs="Arial" w:eastAsia="Arial" w:hAnsi="Arial"/>
         </w:rPr>
         <w:t xml:space="preserve">Clasificación de datos</w:t>
       </w:r>
@@ -725,7 +730,7 @@
       </w:pPr>
       <w:r>
         <w:rPr>
-          <w:rFonts w:ascii="Calibri" w:cs="Calibri" w:eastAsia="Calibri" w:hAnsi="Calibri"/>
+          <w:rFonts w:ascii="Arial" w:cs="Arial" w:eastAsia="Arial" w:hAnsi="Arial"/>
         </w:rPr>
         <w:t xml:space="preserve">Copias de seguridad</w:t>
       </w:r>
@@ -741,22 +746,23 @@
       </w:pPr>
       <w:r>
         <w:rPr>
-          <w:rFonts w:ascii="Calibri" w:cs="Calibri" w:eastAsia="Calibri" w:hAnsi="Calibri"/>
+          <w:rFonts w:ascii="Arial" w:cs="Arial" w:eastAsia="Arial" w:hAnsi="Arial"/>
         </w:rPr>
         <w:t xml:space="preserve">Pruebas de software antes del lanzamiento</w:t>
       </w:r>
     </w:p>
     <w:p>
       <w:pPr>
-        <w:pStyle w:val="Heading1"/>
         <w:pBdr>
-          <w:bottom w:val="single" w:color="1F4E79" w:sz="8" w:space="2"/>
+          <w:bottom w:val="single" w:color="000000" w:sz="8" w:space="2"/>
         </w:pBdr>
         <w:spacing w:after="120" w:before="280"/>
       </w:pPr>
       <w:r>
         <w:rPr>
-          <w:rFonts w:ascii="Calibri" w:cs="Calibri" w:eastAsia="Calibri" w:hAnsi="Calibri"/>
+          <w:rFonts w:ascii="Arial" w:cs="Arial" w:eastAsia="Arial" w:hAnsi="Arial"/>
+          <w:b/>
+          <w:bCs/>
         </w:rPr>
         <w:t xml:space="preserve">3. Fortalecimiento de la red: servicios y protocolos</w:t>
       </w:r>
@@ -767,45 +773,9 @@
       </w:pPr>
       <w:r>
         <w:rPr>
-          <w:rFonts w:ascii="Calibri" w:cs="Calibri" w:eastAsia="Calibri" w:hAnsi="Calibri"/>
+          <w:rFonts w:ascii="Arial" w:cs="Arial" w:eastAsia="Arial" w:hAnsi="Arial"/>
         </w:rPr>
         <w:t xml:space="preserve">Los ciberdelincuentes aprovechan servicios de red vulnerables para atacar un dispositivo o usarlo como parte del ataque.</w:t>
-      </w:r>
-    </w:p>
-    <w:p>
-      <w:pPr>
-        <w:shd w:fill="FEF3C7" w:val="clear"/>
-        <w:spacing w:after="100" w:before="60"/>
-        <w:ind w:left="120" w:right="120"/>
-      </w:pPr>
-      <w:r>
-        <w:rPr>
-          <w:rFonts w:ascii="Calibri" w:cs="Calibri" w:eastAsia="Calibri" w:hAnsi="Calibri"/>
-          <w:b/>
-          <w:bCs/>
-          <w:color w:val="B45309"/>
-        </w:rPr>
-        <w:t xml:space="preserve">⚠ Ojo: </w:t>
-      </w:r>
-      <w:r>
-        <w:rPr>
-          <w:rFonts w:ascii="Calibri" w:cs="Calibri" w:eastAsia="Calibri" w:hAnsi="Calibri"/>
-        </w:rPr>
-        <w:t xml:space="preserve">Hay que exponer </w:t>
-      </w:r>
-      <w:r>
-        <w:rPr>
-          <w:rFonts w:ascii="Calibri" w:cs="Calibri" w:eastAsia="Calibri" w:hAnsi="Calibri"/>
-          <w:b/>
-          <w:bCs/>
-        </w:rPr>
-        <w:t xml:space="preserve">solo los puertos necesarios</w:t>
-      </w:r>
-      <w:r>
-        <w:rPr>
-          <w:rFonts w:ascii="Calibri" w:cs="Calibri" w:eastAsia="Calibri" w:hAnsi="Calibri"/>
-        </w:rPr>
-        <w:t xml:space="preserve">.</w:t>
       </w:r>
     </w:p>
     <w:tbl>
@@ -833,12 +803,12 @@
           <w:tcPr>
             <w:tcW w:type="dxa" w:w="1900"/>
             <w:tcBorders>
-              <w:top w:val="single" w:color="BFBFBF" w:sz="4"/>
-              <w:left w:val="single" w:color="BFBFBF" w:sz="4"/>
-              <w:bottom w:val="single" w:color="BFBFBF" w:sz="4"/>
-              <w:right w:val="single" w:color="BFBFBF" w:sz="4"/>
+              <w:top w:val="single" w:color="000000" w:sz="4"/>
+              <w:left w:val="single" w:color="000000" w:sz="4"/>
+              <w:bottom w:val="single" w:color="000000" w:sz="4"/>
+              <w:right w:val="single" w:color="000000" w:sz="4"/>
             </w:tcBorders>
-            <w:shd w:fill="1F4E79" w:val="clear"/>
+            <w:shd w:fill="D9D9D9" w:val="clear"/>
             <w:tcMar>
               <w:top w:type="dxa" w:w="60"/>
               <w:left w:type="dxa" w:w="100"/>
@@ -849,10 +819,10 @@
           <w:p>
             <w:r>
               <w:rPr>
-                <w:rFonts w:ascii="Calibri" w:cs="Calibri" w:eastAsia="Calibri" w:hAnsi="Calibri"/>
+                <w:rFonts w:ascii="Arial" w:cs="Arial" w:eastAsia="Arial" w:hAnsi="Arial"/>
                 <w:b/>
                 <w:bCs/>
-                <w:color w:val="FFFFFF"/>
+                <w:color w:val="000000"/>
               </w:rPr>
               <w:t xml:space="preserve">Servicio</w:t>
             </w:r>
@@ -862,12 +832,12 @@
           <w:tcPr>
             <w:tcW w:type="dxa" w:w="3200"/>
             <w:tcBorders>
-              <w:top w:val="single" w:color="BFBFBF" w:sz="4"/>
-              <w:left w:val="single" w:color="BFBFBF" w:sz="4"/>
-              <w:bottom w:val="single" w:color="BFBFBF" w:sz="4"/>
-              <w:right w:val="single" w:color="BFBFBF" w:sz="4"/>
+              <w:top w:val="single" w:color="000000" w:sz="4"/>
+              <w:left w:val="single" w:color="000000" w:sz="4"/>
+              <w:bottom w:val="single" w:color="000000" w:sz="4"/>
+              <w:right w:val="single" w:color="000000" w:sz="4"/>
             </w:tcBorders>
-            <w:shd w:fill="1F4E79" w:val="clear"/>
+            <w:shd w:fill="D9D9D9" w:val="clear"/>
             <w:tcMar>
               <w:top w:type="dxa" w:w="60"/>
               <w:left w:type="dxa" w:w="100"/>
@@ -878,10 +848,10 @@
           <w:p>
             <w:r>
               <w:rPr>
-                <w:rFonts w:ascii="Calibri" w:cs="Calibri" w:eastAsia="Calibri" w:hAnsi="Calibri"/>
+                <w:rFonts w:ascii="Arial" w:cs="Arial" w:eastAsia="Arial" w:hAnsi="Arial"/>
                 <w:b/>
                 <w:bCs/>
-                <w:color w:val="FFFFFF"/>
+                <w:color w:val="000000"/>
               </w:rPr>
               <w:t xml:space="preserve">Qué hace</w:t>
             </w:r>
@@ -891,12 +861,12 @@
           <w:tcPr>
             <w:tcW w:type="dxa" w:w="4260"/>
             <w:tcBorders>
-              <w:top w:val="single" w:color="BFBFBF" w:sz="4"/>
-              <w:left w:val="single" w:color="BFBFBF" w:sz="4"/>
-              <w:bottom w:val="single" w:color="BFBFBF" w:sz="4"/>
-              <w:right w:val="single" w:color="BFBFBF" w:sz="4"/>
+              <w:top w:val="single" w:color="000000" w:sz="4"/>
+              <w:left w:val="single" w:color="000000" w:sz="4"/>
+              <w:bottom w:val="single" w:color="000000" w:sz="4"/>
+              <w:right w:val="single" w:color="000000" w:sz="4"/>
             </w:tcBorders>
-            <w:shd w:fill="1F4E79" w:val="clear"/>
+            <w:shd w:fill="D9D9D9" w:val="clear"/>
             <w:tcMar>
               <w:top w:type="dxa" w:w="60"/>
               <w:left w:type="dxa" w:w="100"/>
@@ -907,10 +877,10 @@
           <w:p>
             <w:r>
               <w:rPr>
-                <w:rFonts w:ascii="Calibri" w:cs="Calibri" w:eastAsia="Calibri" w:hAnsi="Calibri"/>
+                <w:rFonts w:ascii="Arial" w:cs="Arial" w:eastAsia="Arial" w:hAnsi="Arial"/>
                 <w:b/>
                 <w:bCs/>
-                <w:color w:val="FFFFFF"/>
+                <w:color w:val="000000"/>
               </w:rPr>
               <w:t xml:space="preserve">Riesgo y defensa</w:t>
             </w:r>
@@ -922,10 +892,10 @@
           <w:tcPr>
             <w:tcW w:type="dxa" w:w="1900"/>
             <w:tcBorders>
-              <w:top w:val="single" w:color="BFBFBF" w:sz="4"/>
-              <w:left w:val="single" w:color="BFBFBF" w:sz="4"/>
-              <w:bottom w:val="single" w:color="BFBFBF" w:sz="4"/>
-              <w:right w:val="single" w:color="BFBFBF" w:sz="4"/>
+              <w:top w:val="single" w:color="000000" w:sz="4"/>
+              <w:left w:val="single" w:color="000000" w:sz="4"/>
+              <w:bottom w:val="single" w:color="000000" w:sz="4"/>
+              <w:right w:val="single" w:color="000000" w:sz="4"/>
             </w:tcBorders>
             <w:shd w:fill="FFFFFF" w:val="clear"/>
             <w:tcMar>
@@ -938,7 +908,7 @@
           <w:p>
             <w:r>
               <w:rPr>
-                <w:rFonts w:ascii="Calibri" w:cs="Calibri" w:eastAsia="Calibri" w:hAnsi="Calibri"/>
+                <w:rFonts w:ascii="Arial" w:cs="Arial" w:eastAsia="Arial" w:hAnsi="Arial"/>
                 <w:b/>
                 <w:bCs/>
               </w:rPr>
@@ -950,10 +920,10 @@
           <w:tcPr>
             <w:tcW w:type="dxa" w:w="3200"/>
             <w:tcBorders>
-              <w:top w:val="single" w:color="BFBFBF" w:sz="4"/>
-              <w:left w:val="single" w:color="BFBFBF" w:sz="4"/>
-              <w:bottom w:val="single" w:color="BFBFBF" w:sz="4"/>
-              <w:right w:val="single" w:color="BFBFBF" w:sz="4"/>
+              <w:top w:val="single" w:color="000000" w:sz="4"/>
+              <w:left w:val="single" w:color="000000" w:sz="4"/>
+              <w:bottom w:val="single" w:color="000000" w:sz="4"/>
+              <w:right w:val="single" w:color="000000" w:sz="4"/>
             </w:tcBorders>
             <w:shd w:fill="FFFFFF" w:val="clear"/>
             <w:tcMar>
@@ -966,7 +936,7 @@
           <w:p>
             <w:r>
               <w:rPr>
-                <w:rFonts w:ascii="Calibri" w:cs="Calibri" w:eastAsia="Calibri" w:hAnsi="Calibri"/>
+                <w:rFonts w:ascii="Arial" w:cs="Arial" w:eastAsia="Arial" w:hAnsi="Arial"/>
               </w:rPr>
               <w:t xml:space="preserve">Manda un mensaje a cada puerto y ve si responde, para saber si está abierto</w:t>
             </w:r>
@@ -976,10 +946,10 @@
           <w:tcPr>
             <w:tcW w:type="dxa" w:w="4260"/>
             <w:tcBorders>
-              <w:top w:val="single" w:color="BFBFBF" w:sz="4"/>
-              <w:left w:val="single" w:color="BFBFBF" w:sz="4"/>
-              <w:bottom w:val="single" w:color="BFBFBF" w:sz="4"/>
-              <w:right w:val="single" w:color="BFBFBF" w:sz="4"/>
+              <w:top w:val="single" w:color="000000" w:sz="4"/>
+              <w:left w:val="single" w:color="000000" w:sz="4"/>
+              <w:bottom w:val="single" w:color="000000" w:sz="4"/>
+              <w:right w:val="single" w:color="000000" w:sz="4"/>
             </w:tcBorders>
             <w:shd w:fill="FFFFFF" w:val="clear"/>
             <w:tcMar>
@@ -992,7 +962,7 @@
           <w:p>
             <w:r>
               <w:rPr>
-                <w:rFonts w:ascii="Calibri" w:cs="Calibri" w:eastAsia="Calibri" w:hAnsi="Calibri"/>
+                <w:rFonts w:ascii="Arial" w:cs="Arial" w:eastAsia="Arial" w:hAnsi="Arial"/>
               </w:rPr>
               <w:t xml:space="preserve">Sirve para detectar puertos abiertos</w:t>
             </w:r>
@@ -1004,10 +974,10 @@
           <w:tcPr>
             <w:tcW w:type="dxa" w:w="1900"/>
             <w:tcBorders>
-              <w:top w:val="single" w:color="BFBFBF" w:sz="4"/>
-              <w:left w:val="single" w:color="BFBFBF" w:sz="4"/>
-              <w:bottom w:val="single" w:color="BFBFBF" w:sz="4"/>
-              <w:right w:val="single" w:color="BFBFBF" w:sz="4"/>
+              <w:top w:val="single" w:color="000000" w:sz="4"/>
+              <w:left w:val="single" w:color="000000" w:sz="4"/>
+              <w:bottom w:val="single" w:color="000000" w:sz="4"/>
+              <w:right w:val="single" w:color="000000" w:sz="4"/>
             </w:tcBorders>
             <w:shd w:fill="FFFFFF" w:val="clear"/>
             <w:tcMar>
@@ -1020,7 +990,7 @@
           <w:p>
             <w:r>
               <w:rPr>
-                <w:rFonts w:ascii="Calibri" w:cs="Calibri" w:eastAsia="Calibri" w:hAnsi="Calibri"/>
+                <w:rFonts w:ascii="Arial" w:cs="Arial" w:eastAsia="Arial" w:hAnsi="Arial"/>
                 <w:b/>
                 <w:bCs/>
               </w:rPr>
@@ -1032,10 +1002,10 @@
           <w:tcPr>
             <w:tcW w:type="dxa" w:w="3200"/>
             <w:tcBorders>
-              <w:top w:val="single" w:color="BFBFBF" w:sz="4"/>
-              <w:left w:val="single" w:color="BFBFBF" w:sz="4"/>
-              <w:bottom w:val="single" w:color="BFBFBF" w:sz="4"/>
-              <w:right w:val="single" w:color="BFBFBF" w:sz="4"/>
+              <w:top w:val="single" w:color="000000" w:sz="4"/>
+              <w:left w:val="single" w:color="000000" w:sz="4"/>
+              <w:bottom w:val="single" w:color="000000" w:sz="4"/>
+              <w:right w:val="single" w:color="000000" w:sz="4"/>
             </w:tcBorders>
             <w:shd w:fill="FFFFFF" w:val="clear"/>
             <w:tcMar>
@@ -1048,7 +1018,7 @@
           <w:p>
             <w:r>
               <w:rPr>
-                <w:rFonts w:ascii="Calibri" w:cs="Calibri" w:eastAsia="Calibri" w:hAnsi="Calibri"/>
+                <w:rFonts w:ascii="Arial" w:cs="Arial" w:eastAsia="Arial" w:hAnsi="Arial"/>
               </w:rPr>
               <w:t xml:space="preserve">Asigna IP y configuración a los dispositivos</w:t>
             </w:r>
@@ -1058,10 +1028,10 @@
           <w:tcPr>
             <w:tcW w:type="dxa" w:w="4260"/>
             <w:tcBorders>
-              <w:top w:val="single" w:color="BFBFBF" w:sz="4"/>
-              <w:left w:val="single" w:color="BFBFBF" w:sz="4"/>
-              <w:bottom w:val="single" w:color="BFBFBF" w:sz="4"/>
-              <w:right w:val="single" w:color="BFBFBF" w:sz="4"/>
+              <w:top w:val="single" w:color="000000" w:sz="4"/>
+              <w:left w:val="single" w:color="000000" w:sz="4"/>
+              <w:bottom w:val="single" w:color="000000" w:sz="4"/>
+              <w:right w:val="single" w:color="000000" w:sz="4"/>
             </w:tcBorders>
             <w:shd w:fill="FFFFFF" w:val="clear"/>
             <w:tcMar>
@@ -1074,7 +1044,7 @@
           <w:p>
             <w:r>
               <w:rPr>
-                <w:rFonts w:ascii="Calibri" w:cs="Calibri" w:eastAsia="Calibri" w:hAnsi="Calibri"/>
+                <w:rFonts w:ascii="Arial" w:cs="Arial" w:eastAsia="Arial" w:hAnsi="Arial"/>
                 <w:b/>
                 <w:bCs/>
               </w:rPr>
@@ -1082,7 +1052,7 @@
             </w:r>
             <w:r>
               <w:rPr>
-                <w:rFonts w:ascii="Calibri" w:cs="Calibri" w:eastAsia="Calibri" w:hAnsi="Calibri"/>
+                <w:rFonts w:ascii="Arial" w:cs="Arial" w:eastAsia="Arial" w:hAnsi="Arial"/>
               </w:rPr>
               <w:t xml:space="preserve">: evita servidores DHCP no autorizados validando mensajes de fuentes no confiables</w:t>
             </w:r>
@@ -1094,10 +1064,10 @@
           <w:tcPr>
             <w:tcW w:type="dxa" w:w="1900"/>
             <w:tcBorders>
-              <w:top w:val="single" w:color="BFBFBF" w:sz="4"/>
-              <w:left w:val="single" w:color="BFBFBF" w:sz="4"/>
-              <w:bottom w:val="single" w:color="BFBFBF" w:sz="4"/>
-              <w:right w:val="single" w:color="BFBFBF" w:sz="4"/>
+              <w:top w:val="single" w:color="000000" w:sz="4"/>
+              <w:left w:val="single" w:color="000000" w:sz="4"/>
+              <w:bottom w:val="single" w:color="000000" w:sz="4"/>
+              <w:right w:val="single" w:color="000000" w:sz="4"/>
             </w:tcBorders>
             <w:shd w:fill="FFFFFF" w:val="clear"/>
             <w:tcMar>
@@ -1110,7 +1080,7 @@
           <w:p>
             <w:r>
               <w:rPr>
-                <w:rFonts w:ascii="Calibri" w:cs="Calibri" w:eastAsia="Calibri" w:hAnsi="Calibri"/>
+                <w:rFonts w:ascii="Arial" w:cs="Arial" w:eastAsia="Arial" w:hAnsi="Arial"/>
                 <w:b/>
                 <w:bCs/>
               </w:rPr>
@@ -1122,10 +1092,10 @@
           <w:tcPr>
             <w:tcW w:type="dxa" w:w="3200"/>
             <w:tcBorders>
-              <w:top w:val="single" w:color="BFBFBF" w:sz="4"/>
-              <w:left w:val="single" w:color="BFBFBF" w:sz="4"/>
-              <w:bottom w:val="single" w:color="BFBFBF" w:sz="4"/>
-              <w:right w:val="single" w:color="BFBFBF" w:sz="4"/>
+              <w:top w:val="single" w:color="000000" w:sz="4"/>
+              <w:left w:val="single" w:color="000000" w:sz="4"/>
+              <w:bottom w:val="single" w:color="000000" w:sz="4"/>
+              <w:right w:val="single" w:color="000000" w:sz="4"/>
             </w:tcBorders>
             <w:shd w:fill="FFFFFF" w:val="clear"/>
             <w:tcMar>
@@ -1138,7 +1108,7 @@
           <w:p>
             <w:r>
               <w:rPr>
-                <w:rFonts w:ascii="Calibri" w:cs="Calibri" w:eastAsia="Calibri" w:hAnsi="Calibri"/>
+                <w:rFonts w:ascii="Arial" w:cs="Arial" w:eastAsia="Arial" w:hAnsi="Arial"/>
               </w:rPr>
               <w:t xml:space="preserve">Resuelve nombres</w:t>
             </w:r>
@@ -1148,10 +1118,10 @@
           <w:tcPr>
             <w:tcW w:type="dxa" w:w="4260"/>
             <w:tcBorders>
-              <w:top w:val="single" w:color="BFBFBF" w:sz="4"/>
-              <w:left w:val="single" w:color="BFBFBF" w:sz="4"/>
-              <w:bottom w:val="single" w:color="BFBFBF" w:sz="4"/>
-              <w:right w:val="single" w:color="BFBFBF" w:sz="4"/>
+              <w:top w:val="single" w:color="000000" w:sz="4"/>
+              <w:left w:val="single" w:color="000000" w:sz="4"/>
+              <w:bottom w:val="single" w:color="000000" w:sz="4"/>
+              <w:right w:val="single" w:color="000000" w:sz="4"/>
             </w:tcBorders>
             <w:shd w:fill="FFFFFF" w:val="clear"/>
             <w:tcMar>
@@ -1164,7 +1134,7 @@
           <w:p>
             <w:r>
               <w:rPr>
-                <w:rFonts w:ascii="Calibri" w:cs="Calibri" w:eastAsia="Calibri" w:hAnsi="Calibri"/>
+                <w:rFonts w:ascii="Arial" w:cs="Arial" w:eastAsia="Arial" w:hAnsi="Arial"/>
                 <w:b/>
                 <w:bCs/>
               </w:rPr>
@@ -1172,7 +1142,7 @@
             </w:r>
             <w:r>
               <w:rPr>
-                <w:rFonts w:ascii="Calibri" w:cs="Calibri" w:eastAsia="Calibri" w:hAnsi="Calibri"/>
+                <w:rFonts w:ascii="Arial" w:cs="Arial" w:eastAsia="Arial" w:hAnsi="Arial"/>
               </w:rPr>
               <w:t xml:space="preserve"> usa firmas digitales contra amenazas al DNS</w:t>
             </w:r>
@@ -1184,10 +1154,10 @@
           <w:tcPr>
             <w:tcW w:type="dxa" w:w="1900"/>
             <w:tcBorders>
-              <w:top w:val="single" w:color="BFBFBF" w:sz="4"/>
-              <w:left w:val="single" w:color="BFBFBF" w:sz="4"/>
-              <w:bottom w:val="single" w:color="BFBFBF" w:sz="4"/>
-              <w:right w:val="single" w:color="BFBFBF" w:sz="4"/>
+              <w:top w:val="single" w:color="000000" w:sz="4"/>
+              <w:left w:val="single" w:color="000000" w:sz="4"/>
+              <w:bottom w:val="single" w:color="000000" w:sz="4"/>
+              <w:right w:val="single" w:color="000000" w:sz="4"/>
             </w:tcBorders>
             <w:shd w:fill="FFFFFF" w:val="clear"/>
             <w:tcMar>
@@ -1200,7 +1170,7 @@
           <w:p>
             <w:r>
               <w:rPr>
-                <w:rFonts w:ascii="Calibri" w:cs="Calibri" w:eastAsia="Calibri" w:hAnsi="Calibri"/>
+                <w:rFonts w:ascii="Arial" w:cs="Arial" w:eastAsia="Arial" w:hAnsi="Arial"/>
                 <w:b/>
                 <w:bCs/>
               </w:rPr>
@@ -1212,10 +1182,10 @@
           <w:tcPr>
             <w:tcW w:type="dxa" w:w="3200"/>
             <w:tcBorders>
-              <w:top w:val="single" w:color="BFBFBF" w:sz="4"/>
-              <w:left w:val="single" w:color="BFBFBF" w:sz="4"/>
-              <w:bottom w:val="single" w:color="BFBFBF" w:sz="4"/>
-              <w:right w:val="single" w:color="BFBFBF" w:sz="4"/>
+              <w:top w:val="single" w:color="000000" w:sz="4"/>
+              <w:left w:val="single" w:color="000000" w:sz="4"/>
+              <w:bottom w:val="single" w:color="000000" w:sz="4"/>
+              <w:right w:val="single" w:color="000000" w:sz="4"/>
             </w:tcBorders>
             <w:shd w:fill="FFFFFF" w:val="clear"/>
             <w:tcMar>
@@ -1228,7 +1198,7 @@
           <w:p>
             <w:r>
               <w:rPr>
-                <w:rFonts w:ascii="Calibri" w:cs="Calibri" w:eastAsia="Calibri" w:hAnsi="Calibri"/>
+                <w:rFonts w:ascii="Arial" w:cs="Arial" w:eastAsia="Arial" w:hAnsi="Arial"/>
               </w:rPr>
               <w:t xml:space="preserve">Prueba la conexión con un host</w:t>
             </w:r>
@@ -1238,10 +1208,10 @@
           <w:tcPr>
             <w:tcW w:type="dxa" w:w="4260"/>
             <w:tcBorders>
-              <w:top w:val="single" w:color="BFBFBF" w:sz="4"/>
-              <w:left w:val="single" w:color="BFBFBF" w:sz="4"/>
-              <w:bottom w:val="single" w:color="BFBFBF" w:sz="4"/>
-              <w:right w:val="single" w:color="BFBFBF" w:sz="4"/>
+              <w:top w:val="single" w:color="000000" w:sz="4"/>
+              <w:left w:val="single" w:color="000000" w:sz="4"/>
+              <w:bottom w:val="single" w:color="000000" w:sz="4"/>
+              <w:right w:val="single" w:color="000000" w:sz="4"/>
             </w:tcBorders>
             <w:shd w:fill="FFFFFF" w:val="clear"/>
             <w:tcMar>
@@ -1254,13 +1224,13 @@
           <w:p>
             <w:r>
               <w:rPr>
-                <w:rFonts w:ascii="Calibri" w:cs="Calibri" w:eastAsia="Calibri" w:hAnsi="Calibri"/>
+                <w:rFonts w:ascii="Arial" w:cs="Arial" w:eastAsia="Arial" w:hAnsi="Arial"/>
               </w:rPr>
               <w:t xml:space="preserve">Lo usan para reconocimiento, DoS y canal encubierto. </w:t>
             </w:r>
             <w:r>
               <w:rPr>
-                <w:rFonts w:ascii="Calibri" w:cs="Calibri" w:eastAsia="Calibri" w:hAnsi="Calibri"/>
+                <w:rFonts w:ascii="Arial" w:cs="Arial" w:eastAsia="Arial" w:hAnsi="Arial"/>
                 <w:b/>
                 <w:bCs/>
               </w:rPr>
@@ -1268,7 +1238,7 @@
             </w:r>
             <w:r>
               <w:rPr>
-                <w:rFonts w:ascii="Calibri" w:cs="Calibri" w:eastAsia="Calibri" w:hAnsi="Calibri"/>
+                <w:rFonts w:ascii="Arial" w:cs="Arial" w:eastAsia="Arial" w:hAnsi="Arial"/>
               </w:rPr>
               <w:t xml:space="preserve"> las solicitudes ICMP</w:t>
             </w:r>
@@ -1280,10 +1250,10 @@
           <w:tcPr>
             <w:tcW w:type="dxa" w:w="1900"/>
             <w:tcBorders>
-              <w:top w:val="single" w:color="BFBFBF" w:sz="4"/>
-              <w:left w:val="single" w:color="BFBFBF" w:sz="4"/>
-              <w:bottom w:val="single" w:color="BFBFBF" w:sz="4"/>
-              <w:right w:val="single" w:color="BFBFBF" w:sz="4"/>
+              <w:top w:val="single" w:color="000000" w:sz="4"/>
+              <w:left w:val="single" w:color="000000" w:sz="4"/>
+              <w:bottom w:val="single" w:color="000000" w:sz="4"/>
+              <w:right w:val="single" w:color="000000" w:sz="4"/>
             </w:tcBorders>
             <w:shd w:fill="FFFFFF" w:val="clear"/>
             <w:tcMar>
@@ -1296,7 +1266,7 @@
           <w:p>
             <w:r>
               <w:rPr>
-                <w:rFonts w:ascii="Calibri" w:cs="Calibri" w:eastAsia="Calibri" w:hAnsi="Calibri"/>
+                <w:rFonts w:ascii="Arial" w:cs="Arial" w:eastAsia="Arial" w:hAnsi="Arial"/>
                 <w:b/>
                 <w:bCs/>
               </w:rPr>
@@ -1308,10 +1278,10 @@
           <w:tcPr>
             <w:tcW w:type="dxa" w:w="3200"/>
             <w:tcBorders>
-              <w:top w:val="single" w:color="BFBFBF" w:sz="4"/>
-              <w:left w:val="single" w:color="BFBFBF" w:sz="4"/>
-              <w:bottom w:val="single" w:color="BFBFBF" w:sz="4"/>
-              <w:right w:val="single" w:color="BFBFBF" w:sz="4"/>
+              <w:top w:val="single" w:color="000000" w:sz="4"/>
+              <w:left w:val="single" w:color="000000" w:sz="4"/>
+              <w:bottom w:val="single" w:color="000000" w:sz="4"/>
+              <w:right w:val="single" w:color="000000" w:sz="4"/>
             </w:tcBorders>
             <w:shd w:fill="FFFFFF" w:val="clear"/>
             <w:tcMar>
@@ -1324,7 +1294,7 @@
           <w:p>
             <w:r>
               <w:rPr>
-                <w:rFonts w:ascii="Calibri" w:cs="Calibri" w:eastAsia="Calibri" w:hAnsi="Calibri"/>
+                <w:rFonts w:ascii="Arial" w:cs="Arial" w:eastAsia="Arial" w:hAnsi="Arial"/>
               </w:rPr>
               <w:t xml:space="preserve">Calcula la mejor ruta por conteo de saltos</w:t>
             </w:r>
@@ -1334,10 +1304,10 @@
           <w:tcPr>
             <w:tcW w:type="dxa" w:w="4260"/>
             <w:tcBorders>
-              <w:top w:val="single" w:color="BFBFBF" w:sz="4"/>
-              <w:left w:val="single" w:color="BFBFBF" w:sz="4"/>
-              <w:bottom w:val="single" w:color="BFBFBF" w:sz="4"/>
-              <w:right w:val="single" w:color="BFBFBF" w:sz="4"/>
+              <w:top w:val="single" w:color="000000" w:sz="4"/>
+              <w:left w:val="single" w:color="000000" w:sz="4"/>
+              <w:bottom w:val="single" w:color="000000" w:sz="4"/>
+              <w:right w:val="single" w:color="000000" w:sz="4"/>
             </w:tcBorders>
             <w:shd w:fill="FFFFFF" w:val="clear"/>
             <w:tcMar>
@@ -1350,7 +1320,7 @@
           <w:p>
             <w:r>
               <w:rPr>
-                <w:rFonts w:ascii="Calibri" w:cs="Calibri" w:eastAsia="Calibri" w:hAnsi="Calibri"/>
+                <w:rFonts w:ascii="Arial" w:cs="Arial" w:eastAsia="Arial" w:hAnsi="Arial"/>
               </w:rPr>
               <w:t xml:space="preserve">Los atacantes apuntan a routers y a RIP. Usar servicios seguros con autenticación y parches</w:t>
             </w:r>
@@ -1362,10 +1332,10 @@
           <w:tcPr>
             <w:tcW w:type="dxa" w:w="1900"/>
             <w:tcBorders>
-              <w:top w:val="single" w:color="BFBFBF" w:sz="4"/>
-              <w:left w:val="single" w:color="BFBFBF" w:sz="4"/>
-              <w:bottom w:val="single" w:color="BFBFBF" w:sz="4"/>
-              <w:right w:val="single" w:color="BFBFBF" w:sz="4"/>
+              <w:top w:val="single" w:color="000000" w:sz="4"/>
+              <w:left w:val="single" w:color="000000" w:sz="4"/>
+              <w:bottom w:val="single" w:color="000000" w:sz="4"/>
+              <w:right w:val="single" w:color="000000" w:sz="4"/>
             </w:tcBorders>
             <w:shd w:fill="FFFFFF" w:val="clear"/>
             <w:tcMar>
@@ -1378,7 +1348,7 @@
           <w:p>
             <w:r>
               <w:rPr>
-                <w:rFonts w:ascii="Calibri" w:cs="Calibri" w:eastAsia="Calibri" w:hAnsi="Calibri"/>
+                <w:rFonts w:ascii="Arial" w:cs="Arial" w:eastAsia="Arial" w:hAnsi="Arial"/>
                 <w:b/>
                 <w:bCs/>
               </w:rPr>
@@ -1390,10 +1360,10 @@
           <w:tcPr>
             <w:tcW w:type="dxa" w:w="3200"/>
             <w:tcBorders>
-              <w:top w:val="single" w:color="BFBFBF" w:sz="4"/>
-              <w:left w:val="single" w:color="BFBFBF" w:sz="4"/>
-              <w:bottom w:val="single" w:color="BFBFBF" w:sz="4"/>
-              <w:right w:val="single" w:color="BFBFBF" w:sz="4"/>
+              <w:top w:val="single" w:color="000000" w:sz="4"/>
+              <w:left w:val="single" w:color="000000" w:sz="4"/>
+              <w:bottom w:val="single" w:color="000000" w:sz="4"/>
+              <w:right w:val="single" w:color="000000" w:sz="4"/>
             </w:tcBorders>
             <w:shd w:fill="FFFFFF" w:val="clear"/>
             <w:tcMar>
@@ -1406,7 +1376,7 @@
           <w:p>
             <w:r>
               <w:rPr>
-                <w:rFonts w:ascii="Calibri" w:cs="Calibri" w:eastAsia="Calibri" w:hAnsi="Calibri"/>
+                <w:rFonts w:ascii="Arial" w:cs="Arial" w:eastAsia="Arial" w:hAnsi="Arial"/>
               </w:rPr>
               <w:t xml:space="preserve">Sincroniza la hora con un servidor</w:t>
             </w:r>
@@ -1416,10 +1386,10 @@
           <w:tcPr>
             <w:tcW w:type="dxa" w:w="4260"/>
             <w:tcBorders>
-              <w:top w:val="single" w:color="BFBFBF" w:sz="4"/>
-              <w:left w:val="single" w:color="BFBFBF" w:sz="4"/>
-              <w:bottom w:val="single" w:color="BFBFBF" w:sz="4"/>
-              <w:right w:val="single" w:color="BFBFBF" w:sz="4"/>
+              <w:top w:val="single" w:color="000000" w:sz="4"/>
+              <w:left w:val="single" w:color="000000" w:sz="4"/>
+              <w:bottom w:val="single" w:color="000000" w:sz="4"/>
+              <w:right w:val="single" w:color="000000" w:sz="4"/>
             </w:tcBorders>
             <w:shd w:fill="FFFFFF" w:val="clear"/>
             <w:tcMar>
@@ -1432,13 +1402,13 @@
           <w:p>
             <w:r>
               <w:rPr>
-                <w:rFonts w:ascii="Calibri" w:cs="Calibri" w:eastAsia="Calibri" w:hAnsi="Calibri"/>
+                <w:rFonts w:ascii="Arial" w:cs="Arial" w:eastAsia="Arial" w:hAnsi="Arial"/>
               </w:rPr>
               <w:t xml:space="preserve">Usar </w:t>
             </w:r>
             <w:r>
               <w:rPr>
-                <w:rFonts w:ascii="Calibri" w:cs="Calibri" w:eastAsia="Calibri" w:hAnsi="Calibri"/>
+                <w:rFonts w:ascii="Arial" w:cs="Arial" w:eastAsia="Arial" w:hAnsi="Arial"/>
                 <w:b/>
                 <w:bCs/>
               </w:rPr>
@@ -1446,7 +1416,7 @@
             </w:r>
             <w:r>
               <w:rPr>
-                <w:rFonts w:ascii="Calibri" w:cs="Calibri" w:eastAsia="Calibri" w:hAnsi="Calibri"/>
+                <w:rFonts w:ascii="Arial" w:cs="Arial" w:eastAsia="Arial" w:hAnsi="Arial"/>
               </w:rPr>
               <w:t xml:space="preserve"> para verificar que el servidor sea confiable</w:t>
             </w:r>
@@ -1458,10 +1428,10 @@
           <w:tcPr>
             <w:tcW w:type="dxa" w:w="1900"/>
             <w:tcBorders>
-              <w:top w:val="single" w:color="BFBFBF" w:sz="4"/>
-              <w:left w:val="single" w:color="BFBFBF" w:sz="4"/>
-              <w:bottom w:val="single" w:color="BFBFBF" w:sz="4"/>
-              <w:right w:val="single" w:color="BFBFBF" w:sz="4"/>
+              <w:top w:val="single" w:color="000000" w:sz="4"/>
+              <w:left w:val="single" w:color="000000" w:sz="4"/>
+              <w:bottom w:val="single" w:color="000000" w:sz="4"/>
+              <w:right w:val="single" w:color="000000" w:sz="4"/>
             </w:tcBorders>
             <w:shd w:fill="FFFFFF" w:val="clear"/>
             <w:tcMar>
@@ -1474,7 +1444,7 @@
           <w:p>
             <w:r>
               <w:rPr>
-                <w:rFonts w:ascii="Calibri" w:cs="Calibri" w:eastAsia="Calibri" w:hAnsi="Calibri"/>
+                <w:rFonts w:ascii="Arial" w:cs="Arial" w:eastAsia="Arial" w:hAnsi="Arial"/>
                 <w:b/>
                 <w:bCs/>
               </w:rPr>
@@ -1486,10 +1456,10 @@
           <w:tcPr>
             <w:tcW w:type="dxa" w:w="3200"/>
             <w:tcBorders>
-              <w:top w:val="single" w:color="BFBFBF" w:sz="4"/>
-              <w:left w:val="single" w:color="BFBFBF" w:sz="4"/>
-              <w:bottom w:val="single" w:color="BFBFBF" w:sz="4"/>
-              <w:right w:val="single" w:color="BFBFBF" w:sz="4"/>
+              <w:top w:val="single" w:color="000000" w:sz="4"/>
+              <w:left w:val="single" w:color="000000" w:sz="4"/>
+              <w:bottom w:val="single" w:color="000000" w:sz="4"/>
+              <w:right w:val="single" w:color="000000" w:sz="4"/>
             </w:tcBorders>
             <w:shd w:fill="FFFFFF" w:val="clear"/>
             <w:tcMar>
@@ -1502,13 +1472,13 @@
           <w:p>
             <w:r>
               <w:rPr>
-                <w:rFonts w:ascii="Calibri" w:cs="Calibri" w:eastAsia="Calibri" w:hAnsi="Calibri"/>
+                <w:rFonts w:ascii="Arial" w:cs="Arial" w:eastAsia="Arial" w:hAnsi="Arial"/>
               </w:rPr>
               <w:t xml:space="preserve">Conexión remota </w:t>
             </w:r>
             <w:r>
               <w:rPr>
-                <w:rFonts w:ascii="Calibri" w:cs="Calibri" w:eastAsia="Calibri" w:hAnsi="Calibri"/>
+                <w:rFonts w:ascii="Arial" w:cs="Arial" w:eastAsia="Arial" w:hAnsi="Arial"/>
                 <w:b/>
                 <w:bCs/>
               </w:rPr>
@@ -1516,13 +1486,13 @@
             </w:r>
             <w:r>
               <w:rPr>
-                <w:rFonts w:ascii="Calibri" w:cs="Calibri" w:eastAsia="Calibri" w:hAnsi="Calibri"/>
+                <w:rFonts w:ascii="Arial" w:cs="Arial" w:eastAsia="Arial" w:hAnsi="Arial"/>
               </w:rPr>
               <w:t xml:space="preserve">, puerto </w:t>
             </w:r>
             <w:r>
               <w:rPr>
-                <w:rFonts w:ascii="Calibri" w:cs="Calibri" w:eastAsia="Calibri" w:hAnsi="Calibri"/>
+                <w:rFonts w:ascii="Arial" w:cs="Arial" w:eastAsia="Arial" w:hAnsi="Arial"/>
                 <w:b/>
                 <w:bCs/>
               </w:rPr>
@@ -1534,10 +1504,10 @@
           <w:tcPr>
             <w:tcW w:type="dxa" w:w="4260"/>
             <w:tcBorders>
-              <w:top w:val="single" w:color="BFBFBF" w:sz="4"/>
-              <w:left w:val="single" w:color="BFBFBF" w:sz="4"/>
-              <w:bottom w:val="single" w:color="BFBFBF" w:sz="4"/>
-              <w:right w:val="single" w:color="BFBFBF" w:sz="4"/>
+              <w:top w:val="single" w:color="000000" w:sz="4"/>
+              <w:left w:val="single" w:color="000000" w:sz="4"/>
+              <w:bottom w:val="single" w:color="000000" w:sz="4"/>
+              <w:right w:val="single" w:color="000000" w:sz="4"/>
             </w:tcBorders>
             <w:shd w:fill="FFFFFF" w:val="clear"/>
             <w:tcMar>
@@ -1550,13 +1520,13 @@
           <w:p>
             <w:r>
               <w:rPr>
-                <w:rFonts w:ascii="Calibri" w:cs="Calibri" w:eastAsia="Calibri" w:hAnsi="Calibri"/>
+                <w:rFonts w:ascii="Arial" w:cs="Arial" w:eastAsia="Arial" w:hAnsi="Arial"/>
               </w:rPr>
               <w:t xml:space="preserve">Usarlo </w:t>
             </w:r>
             <w:r>
               <w:rPr>
-                <w:rFonts w:ascii="Calibri" w:cs="Calibri" w:eastAsia="Calibri" w:hAnsi="Calibri"/>
+                <w:rFonts w:ascii="Arial" w:cs="Arial" w:eastAsia="Arial" w:hAnsi="Arial"/>
                 <w:b/>
                 <w:bCs/>
               </w:rPr>
@@ -1570,10 +1540,10 @@
           <w:tcPr>
             <w:tcW w:type="dxa" w:w="1900"/>
             <w:tcBorders>
-              <w:top w:val="single" w:color="BFBFBF" w:sz="4"/>
-              <w:left w:val="single" w:color="BFBFBF" w:sz="4"/>
-              <w:bottom w:val="single" w:color="BFBFBF" w:sz="4"/>
-              <w:right w:val="single" w:color="BFBFBF" w:sz="4"/>
+              <w:top w:val="single" w:color="000000" w:sz="4"/>
+              <w:left w:val="single" w:color="000000" w:sz="4"/>
+              <w:bottom w:val="single" w:color="000000" w:sz="4"/>
+              <w:right w:val="single" w:color="000000" w:sz="4"/>
             </w:tcBorders>
             <w:shd w:fill="FFFFFF" w:val="clear"/>
             <w:tcMar>
@@ -1586,7 +1556,7 @@
           <w:p>
             <w:r>
               <w:rPr>
-                <w:rFonts w:ascii="Calibri" w:cs="Calibri" w:eastAsia="Calibri" w:hAnsi="Calibri"/>
+                <w:rFonts w:ascii="Arial" w:cs="Arial" w:eastAsia="Arial" w:hAnsi="Arial"/>
                 <w:b/>
                 <w:bCs/>
               </w:rPr>
@@ -1598,10 +1568,10 @@
           <w:tcPr>
             <w:tcW w:type="dxa" w:w="3200"/>
             <w:tcBorders>
-              <w:top w:val="single" w:color="BFBFBF" w:sz="4"/>
-              <w:left w:val="single" w:color="BFBFBF" w:sz="4"/>
-              <w:bottom w:val="single" w:color="BFBFBF" w:sz="4"/>
-              <w:right w:val="single" w:color="BFBFBF" w:sz="4"/>
+              <w:top w:val="single" w:color="000000" w:sz="4"/>
+              <w:left w:val="single" w:color="000000" w:sz="4"/>
+              <w:bottom w:val="single" w:color="000000" w:sz="4"/>
+              <w:right w:val="single" w:color="000000" w:sz="4"/>
             </w:tcBorders>
             <w:shd w:fill="FFFFFF" w:val="clear"/>
             <w:tcMar>
@@ -1614,13 +1584,13 @@
           <w:p>
             <w:r>
               <w:rPr>
-                <w:rFonts w:ascii="Calibri" w:cs="Calibri" w:eastAsia="Calibri" w:hAnsi="Calibri"/>
+                <w:rFonts w:ascii="Arial" w:cs="Arial" w:eastAsia="Arial" w:hAnsi="Arial"/>
               </w:rPr>
               <w:t xml:space="preserve">Protocolo viejo en </w:t>
             </w:r>
             <w:r>
               <w:rPr>
-                <w:rFonts w:ascii="Calibri" w:cs="Calibri" w:eastAsia="Calibri" w:hAnsi="Calibri"/>
+                <w:rFonts w:ascii="Arial" w:cs="Arial" w:eastAsia="Arial" w:hAnsi="Arial"/>
                 <w:b/>
                 <w:bCs/>
               </w:rPr>
@@ -1628,13 +1598,13 @@
             </w:r>
             <w:r>
               <w:rPr>
-                <w:rFonts w:ascii="Calibri" w:cs="Calibri" w:eastAsia="Calibri" w:hAnsi="Calibri"/>
+                <w:rFonts w:ascii="Arial" w:cs="Arial" w:eastAsia="Arial" w:hAnsi="Arial"/>
               </w:rPr>
               <w:t xml:space="preserve">, puerto </w:t>
             </w:r>
             <w:r>
               <w:rPr>
-                <w:rFonts w:ascii="Calibri" w:cs="Calibri" w:eastAsia="Calibri" w:hAnsi="Calibri"/>
+                <w:rFonts w:ascii="Arial" w:cs="Arial" w:eastAsia="Arial" w:hAnsi="Arial"/>
                 <w:b/>
                 <w:bCs/>
               </w:rPr>
@@ -1646,10 +1616,10 @@
           <w:tcPr>
             <w:tcW w:type="dxa" w:w="4260"/>
             <w:tcBorders>
-              <w:top w:val="single" w:color="BFBFBF" w:sz="4"/>
-              <w:left w:val="single" w:color="BFBFBF" w:sz="4"/>
-              <w:bottom w:val="single" w:color="BFBFBF" w:sz="4"/>
-              <w:right w:val="single" w:color="BFBFBF" w:sz="4"/>
+              <w:top w:val="single" w:color="000000" w:sz="4"/>
+              <w:left w:val="single" w:color="000000" w:sz="4"/>
+              <w:bottom w:val="single" w:color="000000" w:sz="4"/>
+              <w:right w:val="single" w:color="000000" w:sz="4"/>
             </w:tcBorders>
             <w:shd w:fill="FFFFFF" w:val="clear"/>
             <w:tcMar>
@@ -1662,7 +1632,7 @@
           <w:p>
             <w:r>
               <w:rPr>
-                <w:rFonts w:ascii="Calibri" w:cs="Calibri" w:eastAsia="Calibri" w:hAnsi="Calibri"/>
+                <w:rFonts w:ascii="Arial" w:cs="Arial" w:eastAsia="Arial" w:hAnsi="Arial"/>
               </w:rPr>
               <w:t xml:space="preserve">Inseguro</w:t>
             </w:r>
@@ -1674,10 +1644,10 @@
           <w:tcPr>
             <w:tcW w:type="dxa" w:w="1900"/>
             <w:tcBorders>
-              <w:top w:val="single" w:color="BFBFBF" w:sz="4"/>
-              <w:left w:val="single" w:color="BFBFBF" w:sz="4"/>
-              <w:bottom w:val="single" w:color="BFBFBF" w:sz="4"/>
-              <w:right w:val="single" w:color="BFBFBF" w:sz="4"/>
+              <w:top w:val="single" w:color="000000" w:sz="4"/>
+              <w:left w:val="single" w:color="000000" w:sz="4"/>
+              <w:bottom w:val="single" w:color="000000" w:sz="4"/>
+              <w:right w:val="single" w:color="000000" w:sz="4"/>
             </w:tcBorders>
             <w:shd w:fill="FFFFFF" w:val="clear"/>
             <w:tcMar>
@@ -1690,7 +1660,7 @@
           <w:p>
             <w:r>
               <w:rPr>
-                <w:rFonts w:ascii="Calibri" w:cs="Calibri" w:eastAsia="Calibri" w:hAnsi="Calibri"/>
+                <w:rFonts w:ascii="Arial" w:cs="Arial" w:eastAsia="Arial" w:hAnsi="Arial"/>
                 <w:b/>
                 <w:bCs/>
               </w:rPr>
@@ -1702,10 +1672,10 @@
           <w:tcPr>
             <w:tcW w:type="dxa" w:w="3200"/>
             <w:tcBorders>
-              <w:top w:val="single" w:color="BFBFBF" w:sz="4"/>
-              <w:left w:val="single" w:color="BFBFBF" w:sz="4"/>
-              <w:bottom w:val="single" w:color="BFBFBF" w:sz="4"/>
-              <w:right w:val="single" w:color="BFBFBF" w:sz="4"/>
+              <w:top w:val="single" w:color="000000" w:sz="4"/>
+              <w:left w:val="single" w:color="000000" w:sz="4"/>
+              <w:bottom w:val="single" w:color="000000" w:sz="4"/>
+              <w:right w:val="single" w:color="000000" w:sz="4"/>
             </w:tcBorders>
             <w:shd w:fill="FFFFFF" w:val="clear"/>
             <w:tcMar>
@@ -1718,7 +1688,7 @@
           <w:p>
             <w:r>
               <w:rPr>
-                <w:rFonts w:ascii="Calibri" w:cs="Calibri" w:eastAsia="Calibri" w:hAnsi="Calibri"/>
+                <w:rFonts w:ascii="Arial" w:cs="Arial" w:eastAsia="Arial" w:hAnsi="Arial"/>
               </w:rPr>
               <w:t xml:space="preserve">Transfiere datos usando SSH</w:t>
             </w:r>
@@ -1728,10 +1698,10 @@
           <w:tcPr>
             <w:tcW w:type="dxa" w:w="4260"/>
             <w:tcBorders>
-              <w:top w:val="single" w:color="BFBFBF" w:sz="4"/>
-              <w:left w:val="single" w:color="BFBFBF" w:sz="4"/>
-              <w:bottom w:val="single" w:color="BFBFBF" w:sz="4"/>
-              <w:right w:val="single" w:color="BFBFBF" w:sz="4"/>
+              <w:top w:val="single" w:color="000000" w:sz="4"/>
+              <w:left w:val="single" w:color="000000" w:sz="4"/>
+              <w:bottom w:val="single" w:color="000000" w:sz="4"/>
+              <w:right w:val="single" w:color="000000" w:sz="4"/>
             </w:tcBorders>
             <w:shd w:fill="FFFFFF" w:val="clear"/>
             <w:tcMar>
@@ -1744,7 +1714,7 @@
           <w:p>
             <w:r>
               <w:rPr>
-                <w:rFonts w:ascii="Calibri" w:cs="Calibri" w:eastAsia="Calibri" w:hAnsi="Calibri"/>
+                <w:rFonts w:ascii="Arial" w:cs="Arial" w:eastAsia="Arial" w:hAnsi="Arial"/>
               </w:rPr>
               <w:t xml:space="preserve">Da autenticidad y confidencialidad en tránsito</w:t>
             </w:r>
@@ -1756,10 +1726,10 @@
           <w:tcPr>
             <w:tcW w:type="dxa" w:w="1900"/>
             <w:tcBorders>
-              <w:top w:val="single" w:color="BFBFBF" w:sz="4"/>
-              <w:left w:val="single" w:color="BFBFBF" w:sz="4"/>
-              <w:bottom w:val="single" w:color="BFBFBF" w:sz="4"/>
-              <w:right w:val="single" w:color="BFBFBF" w:sz="4"/>
+              <w:top w:val="single" w:color="000000" w:sz="4"/>
+              <w:left w:val="single" w:color="000000" w:sz="4"/>
+              <w:bottom w:val="single" w:color="000000" w:sz="4"/>
+              <w:right w:val="single" w:color="000000" w:sz="4"/>
             </w:tcBorders>
             <w:shd w:fill="FFFFFF" w:val="clear"/>
             <w:tcMar>
@@ -1772,7 +1742,7 @@
           <w:p>
             <w:r>
               <w:rPr>
-                <w:rFonts w:ascii="Calibri" w:cs="Calibri" w:eastAsia="Calibri" w:hAnsi="Calibri"/>
+                <w:rFonts w:ascii="Arial" w:cs="Arial" w:eastAsia="Arial" w:hAnsi="Arial"/>
                 <w:b/>
                 <w:bCs/>
               </w:rPr>
@@ -1784,10 +1754,10 @@
           <w:tcPr>
             <w:tcW w:type="dxa" w:w="3200"/>
             <w:tcBorders>
-              <w:top w:val="single" w:color="BFBFBF" w:sz="4"/>
-              <w:left w:val="single" w:color="BFBFBF" w:sz="4"/>
-              <w:bottom w:val="single" w:color="BFBFBF" w:sz="4"/>
-              <w:right w:val="single" w:color="BFBFBF" w:sz="4"/>
+              <w:top w:val="single" w:color="000000" w:sz="4"/>
+              <w:left w:val="single" w:color="000000" w:sz="4"/>
+              <w:bottom w:val="single" w:color="000000" w:sz="4"/>
+              <w:right w:val="single" w:color="000000" w:sz="4"/>
             </w:tcBorders>
             <w:shd w:fill="FFFFFF" w:val="clear"/>
             <w:tcMar>
@@ -1800,7 +1770,7 @@
           <w:p>
             <w:r>
               <w:rPr>
-                <w:rFonts w:ascii="Calibri" w:cs="Calibri" w:eastAsia="Calibri" w:hAnsi="Calibri"/>
+                <w:rFonts w:ascii="Arial" w:cs="Arial" w:eastAsia="Arial" w:hAnsi="Arial"/>
               </w:rPr>
               <w:t xml:space="preserve">Recopila estadísticas de dispositivos TCP/IP para monitorear la red</w:t>
             </w:r>
@@ -1810,10 +1780,10 @@
           <w:tcPr>
             <w:tcW w:type="dxa" w:w="4260"/>
             <w:tcBorders>
-              <w:top w:val="single" w:color="BFBFBF" w:sz="4"/>
-              <w:left w:val="single" w:color="BFBFBF" w:sz="4"/>
-              <w:bottom w:val="single" w:color="BFBFBF" w:sz="4"/>
-              <w:right w:val="single" w:color="BFBFBF" w:sz="4"/>
+              <w:top w:val="single" w:color="000000" w:sz="4"/>
+              <w:left w:val="single" w:color="000000" w:sz="4"/>
+              <w:bottom w:val="single" w:color="000000" w:sz="4"/>
+              <w:right w:val="single" w:color="000000" w:sz="4"/>
             </w:tcBorders>
             <w:shd w:fill="FFFFFF" w:val="clear"/>
             <w:tcMar>
@@ -1826,7 +1796,7 @@
           <w:p>
             <w:r>
               <w:rPr>
-                <w:rFonts w:ascii="Calibri" w:cs="Calibri" w:eastAsia="Calibri" w:hAnsi="Calibri"/>
+                <w:rFonts w:ascii="Arial" w:cs="Arial" w:eastAsia="Arial" w:hAnsi="Arial"/>
                 <w:b/>
                 <w:bCs/>
               </w:rPr>
@@ -1834,7 +1804,7 @@
             </w:r>
             <w:r>
               <w:rPr>
-                <w:rFonts w:ascii="Calibri" w:cs="Calibri" w:eastAsia="Calibri" w:hAnsi="Calibri"/>
+                <w:rFonts w:ascii="Arial" w:cs="Arial" w:eastAsia="Arial" w:hAnsi="Arial"/>
               </w:rPr>
               <w:t xml:space="preserve"> es el estándar actual: cifra contra espionaje y manipulación</w:t>
             </w:r>
@@ -1846,10 +1816,10 @@
           <w:tcPr>
             <w:tcW w:type="dxa" w:w="1900"/>
             <w:tcBorders>
-              <w:top w:val="single" w:color="BFBFBF" w:sz="4"/>
-              <w:left w:val="single" w:color="BFBFBF" w:sz="4"/>
-              <w:bottom w:val="single" w:color="BFBFBF" w:sz="4"/>
-              <w:right w:val="single" w:color="BFBFBF" w:sz="4"/>
+              <w:top w:val="single" w:color="000000" w:sz="4"/>
+              <w:left w:val="single" w:color="000000" w:sz="4"/>
+              <w:bottom w:val="single" w:color="000000" w:sz="4"/>
+              <w:right w:val="single" w:color="000000" w:sz="4"/>
             </w:tcBorders>
             <w:shd w:fill="FFFFFF" w:val="clear"/>
             <w:tcMar>
@@ -1862,7 +1832,7 @@
           <w:p>
             <w:r>
               <w:rPr>
-                <w:rFonts w:ascii="Calibri" w:cs="Calibri" w:eastAsia="Calibri" w:hAnsi="Calibri"/>
+                <w:rFonts w:ascii="Arial" w:cs="Arial" w:eastAsia="Arial" w:hAnsi="Arial"/>
                 <w:b/>
                 <w:bCs/>
               </w:rPr>
@@ -1874,10 +1844,10 @@
           <w:tcPr>
             <w:tcW w:type="dxa" w:w="3200"/>
             <w:tcBorders>
-              <w:top w:val="single" w:color="BFBFBF" w:sz="4"/>
-              <w:left w:val="single" w:color="BFBFBF" w:sz="4"/>
-              <w:bottom w:val="single" w:color="BFBFBF" w:sz="4"/>
-              <w:right w:val="single" w:color="BFBFBF" w:sz="4"/>
+              <w:top w:val="single" w:color="000000" w:sz="4"/>
+              <w:left w:val="single" w:color="000000" w:sz="4"/>
+              <w:bottom w:val="single" w:color="000000" w:sz="4"/>
+              <w:right w:val="single" w:color="000000" w:sz="4"/>
             </w:tcBorders>
             <w:shd w:fill="FFFFFF" w:val="clear"/>
             <w:tcMar>
@@ -1890,13 +1860,13 @@
           <w:p>
             <w:r>
               <w:rPr>
-                <w:rFonts w:ascii="Calibri" w:cs="Calibri" w:eastAsia="Calibri" w:hAnsi="Calibri"/>
+                <w:rFonts w:ascii="Arial" w:cs="Arial" w:eastAsia="Arial" w:hAnsi="Arial"/>
               </w:rPr>
               <w:t xml:space="preserve">Conectividad web básica, puerto </w:t>
             </w:r>
             <w:r>
               <w:rPr>
-                <w:rFonts w:ascii="Calibri" w:cs="Calibri" w:eastAsia="Calibri" w:hAnsi="Calibri"/>
+                <w:rFonts w:ascii="Arial" w:cs="Arial" w:eastAsia="Arial" w:hAnsi="Arial"/>
                 <w:b/>
                 <w:bCs/>
               </w:rPr>
@@ -1908,10 +1878,10 @@
           <w:tcPr>
             <w:tcW w:type="dxa" w:w="4260"/>
             <w:tcBorders>
-              <w:top w:val="single" w:color="BFBFBF" w:sz="4"/>
-              <w:left w:val="single" w:color="BFBFBF" w:sz="4"/>
-              <w:bottom w:val="single" w:color="BFBFBF" w:sz="4"/>
-              <w:right w:val="single" w:color="BFBFBF" w:sz="4"/>
+              <w:top w:val="single" w:color="000000" w:sz="4"/>
+              <w:left w:val="single" w:color="000000" w:sz="4"/>
+              <w:bottom w:val="single" w:color="000000" w:sz="4"/>
+              <w:right w:val="single" w:color="000000" w:sz="4"/>
             </w:tcBorders>
             <w:shd w:fill="FFFFFF" w:val="clear"/>
             <w:tcMar>
@@ -1924,13 +1894,13 @@
           <w:p>
             <w:r>
               <w:rPr>
-                <w:rFonts w:ascii="Calibri" w:cs="Calibri" w:eastAsia="Calibri" w:hAnsi="Calibri"/>
+                <w:rFonts w:ascii="Arial" w:cs="Arial" w:eastAsia="Arial" w:hAnsi="Arial"/>
               </w:rPr>
               <w:t xml:space="preserve">Usar </w:t>
             </w:r>
             <w:r>
               <w:rPr>
-                <w:rFonts w:ascii="Calibri" w:cs="Calibri" w:eastAsia="Calibri" w:hAnsi="Calibri"/>
+                <w:rFonts w:ascii="Arial" w:cs="Arial" w:eastAsia="Arial" w:hAnsi="Arial"/>
                 <w:b/>
                 <w:bCs/>
               </w:rPr>
@@ -1938,7 +1908,7 @@
             </w:r>
             <w:r>
               <w:rPr>
-                <w:rFonts w:ascii="Calibri" w:cs="Calibri" w:eastAsia="Calibri" w:hAnsi="Calibri"/>
+                <w:rFonts w:ascii="Arial" w:cs="Arial" w:eastAsia="Arial" w:hAnsi="Arial"/>
               </w:rPr>
               <w:t xml:space="preserve"> para más seguridad</w:t>
             </w:r>
@@ -1953,27 +1923,29 @@
     </w:p>
     <w:p>
       <w:pPr>
-        <w:pStyle w:val="Heading1"/>
         <w:pBdr>
-          <w:bottom w:val="single" w:color="1F4E79" w:sz="8" w:space="2"/>
+          <w:bottom w:val="single" w:color="000000" w:sz="8" w:space="2"/>
         </w:pBdr>
         <w:spacing w:after="120" w:before="280"/>
       </w:pPr>
       <w:r>
         <w:rPr>
-          <w:rFonts w:ascii="Calibri" w:cs="Calibri" w:eastAsia="Calibri" w:hAnsi="Calibri"/>
+          <w:rFonts w:ascii="Arial" w:cs="Arial" w:eastAsia="Arial" w:hAnsi="Arial"/>
+          <w:b/>
+          <w:bCs/>
         </w:rPr>
         <w:t xml:space="preserve">4. Fortalecimiento de la red: segmentación</w:t>
       </w:r>
     </w:p>
     <w:p>
       <w:pPr>
-        <w:pStyle w:val="Heading3"/>
         <w:spacing w:after="80" w:before="160"/>
       </w:pPr>
       <w:r>
         <w:rPr>
-          <w:rFonts w:ascii="Calibri" w:cs="Calibri" w:eastAsia="Calibri" w:hAnsi="Calibri"/>
+          <w:rFonts w:ascii="Arial" w:cs="Arial" w:eastAsia="Arial" w:hAnsi="Arial"/>
+          <w:b/>
+          <w:bCs/>
         </w:rPr>
         <w:t xml:space="preserve">VLAN</w:t>
       </w:r>
@@ -1989,7 +1961,7 @@
       </w:pPr>
       <w:r>
         <w:rPr>
-          <w:rFonts w:ascii="Calibri" w:cs="Calibri" w:eastAsia="Calibri" w:hAnsi="Calibri"/>
+          <w:rFonts w:ascii="Arial" w:cs="Arial" w:eastAsia="Arial" w:hAnsi="Arial"/>
         </w:rPr>
         <w:t xml:space="preserve">Agrupan dispositivos dentro de una LAN y en switches individuales.</w:t>
       </w:r>
@@ -2005,13 +1977,13 @@
       </w:pPr>
       <w:r>
         <w:rPr>
-          <w:rFonts w:ascii="Calibri" w:cs="Calibri" w:eastAsia="Calibri" w:hAnsi="Calibri"/>
+          <w:rFonts w:ascii="Arial" w:cs="Arial" w:eastAsia="Arial" w:hAnsi="Arial"/>
         </w:rPr>
         <w:t xml:space="preserve">Se basan en conexiones </w:t>
       </w:r>
       <w:r>
         <w:rPr>
-          <w:rFonts w:ascii="Calibri" w:cs="Calibri" w:eastAsia="Calibri" w:hAnsi="Calibri"/>
+          <w:rFonts w:ascii="Arial" w:cs="Arial" w:eastAsia="Arial" w:hAnsi="Arial"/>
           <w:b/>
           <w:bCs/>
         </w:rPr>
@@ -2019,13 +1991,13 @@
       </w:r>
       <w:r>
         <w:rPr>
-          <w:rFonts w:ascii="Calibri" w:cs="Calibri" w:eastAsia="Calibri" w:hAnsi="Calibri"/>
+          <w:rFonts w:ascii="Arial" w:cs="Arial" w:eastAsia="Arial" w:hAnsi="Arial"/>
         </w:rPr>
         <w:t xml:space="preserve">, mientras que las LAN se basan en conexiones </w:t>
       </w:r>
       <w:r>
         <w:rPr>
-          <w:rFonts w:ascii="Calibri" w:cs="Calibri" w:eastAsia="Calibri" w:hAnsi="Calibri"/>
+          <w:rFonts w:ascii="Arial" w:cs="Arial" w:eastAsia="Arial" w:hAnsi="Arial"/>
           <w:b/>
           <w:bCs/>
         </w:rPr>
@@ -2033,7 +2005,7 @@
       </w:r>
       <w:r>
         <w:rPr>
-          <w:rFonts w:ascii="Calibri" w:cs="Calibri" w:eastAsia="Calibri" w:hAnsi="Calibri"/>
+          <w:rFonts w:ascii="Arial" w:cs="Arial" w:eastAsia="Arial" w:hAnsi="Arial"/>
         </w:rPr>
         <w:t xml:space="preserve">.</w:t>
       </w:r>
@@ -2049,7 +2021,7 @@
       </w:pPr>
       <w:r>
         <w:rPr>
-          <w:rFonts w:ascii="Calibri" w:cs="Calibri" w:eastAsia="Calibri" w:hAnsi="Calibri"/>
+          <w:rFonts w:ascii="Arial" w:cs="Arial" w:eastAsia="Arial" w:hAnsi="Arial"/>
         </w:rPr>
         <w:t xml:space="preserve">Cada puerto del switch se puede asignar a una VLAN.</w:t>
       </w:r>
@@ -2065,13 +2037,13 @@
       </w:pPr>
       <w:r>
         <w:rPr>
-          <w:rFonts w:ascii="Calibri" w:cs="Calibri" w:eastAsia="Calibri" w:hAnsi="Calibri"/>
+          <w:rFonts w:ascii="Arial" w:cs="Arial" w:eastAsia="Arial" w:hAnsi="Arial"/>
         </w:rPr>
         <w:t xml:space="preserve">Los </w:t>
       </w:r>
       <w:r>
         <w:rPr>
-          <w:rFonts w:ascii="Calibri" w:cs="Calibri" w:eastAsia="Calibri" w:hAnsi="Calibri"/>
+          <w:rFonts w:ascii="Arial" w:cs="Arial" w:eastAsia="Arial" w:hAnsi="Arial"/>
           <w:b/>
           <w:bCs/>
         </w:rPr>
@@ -2079,7 +2051,7 @@
       </w:r>
       <w:r>
         <w:rPr>
-          <w:rFonts w:ascii="Calibri" w:cs="Calibri" w:eastAsia="Calibri" w:hAnsi="Calibri"/>
+          <w:rFonts w:ascii="Arial" w:cs="Arial" w:eastAsia="Arial" w:hAnsi="Arial"/>
         </w:rPr>
         <w:t xml:space="preserve"> conectan switches y dejan pasar tráfico de varias VLAN.</w:t>
       </w:r>
@@ -2095,7 +2067,7 @@
       </w:pPr>
       <w:r>
         <w:rPr>
-          <w:rFonts w:ascii="Calibri" w:cs="Calibri" w:eastAsia="Calibri" w:hAnsi="Calibri"/>
+          <w:rFonts w:ascii="Arial" w:cs="Arial" w:eastAsia="Arial" w:hAnsi="Arial"/>
         </w:rPr>
         <w:t xml:space="preserve">Permiten segmentar. Por ejemplo, separan los datos sensibles del resto de la red y bajan el riesgo de filtraciones.</w:t>
       </w:r>
@@ -2111,19 +2083,20 @@
       </w:pPr>
       <w:r>
         <w:rPr>
-          <w:rFonts w:ascii="Calibri" w:cs="Calibri" w:eastAsia="Calibri" w:hAnsi="Calibri"/>
+          <w:rFonts w:ascii="Arial" w:cs="Arial" w:eastAsia="Arial" w:hAnsi="Arial"/>
         </w:rPr>
         <w:t xml:space="preserve">Para protegerlas: supervisar su rendimiento, usar configuraciones avanzadas y aplicar parches y actualizaciones.</w:t>
       </w:r>
     </w:p>
     <w:p>
       <w:pPr>
-        <w:pStyle w:val="Heading3"/>
         <w:spacing w:after="80" w:before="160"/>
       </w:pPr>
       <w:r>
         <w:rPr>
-          <w:rFonts w:ascii="Calibri" w:cs="Calibri" w:eastAsia="Calibri" w:hAnsi="Calibri"/>
+          <w:rFonts w:ascii="Arial" w:cs="Arial" w:eastAsia="Arial" w:hAnsi="Arial"/>
+          <w:b/>
+          <w:bCs/>
         </w:rPr>
         <w:t xml:space="preserve">DMZ</w:t>
       </w:r>
@@ -2139,7 +2112,7 @@
       </w:pPr>
       <w:r>
         <w:rPr>
-          <w:rFonts w:ascii="Calibri" w:cs="Calibri" w:eastAsia="Calibri" w:hAnsi="Calibri"/>
+          <w:rFonts w:ascii="Arial" w:cs="Arial" w:eastAsia="Arial" w:hAnsi="Arial"/>
         </w:rPr>
         <w:t xml:space="preserve">Es una red pequeña entre la red privada confiable e Internet.</w:t>
       </w:r>
@@ -2155,13 +2128,13 @@
       </w:pPr>
       <w:r>
         <w:rPr>
-          <w:rFonts w:ascii="Calibri" w:cs="Calibri" w:eastAsia="Calibri" w:hAnsi="Calibri"/>
+          <w:rFonts w:ascii="Arial" w:cs="Arial" w:eastAsia="Arial" w:hAnsi="Arial"/>
         </w:rPr>
         <w:t xml:space="preserve">Ahí se ponen los </w:t>
       </w:r>
       <w:r>
         <w:rPr>
-          <w:rFonts w:ascii="Calibri" w:cs="Calibri" w:eastAsia="Calibri" w:hAnsi="Calibri"/>
+          <w:rFonts w:ascii="Arial" w:cs="Arial" w:eastAsia="Arial" w:hAnsi="Arial"/>
           <w:b/>
           <w:bCs/>
         </w:rPr>
@@ -2169,7 +2142,7 @@
       </w:r>
       <w:r>
         <w:rPr>
-          <w:rFonts w:ascii="Calibri" w:cs="Calibri" w:eastAsia="Calibri" w:hAnsi="Calibri"/>
+          <w:rFonts w:ascii="Arial" w:cs="Arial" w:eastAsia="Arial" w:hAnsi="Arial"/>
         </w:rPr>
         <w:t xml:space="preserve">, así los usuarios llegan a una red no confiable sin comprometer la interna.</w:t>
       </w:r>
@@ -2185,13 +2158,13 @@
       </w:pPr>
       <w:r>
         <w:rPr>
-          <w:rFonts w:ascii="Calibri" w:cs="Calibri" w:eastAsia="Calibri" w:hAnsi="Calibri"/>
+          <w:rFonts w:ascii="Arial" w:cs="Arial" w:eastAsia="Arial" w:hAnsi="Arial"/>
         </w:rPr>
         <w:t xml:space="preserve">Casi todas las redes tienen de </w:t>
       </w:r>
       <w:r>
         <w:rPr>
-          <w:rFonts w:ascii="Calibri" w:cs="Calibri" w:eastAsia="Calibri" w:hAnsi="Calibri"/>
+          <w:rFonts w:ascii="Arial" w:cs="Arial" w:eastAsia="Arial" w:hAnsi="Arial"/>
           <w:b/>
           <w:bCs/>
         </w:rPr>
@@ -2199,19 +2172,20 @@
       </w:r>
       <w:r>
         <w:rPr>
-          <w:rFonts w:ascii="Calibri" w:cs="Calibri" w:eastAsia="Calibri" w:hAnsi="Calibri"/>
+          <w:rFonts w:ascii="Arial" w:cs="Arial" w:eastAsia="Arial" w:hAnsi="Arial"/>
         </w:rPr>
         <w:t xml:space="preserve">: LAN privada confiable, DMZ, Internet y extranet.</w:t>
       </w:r>
     </w:p>
     <w:p>
       <w:pPr>
-        <w:pStyle w:val="Heading3"/>
         <w:spacing w:after="80" w:before="160"/>
       </w:pPr>
       <w:r>
         <w:rPr>
-          <w:rFonts w:ascii="Calibri" w:cs="Calibri" w:eastAsia="Calibri" w:hAnsi="Calibri"/>
+          <w:rFonts w:ascii="Arial" w:cs="Arial" w:eastAsia="Arial" w:hAnsi="Arial"/>
+          <w:b/>
+          <w:bCs/>
         </w:rPr>
         <w:t xml:space="preserve">Zero Trust (confianza cero)</w:t>
       </w:r>
@@ -2227,7 +2201,7 @@
       </w:pPr>
       <w:r>
         <w:rPr>
-          <w:rFonts w:ascii="Calibri" w:cs="Calibri" w:eastAsia="Calibri" w:hAnsi="Calibri"/>
+          <w:rFonts w:ascii="Arial" w:cs="Arial" w:eastAsia="Arial" w:hAnsi="Arial"/>
         </w:rPr>
         <w:t xml:space="preserve">Confiar automáticamente en usuarios y terminales pone en riesgo toda la red. Un usuario "de confianza" se puede mover por toda la red hasta llegar a los datos.</w:t>
       </w:r>
@@ -2243,13 +2217,13 @@
       </w:pPr>
       <w:r>
         <w:rPr>
-          <w:rFonts w:ascii="Calibri" w:cs="Calibri" w:eastAsia="Calibri" w:hAnsi="Calibri"/>
+          <w:rFonts w:ascii="Arial" w:cs="Arial" w:eastAsia="Arial" w:hAnsi="Arial"/>
         </w:rPr>
         <w:t xml:space="preserve">Zero Trust </w:t>
       </w:r>
       <w:r>
         <w:rPr>
-          <w:rFonts w:ascii="Calibri" w:cs="Calibri" w:eastAsia="Calibri" w:hAnsi="Calibri"/>
+          <w:rFonts w:ascii="Arial" w:cs="Arial" w:eastAsia="Arial" w:hAnsi="Arial"/>
           <w:b/>
           <w:bCs/>
         </w:rPr>
@@ -2257,34 +2231,36 @@
       </w:r>
       <w:r>
         <w:rPr>
-          <w:rFonts w:ascii="Calibri" w:cs="Calibri" w:eastAsia="Calibri" w:hAnsi="Calibri"/>
+          <w:rFonts w:ascii="Arial" w:cs="Arial" w:eastAsia="Arial" w:hAnsi="Arial"/>
         </w:rPr>
         <w:t xml:space="preserve">, sin importar su estado o función.</w:t>
       </w:r>
     </w:p>
     <w:p>
       <w:pPr>
-        <w:pStyle w:val="Heading1"/>
         <w:pBdr>
-          <w:bottom w:val="single" w:color="1F4E79" w:sz="8" w:space="2"/>
+          <w:bottom w:val="single" w:color="000000" w:sz="8" w:space="2"/>
         </w:pBdr>
         <w:spacing w:after="120" w:before="280"/>
       </w:pPr>
       <w:r>
         <w:rPr>
-          <w:rFonts w:ascii="Calibri" w:cs="Calibri" w:eastAsia="Calibri" w:hAnsi="Calibri"/>
+          <w:rFonts w:ascii="Arial" w:cs="Arial" w:eastAsia="Arial" w:hAnsi="Arial"/>
+          <w:b/>
+          <w:bCs/>
         </w:rPr>
         <w:t xml:space="preserve">5. Protección de dispositivos móviles e inalámbricos</w:t>
       </w:r>
     </w:p>
     <w:p>
       <w:pPr>
-        <w:pStyle w:val="Heading3"/>
         <w:spacing w:after="80" w:before="160"/>
       </w:pPr>
       <w:r>
         <w:rPr>
-          <w:rFonts w:ascii="Calibri" w:cs="Calibri" w:eastAsia="Calibri" w:hAnsi="Calibri"/>
+          <w:rFonts w:ascii="Arial" w:cs="Arial" w:eastAsia="Arial" w:hAnsi="Arial"/>
+          <w:b/>
+          <w:bCs/>
         </w:rPr>
         <w:t xml:space="preserve">Seguridad WiFi</w:t>
       </w:r>
@@ -2300,7 +2276,7 @@
       </w:pPr>
       <w:r>
         <w:rPr>
-          <w:rFonts w:ascii="Calibri" w:cs="Calibri" w:eastAsia="Calibri" w:hAnsi="Calibri"/>
+          <w:rFonts w:ascii="Arial" w:cs="Arial" w:eastAsia="Arial" w:hAnsi="Arial"/>
           <w:b/>
           <w:bCs/>
         </w:rPr>
@@ -2308,13 +2284,13 @@
       </w:r>
       <w:r>
         <w:rPr>
-          <w:rFonts w:ascii="Calibri" w:cs="Calibri" w:eastAsia="Calibri" w:hAnsi="Calibri"/>
+          <w:rFonts w:ascii="Arial" w:cs="Arial" w:eastAsia="Arial" w:hAnsi="Arial"/>
         </w:rPr>
         <w:t xml:space="preserve"> fue el primero y lo reemplazó </w:t>
       </w:r>
       <w:r>
         <w:rPr>
-          <w:rFonts w:ascii="Calibri" w:cs="Calibri" w:eastAsia="Calibri" w:hAnsi="Calibri"/>
+          <w:rFonts w:ascii="Arial" w:cs="Arial" w:eastAsia="Arial" w:hAnsi="Arial"/>
           <w:b/>
           <w:bCs/>
         </w:rPr>
@@ -2322,7 +2298,7 @@
       </w:r>
       <w:r>
         <w:rPr>
-          <w:rFonts w:ascii="Calibri" w:cs="Calibri" w:eastAsia="Calibri" w:hAnsi="Calibri"/>
+          <w:rFonts w:ascii="Arial" w:cs="Arial" w:eastAsia="Arial" w:hAnsi="Arial"/>
         </w:rPr>
         <w:t xml:space="preserve">. Después vinieron WPA2, WPA3 y WPS.</w:t>
       </w:r>
@@ -2338,7 +2314,7 @@
       </w:pPr>
       <w:r>
         <w:rPr>
-          <w:rFonts w:ascii="Calibri" w:cs="Calibri" w:eastAsia="Calibri" w:hAnsi="Calibri"/>
+          <w:rFonts w:ascii="Arial" w:cs="Arial" w:eastAsia="Arial" w:hAnsi="Arial"/>
           <w:b/>
           <w:bCs/>
         </w:rPr>
@@ -2346,7 +2322,7 @@
       </w:r>
       <w:r>
         <w:rPr>
-          <w:rFonts w:ascii="Calibri" w:cs="Calibri" w:eastAsia="Calibri" w:hAnsi="Calibri"/>
+          <w:rFonts w:ascii="Arial" w:cs="Arial" w:eastAsia="Arial" w:hAnsi="Arial"/>
         </w:rPr>
         <w:t xml:space="preserve"> cualquier dispositivo se conecta.</w:t>
       </w:r>
@@ -2362,7 +2338,7 @@
       </w:pPr>
       <w:r>
         <w:rPr>
-          <w:rFonts w:ascii="Calibri" w:cs="Calibri" w:eastAsia="Calibri" w:hAnsi="Calibri"/>
+          <w:rFonts w:ascii="Arial" w:cs="Arial" w:eastAsia="Arial" w:hAnsi="Arial"/>
           <w:b/>
           <w:bCs/>
         </w:rPr>
@@ -2370,7 +2346,7 @@
       </w:r>
       <w:r>
         <w:rPr>
-          <w:rFonts w:ascii="Calibri" w:cs="Calibri" w:eastAsia="Calibri" w:hAnsi="Calibri"/>
+          <w:rFonts w:ascii="Arial" w:cs="Arial" w:eastAsia="Arial" w:hAnsi="Arial"/>
         </w:rPr>
         <w:t xml:space="preserve"> autentica y cifra entre el cliente y el AP o router.</w:t>
       </w:r>
@@ -2386,7 +2362,7 @@
       </w:pPr>
       <w:r>
         <w:rPr>
-          <w:rFonts w:ascii="Calibri" w:cs="Calibri" w:eastAsia="Calibri" w:hAnsi="Calibri"/>
+          <w:rFonts w:ascii="Arial" w:cs="Arial" w:eastAsia="Arial" w:hAnsi="Arial"/>
           <w:b/>
           <w:bCs/>
         </w:rPr>
@@ -2394,7 +2370,7 @@
       </w:r>
       <w:r>
         <w:rPr>
-          <w:rFonts w:ascii="Calibri" w:cs="Calibri" w:eastAsia="Calibri" w:hAnsi="Calibri"/>
+          <w:rFonts w:ascii="Arial" w:cs="Arial" w:eastAsia="Arial" w:hAnsi="Arial"/>
         </w:rPr>
         <w:t xml:space="preserve"> es un marco de autenticación. Incluye EAP-TLS, PEAP, EAP-TTLS y EAP-FAST.</w:t>
       </w:r>
@@ -2410,7 +2386,7 @@
       </w:pPr>
       <w:r>
         <w:rPr>
-          <w:rFonts w:ascii="Calibri" w:cs="Calibri" w:eastAsia="Calibri" w:hAnsi="Calibri"/>
+          <w:rFonts w:ascii="Arial" w:cs="Arial" w:eastAsia="Arial" w:hAnsi="Arial"/>
           <w:b/>
           <w:bCs/>
         </w:rPr>
@@ -2418,7 +2394,7 @@
       </w:r>
       <w:r>
         <w:rPr>
-          <w:rFonts w:ascii="Calibri" w:cs="Calibri" w:eastAsia="Calibri" w:hAnsi="Calibri"/>
+          <w:rFonts w:ascii="Arial" w:cs="Arial" w:eastAsia="Arial" w:hAnsi="Arial"/>
         </w:rPr>
         <w:t xml:space="preserve"> imita a uno autorizado, hace que los usuarios se conecten a él y les puede robar los datos.</w:t>
       </w:r>
@@ -2434,7 +2410,7 @@
       </w:pPr>
       <w:r>
         <w:rPr>
-          <w:rFonts w:ascii="Calibri" w:cs="Calibri" w:eastAsia="Calibri" w:hAnsi="Calibri"/>
+          <w:rFonts w:ascii="Arial" w:cs="Arial" w:eastAsia="Arial" w:hAnsi="Arial"/>
           <w:b/>
           <w:bCs/>
         </w:rPr>
@@ -2442,19 +2418,20 @@
       </w:r>
       <w:r>
         <w:rPr>
-          <w:rFonts w:ascii="Calibri" w:cs="Calibri" w:eastAsia="Calibri" w:hAnsi="Calibri"/>
+          <w:rFonts w:ascii="Arial" w:cs="Arial" w:eastAsia="Arial" w:hAnsi="Arial"/>
         </w:rPr>
         <w:t xml:space="preserve"> es bidireccional, o sea que ambas partes se autentican antes de conectarse.</w:t>
       </w:r>
     </w:p>
     <w:p>
       <w:pPr>
-        <w:pStyle w:val="Heading3"/>
         <w:spacing w:after="80" w:before="160"/>
       </w:pPr>
       <w:r>
         <w:rPr>
-          <w:rFonts w:ascii="Calibri" w:cs="Calibri" w:eastAsia="Calibri" w:hAnsi="Calibri"/>
+          <w:rFonts w:ascii="Arial" w:cs="Arial" w:eastAsia="Arial" w:hAnsi="Arial"/>
+          <w:b/>
+          <w:bCs/>
         </w:rPr>
         <w:t xml:space="preserve">Conexiones del móvil</w:t>
       </w:r>
@@ -2470,7 +2447,7 @@
       </w:pPr>
       <w:r>
         <w:rPr>
-          <w:rFonts w:ascii="Calibri" w:cs="Calibri" w:eastAsia="Calibri" w:hAnsi="Calibri"/>
+          <w:rFonts w:ascii="Arial" w:cs="Arial" w:eastAsia="Arial" w:hAnsi="Arial"/>
           <w:b/>
           <w:bCs/>
         </w:rPr>
@@ -2478,7 +2455,7 @@
       </w:r>
       <w:r>
         <w:rPr>
-          <w:rFonts w:ascii="Calibri" w:cs="Calibri" w:eastAsia="Calibri" w:hAnsi="Calibri"/>
+          <w:rFonts w:ascii="Arial" w:cs="Arial" w:eastAsia="Arial" w:hAnsi="Arial"/>
         </w:rPr>
         <w:t xml:space="preserve"> son señales inalámbricas.</w:t>
       </w:r>
@@ -2494,7 +2471,7 @@
       </w:pPr>
       <w:r>
         <w:rPr>
-          <w:rFonts w:ascii="Calibri" w:cs="Calibri" w:eastAsia="Calibri" w:hAnsi="Calibri"/>
+          <w:rFonts w:ascii="Arial" w:cs="Arial" w:eastAsia="Arial" w:hAnsi="Arial"/>
           <w:b/>
           <w:bCs/>
         </w:rPr>
@@ -2502,7 +2479,7 @@
       </w:r>
       <w:r>
         <w:rPr>
-          <w:rFonts w:ascii="Calibri" w:cs="Calibri" w:eastAsia="Calibri" w:hAnsi="Calibri"/>
+          <w:rFonts w:ascii="Arial" w:cs="Arial" w:eastAsia="Arial" w:hAnsi="Arial"/>
         </w:rPr>
         <w:t xml:space="preserve"> comunicación sin contacto entre dispositivos.</w:t>
       </w:r>
@@ -2518,7 +2495,7 @@
       </w:pPr>
       <w:r>
         <w:rPr>
-          <w:rFonts w:ascii="Calibri" w:cs="Calibri" w:eastAsia="Calibri" w:hAnsi="Calibri"/>
+          <w:rFonts w:ascii="Arial" w:cs="Arial" w:eastAsia="Arial" w:hAnsi="Arial"/>
           <w:b/>
           <w:bCs/>
         </w:rPr>
@@ -2526,7 +2503,7 @@
       </w:r>
       <w:r>
         <w:rPr>
-          <w:rFonts w:ascii="Calibri" w:cs="Calibri" w:eastAsia="Calibri" w:hAnsi="Calibri"/>
+          <w:rFonts w:ascii="Arial" w:cs="Arial" w:eastAsia="Arial" w:hAnsi="Arial"/>
         </w:rPr>
         <w:t xml:space="preserve"> comunicación de corto alcance con un receptor de infrarrojos.</w:t>
       </w:r>
@@ -2542,7 +2519,7 @@
       </w:pPr>
       <w:r>
         <w:rPr>
-          <w:rFonts w:ascii="Calibri" w:cs="Calibri" w:eastAsia="Calibri" w:hAnsi="Calibri"/>
+          <w:rFonts w:ascii="Arial" w:cs="Arial" w:eastAsia="Arial" w:hAnsi="Arial"/>
           <w:b/>
           <w:bCs/>
         </w:rPr>
@@ -2550,19 +2527,20 @@
       </w:r>
       <w:r>
         <w:rPr>
-          <w:rFonts w:ascii="Calibri" w:cs="Calibri" w:eastAsia="Calibri" w:hAnsi="Calibri"/>
+          <w:rFonts w:ascii="Arial" w:cs="Arial" w:eastAsia="Arial" w:hAnsi="Arial"/>
         </w:rPr>
         <w:t xml:space="preserve"> el único tipo de comunicación por cable de la lista.</w:t>
       </w:r>
     </w:p>
     <w:p>
       <w:pPr>
-        <w:pStyle w:val="Heading3"/>
         <w:spacing w:after="80" w:before="160"/>
       </w:pPr>
       <w:r>
         <w:rPr>
-          <w:rFonts w:ascii="Calibri" w:cs="Calibri" w:eastAsia="Calibri" w:hAnsi="Calibri"/>
+          <w:rFonts w:ascii="Arial" w:cs="Arial" w:eastAsia="Arial" w:hAnsi="Arial"/>
+          <w:b/>
+          <w:bCs/>
         </w:rPr>
         <w:t xml:space="preserve">Protección de datos</w:t>
       </w:r>
@@ -2578,7 +2556,7 @@
       </w:pPr>
       <w:r>
         <w:rPr>
-          <w:rFonts w:ascii="Calibri" w:cs="Calibri" w:eastAsia="Calibri" w:hAnsi="Calibri"/>
+          <w:rFonts w:ascii="Arial" w:cs="Arial" w:eastAsia="Arial" w:hAnsi="Arial"/>
           <w:b/>
           <w:bCs/>
         </w:rPr>
@@ -2586,7 +2564,7 @@
       </w:r>
       <w:r>
         <w:rPr>
-          <w:rFonts w:ascii="Calibri" w:cs="Calibri" w:eastAsia="Calibri" w:hAnsi="Calibri"/>
+          <w:rFonts w:ascii="Arial" w:cs="Arial" w:eastAsia="Arial" w:hAnsi="Arial"/>
         </w:rPr>
         <w:t xml:space="preserve"> separan lo personal de lo laboral en el mismo dispositivo. Dan un área autenticada y cifrada para la info de la empresa.</w:t>
       </w:r>
@@ -2602,7 +2580,7 @@
       </w:pPr>
       <w:r>
         <w:rPr>
-          <w:rFonts w:ascii="Calibri" w:cs="Calibri" w:eastAsia="Calibri" w:hAnsi="Calibri"/>
+          <w:rFonts w:ascii="Arial" w:cs="Arial" w:eastAsia="Arial" w:hAnsi="Arial"/>
         </w:rPr>
         <w:t xml:space="preserve">Hay riesgo con las apps que comparten datos, como Dropbox, Box, Google Drive e iCloud.</w:t>
       </w:r>
@@ -2618,13 +2596,13 @@
       </w:pPr>
       <w:r>
         <w:rPr>
-          <w:rFonts w:ascii="Calibri" w:cs="Calibri" w:eastAsia="Calibri" w:hAnsi="Calibri"/>
+          <w:rFonts w:ascii="Arial" w:cs="Arial" w:eastAsia="Arial" w:hAnsi="Arial"/>
         </w:rPr>
         <w:t xml:space="preserve">Un sistema de </w:t>
       </w:r>
       <w:r>
         <w:rPr>
-          <w:rFonts w:ascii="Calibri" w:cs="Calibri" w:eastAsia="Calibri" w:hAnsi="Calibri"/>
+          <w:rFonts w:ascii="Arial" w:cs="Arial" w:eastAsia="Arial" w:hAnsi="Arial"/>
           <w:b/>
           <w:bCs/>
         </w:rPr>
@@ -2632,7 +2610,7 @@
       </w:r>
       <w:r>
         <w:rPr>
-          <w:rFonts w:ascii="Calibri" w:cs="Calibri" w:eastAsia="Calibri" w:hAnsi="Calibri"/>
+          <w:rFonts w:ascii="Arial" w:cs="Arial" w:eastAsia="Arial" w:hAnsi="Arial"/>
         </w:rPr>
         <w:t xml:space="preserve"> controla qué datos accede cada usuario.</w:t>
       </w:r>
@@ -2648,7 +2626,7 @@
       </w:pPr>
       <w:r>
         <w:rPr>
-          <w:rFonts w:ascii="Calibri" w:cs="Calibri" w:eastAsia="Calibri" w:hAnsi="Calibri"/>
+          <w:rFonts w:ascii="Arial" w:cs="Arial" w:eastAsia="Arial" w:hAnsi="Arial"/>
           <w:b/>
           <w:bCs/>
         </w:rPr>
@@ -2656,7 +2634,7 @@
       </w:r>
       <w:r>
         <w:rPr>
-          <w:rFonts w:ascii="Calibri" w:cs="Calibri" w:eastAsia="Calibri" w:hAnsi="Calibri"/>
+          <w:rFonts w:ascii="Arial" w:cs="Arial" w:eastAsia="Arial" w:hAnsi="Arial"/>
         </w:rPr>
         <w:t xml:space="preserve"> se firman las apps digitalmente para autorizar cuáles se pueden instalar.</w:t>
       </w:r>
@@ -2672,7 +2650,7 @@
       </w:pPr>
       <w:r>
         <w:rPr>
-          <w:rFonts w:ascii="Calibri" w:cs="Calibri" w:eastAsia="Calibri" w:hAnsi="Calibri"/>
+          <w:rFonts w:ascii="Arial" w:cs="Arial" w:eastAsia="Arial" w:hAnsi="Arial"/>
           <w:b/>
           <w:bCs/>
         </w:rPr>
@@ -2680,7 +2658,7 @@
       </w:r>
       <w:r>
         <w:rPr>
-          <w:rFonts w:ascii="Calibri" w:cs="Calibri" w:eastAsia="Calibri" w:hAnsi="Calibri"/>
+          <w:rFonts w:ascii="Arial" w:cs="Arial" w:eastAsia="Arial" w:hAnsi="Arial"/>
         </w:rPr>
         <w:t xml:space="preserve"> formas de saltarse las restricciones del dispositivo.</w:t>
       </w:r>
@@ -2696,7 +2674,7 @@
       </w:pPr>
       <w:r>
         <w:rPr>
-          <w:rFonts w:ascii="Calibri" w:cs="Calibri" w:eastAsia="Calibri" w:hAnsi="Calibri"/>
+          <w:rFonts w:ascii="Arial" w:cs="Arial" w:eastAsia="Arial" w:hAnsi="Arial"/>
           <w:b/>
           <w:bCs/>
         </w:rPr>
@@ -2704,7 +2682,7 @@
       </w:r>
       <w:r>
         <w:rPr>
-          <w:rFonts w:ascii="Calibri" w:cs="Calibri" w:eastAsia="Calibri" w:hAnsi="Calibri"/>
+          <w:rFonts w:ascii="Arial" w:cs="Arial" w:eastAsia="Arial" w:hAnsi="Arial"/>
         </w:rPr>
         <w:t xml:space="preserve"> bloqueo de pantalla, biometría, autenticación sensible al contexto, borrado remoto y cifrado completo del dispositivo.</w:t>
       </w:r>
@@ -2720,7 +2698,7 @@
       </w:pPr>
       <w:r>
         <w:rPr>
-          <w:rFonts w:ascii="Calibri" w:cs="Calibri" w:eastAsia="Calibri" w:hAnsi="Calibri"/>
+          <w:rFonts w:ascii="Arial" w:cs="Arial" w:eastAsia="Arial" w:hAnsi="Arial"/>
           <w:b/>
           <w:bCs/>
         </w:rPr>
@@ -2728,34 +2706,36 @@
       </w:r>
       <w:r>
         <w:rPr>
-          <w:rFonts w:ascii="Calibri" w:cs="Calibri" w:eastAsia="Calibri" w:hAnsi="Calibri"/>
+          <w:rFonts w:ascii="Arial" w:cs="Arial" w:eastAsia="Arial" w:hAnsi="Arial"/>
         </w:rPr>
         <w:t xml:space="preserve"> usa satélites y computadoras para ubicar el dispositivo.</w:t>
       </w:r>
     </w:p>
     <w:p>
       <w:pPr>
-        <w:pStyle w:val="Heading1"/>
         <w:pBdr>
-          <w:bottom w:val="single" w:color="1F4E79" w:sz="8" w:space="2"/>
+          <w:bottom w:val="single" w:color="000000" w:sz="8" w:space="2"/>
         </w:pBdr>
         <w:spacing w:after="120" w:before="280"/>
       </w:pPr>
       <w:r>
         <w:rPr>
-          <w:rFonts w:ascii="Calibri" w:cs="Calibri" w:eastAsia="Calibri" w:hAnsi="Calibri"/>
+          <w:rFonts w:ascii="Arial" w:cs="Arial" w:eastAsia="Arial" w:hAnsi="Arial"/>
+          <w:b/>
+          <w:bCs/>
         </w:rPr>
         <w:t xml:space="preserve">6. Resiliencia de la ciberseguridad</w:t>
       </w:r>
     </w:p>
     <w:p>
       <w:pPr>
-        <w:pStyle w:val="Heading3"/>
         <w:spacing w:after="80" w:before="160"/>
       </w:pPr>
       <w:r>
         <w:rPr>
-          <w:rFonts w:ascii="Calibri" w:cs="Calibri" w:eastAsia="Calibri" w:hAnsi="Calibri"/>
+          <w:rFonts w:ascii="Arial" w:cs="Arial" w:eastAsia="Arial" w:hAnsi="Arial"/>
+          <w:b/>
+          <w:bCs/>
         </w:rPr>
         <w:t xml:space="preserve">Alta disponibilidad</w:t>
       </w:r>
@@ -2771,13 +2751,13 @@
       </w:pPr>
       <w:r>
         <w:rPr>
-          <w:rFonts w:ascii="Calibri" w:cs="Calibri" w:eastAsia="Calibri" w:hAnsi="Calibri"/>
+          <w:rFonts w:ascii="Arial" w:cs="Arial" w:eastAsia="Arial" w:hAnsi="Arial"/>
         </w:rPr>
         <w:t xml:space="preserve">Se basa en </w:t>
       </w:r>
       <w:r>
         <w:rPr>
-          <w:rFonts w:ascii="Calibri" w:cs="Calibri" w:eastAsia="Calibri" w:hAnsi="Calibri"/>
+          <w:rFonts w:ascii="Arial" w:cs="Arial" w:eastAsia="Arial" w:hAnsi="Arial"/>
           <w:b/>
           <w:bCs/>
         </w:rPr>
@@ -2785,7 +2765,7 @@
       </w:r>
       <w:r>
         <w:rPr>
-          <w:rFonts w:ascii="Calibri" w:cs="Calibri" w:eastAsia="Calibri" w:hAnsi="Calibri"/>
+          <w:rFonts w:ascii="Arial" w:cs="Arial" w:eastAsia="Arial" w:hAnsi="Arial"/>
         </w:rPr>
         <w:t xml:space="preserve">: eliminar puntos únicos de falla, dar un crossover confiable y detectar fallas a medida que ocurren.</w:t>
       </w:r>
@@ -2801,13 +2781,13 @@
       </w:pPr>
       <w:r>
         <w:rPr>
-          <w:rFonts w:ascii="Calibri" w:cs="Calibri" w:eastAsia="Calibri" w:hAnsi="Calibri"/>
+          <w:rFonts w:ascii="Arial" w:cs="Arial" w:eastAsia="Arial" w:hAnsi="Arial"/>
         </w:rPr>
         <w:t xml:space="preserve">Los </w:t>
       </w:r>
       <w:r>
         <w:rPr>
-          <w:rFonts w:ascii="Calibri" w:cs="Calibri" w:eastAsia="Calibri" w:hAnsi="Calibri"/>
+          <w:rFonts w:ascii="Arial" w:cs="Arial" w:eastAsia="Arial" w:hAnsi="Arial"/>
           <w:b/>
           <w:bCs/>
         </w:rPr>
@@ -2815,7 +2795,7 @@
       </w:r>
       <w:r>
         <w:rPr>
-          <w:rFonts w:ascii="Calibri" w:cs="Calibri" w:eastAsia="Calibri" w:hAnsi="Calibri"/>
+          <w:rFonts w:ascii="Arial" w:cs="Arial" w:eastAsia="Arial" w:hAnsi="Arial"/>
         </w:rPr>
         <w:t xml:space="preserve"> son 99,999 % de disponibilidad.</w:t>
       </w:r>
@@ -2831,7 +2811,7 @@
       </w:pPr>
       <w:r>
         <w:rPr>
-          <w:rFonts w:ascii="Calibri" w:cs="Calibri" w:eastAsia="Calibri" w:hAnsi="Calibri"/>
+          <w:rFonts w:ascii="Arial" w:cs="Arial" w:eastAsia="Arial" w:hAnsi="Arial"/>
           <w:b/>
           <w:bCs/>
         </w:rPr>
@@ -2839,7 +2819,7 @@
       </w:r>
       <w:r>
         <w:rPr>
-          <w:rFonts w:ascii="Calibri" w:cs="Calibri" w:eastAsia="Calibri" w:hAnsi="Calibri"/>
+          <w:rFonts w:ascii="Arial" w:cs="Arial" w:eastAsia="Arial" w:hAnsi="Arial"/>
         </w:rPr>
         <w:t xml:space="preserve"> usar los mismos componentes.</w:t>
       </w:r>
@@ -2855,7 +2835,7 @@
       </w:pPr>
       <w:r>
         <w:rPr>
-          <w:rFonts w:ascii="Calibri" w:cs="Calibri" w:eastAsia="Calibri" w:hAnsi="Calibri"/>
+          <w:rFonts w:ascii="Arial" w:cs="Arial" w:eastAsia="Arial" w:hAnsi="Arial"/>
           <w:b/>
           <w:bCs/>
         </w:rPr>
@@ -2863,7 +2843,7 @@
       </w:r>
       <w:r>
         <w:rPr>
-          <w:rFonts w:ascii="Calibri" w:cs="Calibri" w:eastAsia="Calibri" w:hAnsi="Calibri"/>
+          <w:rFonts w:ascii="Arial" w:cs="Arial" w:eastAsia="Arial" w:hAnsi="Arial"/>
         </w:rPr>
         <w:t xml:space="preserve"> varios dispositivos agrupados que, para el usuario, parecen una sola entidad.</w:t>
       </w:r>
@@ -2879,7 +2859,7 @@
       </w:pPr>
       <w:r>
         <w:rPr>
-          <w:rFonts w:ascii="Calibri" w:cs="Calibri" w:eastAsia="Calibri" w:hAnsi="Calibri"/>
+          <w:rFonts w:ascii="Arial" w:cs="Arial" w:eastAsia="Arial" w:hAnsi="Arial"/>
           <w:b/>
           <w:bCs/>
         </w:rPr>
@@ -2887,19 +2867,20 @@
       </w:r>
       <w:r>
         <w:rPr>
-          <w:rFonts w:ascii="Calibri" w:cs="Calibri" w:eastAsia="Calibri" w:hAnsi="Calibri"/>
+          <w:rFonts w:ascii="Arial" w:cs="Arial" w:eastAsia="Arial" w:hAnsi="Arial"/>
         </w:rPr>
         <w:t xml:space="preserve"> un sistema completo puede sustituir a otro que falló.</w:t>
       </w:r>
     </w:p>
     <w:p>
       <w:pPr>
-        <w:pStyle w:val="Heading3"/>
         <w:spacing w:after="80" w:before="160"/>
       </w:pPr>
       <w:r>
         <w:rPr>
-          <w:rFonts w:ascii="Calibri" w:cs="Calibri" w:eastAsia="Calibri" w:hAnsi="Calibri"/>
+          <w:rFonts w:ascii="Arial" w:cs="Arial" w:eastAsia="Arial" w:hAnsi="Arial"/>
+          <w:b/>
+          <w:bCs/>
         </w:rPr>
         <w:t xml:space="preserve">Punto único de falla</w:t>
       </w:r>
@@ -2915,7 +2896,7 @@
       </w:pPr>
       <w:r>
         <w:rPr>
-          <w:rFonts w:ascii="Calibri" w:cs="Calibri" w:eastAsia="Calibri" w:hAnsi="Calibri"/>
+          <w:rFonts w:ascii="Arial" w:cs="Arial" w:eastAsia="Arial" w:hAnsi="Arial"/>
         </w:rPr>
         <w:t xml:space="preserve">Puede ser una pieza de hardware, un proceso, un dato específico o una utilidad esencial.</w:t>
       </w:r>
@@ -2931,13 +2912,13 @@
       </w:pPr>
       <w:r>
         <w:rPr>
-          <w:rFonts w:ascii="Calibri" w:cs="Calibri" w:eastAsia="Calibri" w:hAnsi="Calibri"/>
+          <w:rFonts w:ascii="Arial" w:cs="Arial" w:eastAsia="Arial" w:hAnsi="Arial"/>
         </w:rPr>
         <w:t xml:space="preserve">La solución es modificar la operación crítica para que no dependa de un solo elemento, usando </w:t>
       </w:r>
       <w:r>
         <w:rPr>
-          <w:rFonts w:ascii="Calibri" w:cs="Calibri" w:eastAsia="Calibri" w:hAnsi="Calibri"/>
+          <w:rFonts w:ascii="Arial" w:cs="Arial" w:eastAsia="Arial" w:hAnsi="Arial"/>
           <w:b/>
           <w:bCs/>
         </w:rPr>
@@ -2945,7 +2926,7 @@
       </w:r>
       <w:r>
         <w:rPr>
-          <w:rFonts w:ascii="Calibri" w:cs="Calibri" w:eastAsia="Calibri" w:hAnsi="Calibri"/>
+          <w:rFonts w:ascii="Arial" w:cs="Arial" w:eastAsia="Arial" w:hAnsi="Arial"/>
         </w:rPr>
         <w:t xml:space="preserve">.</w:t>
       </w:r>
@@ -2961,7 +2942,7 @@
       </w:pPr>
       <w:r>
         <w:rPr>
-          <w:rFonts w:ascii="Calibri" w:cs="Calibri" w:eastAsia="Calibri" w:hAnsi="Calibri"/>
+          <w:rFonts w:ascii="Arial" w:cs="Arial" w:eastAsia="Arial" w:hAnsi="Arial"/>
           <w:b/>
           <w:bCs/>
         </w:rPr>
@@ -2969,19 +2950,20 @@
       </w:r>
       <w:r>
         <w:rPr>
-          <w:rFonts w:ascii="Calibri" w:cs="Calibri" w:eastAsia="Calibri" w:hAnsi="Calibri"/>
+          <w:rFonts w:ascii="Arial" w:cs="Arial" w:eastAsia="Arial" w:hAnsi="Arial"/>
         </w:rPr>
         <w:t xml:space="preserve"> los componentes (N) necesitan al menos un componente de respaldo (+1).</w:t>
       </w:r>
     </w:p>
     <w:p>
       <w:pPr>
-        <w:pStyle w:val="Heading3"/>
         <w:spacing w:after="80" w:before="160"/>
       </w:pPr>
       <w:r>
         <w:rPr>
-          <w:rFonts w:ascii="Calibri" w:cs="Calibri" w:eastAsia="Calibri" w:hAnsi="Calibri"/>
+          <w:rFonts w:ascii="Arial" w:cs="Arial" w:eastAsia="Arial" w:hAnsi="Arial"/>
+          <w:b/>
+          <w:bCs/>
         </w:rPr>
         <w:t xml:space="preserve">RAID</w:t>
       </w:r>
@@ -2997,7 +2979,7 @@
       </w:pPr>
       <w:r>
         <w:rPr>
-          <w:rFonts w:ascii="Calibri" w:cs="Calibri" w:eastAsia="Calibri" w:hAnsi="Calibri"/>
+          <w:rFonts w:ascii="Arial" w:cs="Arial" w:eastAsia="Arial" w:hAnsi="Arial"/>
         </w:rPr>
         <w:t xml:space="preserve">Es una matriz redundante de discos independientes.</w:t>
       </w:r>
@@ -3013,13 +2995,13 @@
       </w:pPr>
       <w:r>
         <w:rPr>
-          <w:rFonts w:ascii="Calibri" w:cs="Calibri" w:eastAsia="Calibri" w:hAnsi="Calibri"/>
+          <w:rFonts w:ascii="Arial" w:cs="Arial" w:eastAsia="Arial" w:hAnsi="Arial"/>
         </w:rPr>
         <w:t xml:space="preserve">Toma datos de un solo disco y los </w:t>
       </w:r>
       <w:r>
         <w:rPr>
-          <w:rFonts w:ascii="Calibri" w:cs="Calibri" w:eastAsia="Calibri" w:hAnsi="Calibri"/>
+          <w:rFonts w:ascii="Arial" w:cs="Arial" w:eastAsia="Arial" w:hAnsi="Arial"/>
           <w:b/>
           <w:bCs/>
         </w:rPr>
@@ -3027,7 +3009,7 @@
       </w:r>
       <w:r>
         <w:rPr>
-          <w:rFonts w:ascii="Calibri" w:cs="Calibri" w:eastAsia="Calibri" w:hAnsi="Calibri"/>
+          <w:rFonts w:ascii="Arial" w:cs="Arial" w:eastAsia="Arial" w:hAnsi="Arial"/>
         </w:rPr>
         <w:t xml:space="preserve">.</w:t>
       </w:r>
@@ -3043,13 +3025,13 @@
       </w:pPr>
       <w:r>
         <w:rPr>
-          <w:rFonts w:ascii="Calibri" w:cs="Calibri" w:eastAsia="Calibri" w:hAnsi="Calibri"/>
+          <w:rFonts w:ascii="Arial" w:cs="Arial" w:eastAsia="Arial" w:hAnsi="Arial"/>
         </w:rPr>
         <w:t xml:space="preserve">Excepto en </w:t>
       </w:r>
       <w:r>
         <w:rPr>
-          <w:rFonts w:ascii="Calibri" w:cs="Calibri" w:eastAsia="Calibri" w:hAnsi="Calibri"/>
+          <w:rFonts w:ascii="Arial" w:cs="Arial" w:eastAsia="Arial" w:hAnsi="Arial"/>
           <w:b/>
           <w:bCs/>
         </w:rPr>
@@ -3057,19 +3039,20 @@
       </w:r>
       <w:r>
         <w:rPr>
-          <w:rFonts w:ascii="Calibri" w:cs="Calibri" w:eastAsia="Calibri" w:hAnsi="Calibri"/>
+          <w:rFonts w:ascii="Arial" w:cs="Arial" w:eastAsia="Arial" w:hAnsi="Arial"/>
         </w:rPr>
         <w:t xml:space="preserve">, si se pierde un disco los datos se recuperan de los otros.</w:t>
       </w:r>
     </w:p>
     <w:p>
       <w:pPr>
-        <w:pStyle w:val="Heading3"/>
         <w:spacing w:after="80" w:before="160"/>
       </w:pPr>
       <w:r>
         <w:rPr>
-          <w:rFonts w:ascii="Calibri" w:cs="Calibri" w:eastAsia="Calibri" w:hAnsi="Calibri"/>
+          <w:rFonts w:ascii="Arial" w:cs="Arial" w:eastAsia="Arial" w:hAnsi="Arial"/>
+          <w:b/>
+          <w:bCs/>
         </w:rPr>
         <w:t xml:space="preserve">Redundancia en la red</w:t>
       </w:r>
@@ -3085,7 +3068,7 @@
       </w:pPr>
       <w:r>
         <w:rPr>
-          <w:rFonts w:ascii="Calibri" w:cs="Calibri" w:eastAsia="Calibri" w:hAnsi="Calibri"/>
+          <w:rFonts w:ascii="Arial" w:cs="Arial" w:eastAsia="Arial" w:hAnsi="Arial"/>
           <w:b/>
           <w:bCs/>
         </w:rPr>
@@ -3093,7 +3076,7 @@
       </w:r>
       <w:r>
         <w:rPr>
-          <w:rFonts w:ascii="Calibri" w:cs="Calibri" w:eastAsia="Calibri" w:hAnsi="Calibri"/>
+          <w:rFonts w:ascii="Arial" w:cs="Arial" w:eastAsia="Arial" w:hAnsi="Arial"/>
         </w:rPr>
         <w:t xml:space="preserve"> evita bucles cuando los switches se interconectan por varias rutas. Deja una sola ruta lógica activa entre los destinos.</w:t>
       </w:r>
@@ -3109,7 +3092,7 @@
       </w:pPr>
       <w:r>
         <w:rPr>
-          <w:rFonts w:ascii="Calibri" w:cs="Calibri" w:eastAsia="Calibri" w:hAnsi="Calibri"/>
+          <w:rFonts w:ascii="Arial" w:cs="Arial" w:eastAsia="Arial" w:hAnsi="Arial"/>
           <w:b/>
           <w:bCs/>
         </w:rPr>
@@ -3117,13 +3100,13 @@
       </w:r>
       <w:r>
         <w:rPr>
-          <w:rFonts w:ascii="Calibri" w:cs="Calibri" w:eastAsia="Calibri" w:hAnsi="Calibri"/>
+          <w:rFonts w:ascii="Arial" w:cs="Arial" w:eastAsia="Arial" w:hAnsi="Arial"/>
         </w:rPr>
         <w:t xml:space="preserve"> es el router que da acceso al resto de la red o a Internet. Si hay uno solo, es un punto único de falla, así que hay que instalar </w:t>
       </w:r>
       <w:r>
         <w:rPr>
-          <w:rFonts w:ascii="Calibri" w:cs="Calibri" w:eastAsia="Calibri" w:hAnsi="Calibri"/>
+          <w:rFonts w:ascii="Arial" w:cs="Arial" w:eastAsia="Arial" w:hAnsi="Arial"/>
           <w:b/>
           <w:bCs/>
         </w:rPr>
@@ -3131,19 +3114,20 @@
       </w:r>
       <w:r>
         <w:rPr>
-          <w:rFonts w:ascii="Calibri" w:cs="Calibri" w:eastAsia="Calibri" w:hAnsi="Calibri"/>
+          <w:rFonts w:ascii="Arial" w:cs="Arial" w:eastAsia="Arial" w:hAnsi="Arial"/>
         </w:rPr>
         <w:t xml:space="preserve">.</w:t>
       </w:r>
     </w:p>
     <w:p>
       <w:pPr>
-        <w:pStyle w:val="Heading3"/>
         <w:spacing w:after="80" w:before="160"/>
       </w:pPr>
       <w:r>
         <w:rPr>
-          <w:rFonts w:ascii="Calibri" w:cs="Calibri" w:eastAsia="Calibri" w:hAnsi="Calibri"/>
+          <w:rFonts w:ascii="Arial" w:cs="Arial" w:eastAsia="Arial" w:hAnsi="Arial"/>
+          <w:b/>
+          <w:bCs/>
         </w:rPr>
         <w:t xml:space="preserve">Redundancia de ubicación y aplicaciones</w:t>
       </w:r>
@@ -3159,13 +3143,13 @@
       </w:pPr>
       <w:r>
         <w:rPr>
-          <w:rFonts w:ascii="Calibri" w:cs="Calibri" w:eastAsia="Calibri" w:hAnsi="Calibri"/>
+          <w:rFonts w:ascii="Arial" w:cs="Arial" w:eastAsia="Arial" w:hAnsi="Arial"/>
         </w:rPr>
         <w:t xml:space="preserve">Tipos de replicación: </w:t>
       </w:r>
       <w:r>
         <w:rPr>
-          <w:rFonts w:ascii="Calibri" w:cs="Calibri" w:eastAsia="Calibri" w:hAnsi="Calibri"/>
+          <w:rFonts w:ascii="Arial" w:cs="Arial" w:eastAsia="Arial" w:hAnsi="Arial"/>
           <w:b/>
           <w:bCs/>
         </w:rPr>
@@ -3173,13 +3157,13 @@
       </w:r>
       <w:r>
         <w:rPr>
-          <w:rFonts w:ascii="Calibri" w:cs="Calibri" w:eastAsia="Calibri" w:hAnsi="Calibri"/>
+          <w:rFonts w:ascii="Arial" w:cs="Arial" w:eastAsia="Arial" w:hAnsi="Arial"/>
         </w:rPr>
         <w:t xml:space="preserve">, </w:t>
       </w:r>
       <w:r>
         <w:rPr>
-          <w:rFonts w:ascii="Calibri" w:cs="Calibri" w:eastAsia="Calibri" w:hAnsi="Calibri"/>
+          <w:rFonts w:ascii="Arial" w:cs="Arial" w:eastAsia="Arial" w:hAnsi="Arial"/>
           <w:b/>
           <w:bCs/>
         </w:rPr>
@@ -3187,13 +3171,13 @@
       </w:r>
       <w:r>
         <w:rPr>
-          <w:rFonts w:ascii="Calibri" w:cs="Calibri" w:eastAsia="Calibri" w:hAnsi="Calibri"/>
+          <w:rFonts w:ascii="Arial" w:cs="Arial" w:eastAsia="Arial" w:hAnsi="Arial"/>
         </w:rPr>
         <w:t xml:space="preserve"> y </w:t>
       </w:r>
       <w:r>
         <w:rPr>
-          <w:rFonts w:ascii="Calibri" w:cs="Calibri" w:eastAsia="Calibri" w:hAnsi="Calibri"/>
+          <w:rFonts w:ascii="Arial" w:cs="Arial" w:eastAsia="Arial" w:hAnsi="Arial"/>
           <w:b/>
           <w:bCs/>
         </w:rPr>
@@ -3201,7 +3185,7 @@
       </w:r>
       <w:r>
         <w:rPr>
-          <w:rFonts w:ascii="Calibri" w:cs="Calibri" w:eastAsia="Calibri" w:hAnsi="Calibri"/>
+          <w:rFonts w:ascii="Arial" w:cs="Arial" w:eastAsia="Arial" w:hAnsi="Arial"/>
         </w:rPr>
         <w:t xml:space="preserve">.</w:t>
       </w:r>
@@ -3217,7 +3201,7 @@
       </w:pPr>
       <w:r>
         <w:rPr>
-          <w:rFonts w:ascii="Calibri" w:cs="Calibri" w:eastAsia="Calibri" w:hAnsi="Calibri"/>
+          <w:rFonts w:ascii="Arial" w:cs="Arial" w:eastAsia="Arial" w:hAnsi="Arial"/>
         </w:rPr>
         <w:t xml:space="preserve">Soluciones de resiliencia para aplicaciones: hardware tolerante a fallas, arquitectura de clúster y copia de respaldo y restauración.</w:t>
       </w:r>
@@ -3233,13 +3217,13 @@
       </w:pPr>
       <w:r>
         <w:rPr>
-          <w:rFonts w:ascii="Calibri" w:cs="Calibri" w:eastAsia="Calibri" w:hAnsi="Calibri"/>
+          <w:rFonts w:ascii="Arial" w:cs="Arial" w:eastAsia="Arial" w:hAnsi="Arial"/>
         </w:rPr>
         <w:t xml:space="preserve">Las copias de seguridad deben hacerse </w:t>
       </w:r>
       <w:r>
         <w:rPr>
-          <w:rFonts w:ascii="Calibri" w:cs="Calibri" w:eastAsia="Calibri" w:hAnsi="Calibri"/>
+          <w:rFonts w:ascii="Arial" w:cs="Arial" w:eastAsia="Arial" w:hAnsi="Arial"/>
           <w:b/>
           <w:bCs/>
         </w:rPr>
@@ -3247,13 +3231,13 @@
       </w:r>
       <w:r>
         <w:rPr>
-          <w:rFonts w:ascii="Calibri" w:cs="Calibri" w:eastAsia="Calibri" w:hAnsi="Calibri"/>
+          <w:rFonts w:ascii="Arial" w:cs="Arial" w:eastAsia="Arial" w:hAnsi="Arial"/>
         </w:rPr>
         <w:t xml:space="preserve"> y guardarse </w:t>
       </w:r>
       <w:r>
         <w:rPr>
-          <w:rFonts w:ascii="Calibri" w:cs="Calibri" w:eastAsia="Calibri" w:hAnsi="Calibri"/>
+          <w:rFonts w:ascii="Arial" w:cs="Arial" w:eastAsia="Arial" w:hAnsi="Arial"/>
           <w:b/>
           <w:bCs/>
         </w:rPr>
@@ -3261,41 +3245,20 @@
       </w:r>
       <w:r>
         <w:rPr>
-          <w:rFonts w:ascii="Calibri" w:cs="Calibri" w:eastAsia="Calibri" w:hAnsi="Calibri"/>
+          <w:rFonts w:ascii="Arial" w:cs="Arial" w:eastAsia="Arial" w:hAnsi="Arial"/>
         </w:rPr>
         <w:t xml:space="preserve">, por si pasa algo en las principales.</w:t>
       </w:r>
     </w:p>
     <w:p>
       <w:pPr>
-        <w:shd w:fill="FEF3C7" w:val="clear"/>
-        <w:spacing w:after="100" w:before="60"/>
-        <w:ind w:left="120" w:right="120"/>
-      </w:pPr>
-      <w:r>
-        <w:rPr>
-          <w:rFonts w:ascii="Calibri" w:cs="Calibri" w:eastAsia="Calibri" w:hAnsi="Calibri"/>
-          <w:b/>
-          <w:bCs/>
-          <w:color w:val="B45309"/>
-        </w:rPr>
-        <w:t xml:space="preserve">⚠ Ojo: </w:t>
-      </w:r>
-      <w:r>
-        <w:rPr>
-          <w:rFonts w:ascii="Calibri" w:cs="Calibri" w:eastAsia="Calibri" w:hAnsi="Calibri"/>
-        </w:rPr>
-        <w:t xml:space="preserve">El diseño robusto es más que solo añadir redundancia.</w:t>
-      </w:r>
-    </w:p>
-    <w:p>
-      <w:pPr>
-        <w:pStyle w:val="Heading3"/>
         <w:spacing w:after="80" w:before="160"/>
       </w:pPr>
       <w:r>
         <w:rPr>
-          <w:rFonts w:ascii="Calibri" w:cs="Calibri" w:eastAsia="Calibri" w:hAnsi="Calibri"/>
+          <w:rFonts w:ascii="Arial" w:cs="Arial" w:eastAsia="Arial" w:hAnsi="Arial"/>
+          <w:b/>
+          <w:bCs/>
         </w:rPr>
         <w:t xml:space="preserve">Energía y ambiente</w:t>
       </w:r>
@@ -3311,7 +3274,7 @@
       </w:pPr>
       <w:r>
         <w:rPr>
-          <w:rFonts w:ascii="Calibri" w:cs="Calibri" w:eastAsia="Calibri" w:hAnsi="Calibri"/>
+          <w:rFonts w:ascii="Arial" w:cs="Arial" w:eastAsia="Arial" w:hAnsi="Arial"/>
         </w:rPr>
         <w:t xml:space="preserve">Se necesita suministro continuo de energía eléctrica.</w:t>
       </w:r>
@@ -3327,7 +3290,7 @@
       </w:pPr>
       <w:r>
         <w:rPr>
-          <w:rFonts w:ascii="Calibri" w:cs="Calibri" w:eastAsia="Calibri" w:hAnsi="Calibri"/>
+          <w:rFonts w:ascii="Arial" w:cs="Arial" w:eastAsia="Arial" w:hAnsi="Arial"/>
           <w:b/>
           <w:bCs/>
         </w:rPr>
@@ -3335,7 +3298,7 @@
       </w:r>
       <w:r>
         <w:rPr>
-          <w:rFonts w:ascii="Calibri" w:cs="Calibri" w:eastAsia="Calibri" w:hAnsi="Calibri"/>
+          <w:rFonts w:ascii="Arial" w:cs="Arial" w:eastAsia="Arial" w:hAnsi="Arial"/>
         </w:rPr>
         <w:t xml:space="preserve"> (calefacción, ventilación y aire acondicionado): controla temperatura, humedad y flujo de aire.</w:t>
       </w:r>
@@ -3351,7 +3314,7 @@
       </w:pPr>
       <w:r>
         <w:rPr>
-          <w:rFonts w:ascii="Calibri" w:cs="Calibri" w:eastAsia="Calibri" w:hAnsi="Calibri"/>
+          <w:rFonts w:ascii="Arial" w:cs="Arial" w:eastAsia="Arial" w:hAnsi="Arial"/>
         </w:rPr>
         <w:t xml:space="preserve">Se debe manejar junto con hardware, cableado, almacenamiento, protección contra incendios, seguridad física y alimentación.</w:t>
       </w:r>
@@ -3367,34 +3330,36 @@
       </w:pPr>
       <w:r>
         <w:rPr>
-          <w:rFonts w:ascii="Calibri" w:cs="Calibri" w:eastAsia="Calibri" w:hAnsi="Calibri"/>
+          <w:rFonts w:ascii="Arial" w:cs="Arial" w:eastAsia="Arial" w:hAnsi="Arial"/>
         </w:rPr>
         <w:t xml:space="preserve">Los requisitos ambientales están en las especificaciones del producto y las guías de planificación física.</w:t>
       </w:r>
     </w:p>
     <w:p>
       <w:pPr>
-        <w:pStyle w:val="Heading1"/>
         <w:pBdr>
-          <w:bottom w:val="single" w:color="1F4E79" w:sz="8" w:space="2"/>
+          <w:bottom w:val="single" w:color="000000" w:sz="8" w:space="2"/>
         </w:pBdr>
         <w:spacing w:after="120" w:before="280"/>
       </w:pPr>
       <w:r>
         <w:rPr>
-          <w:rFonts w:ascii="Calibri" w:cs="Calibri" w:eastAsia="Calibri" w:hAnsi="Calibri"/>
+          <w:rFonts w:ascii="Arial" w:cs="Arial" w:eastAsia="Arial" w:hAnsi="Arial"/>
+          <w:b/>
+          <w:bCs/>
         </w:rPr>
         <w:t xml:space="preserve">7. Sistemas embebidos y especializados</w:t>
       </w:r>
     </w:p>
     <w:p>
       <w:pPr>
-        <w:pStyle w:val="Heading3"/>
         <w:spacing w:after="80" w:before="160"/>
       </w:pPr>
       <w:r>
         <w:rPr>
-          <w:rFonts w:ascii="Calibri" w:cs="Calibri" w:eastAsia="Calibri" w:hAnsi="Calibri"/>
+          <w:rFonts w:ascii="Arial" w:cs="Arial" w:eastAsia="Arial" w:hAnsi="Arial"/>
+          <w:b/>
+          <w:bCs/>
         </w:rPr>
         <w:t xml:space="preserve">Infraestructuras críticas</w:t>
       </w:r>
@@ -3410,7 +3375,7 @@
       </w:pPr>
       <w:r>
         <w:rPr>
-          <w:rFonts w:ascii="Calibri" w:cs="Calibri" w:eastAsia="Calibri" w:hAnsi="Calibri"/>
+          <w:rFonts w:ascii="Arial" w:cs="Arial" w:eastAsia="Arial" w:hAnsi="Arial"/>
           <w:b/>
           <w:bCs/>
         </w:rPr>
@@ -3418,7 +3383,7 @@
       </w:r>
       <w:r>
         <w:rPr>
-          <w:rFonts w:ascii="Calibri" w:cs="Calibri" w:eastAsia="Calibri" w:hAnsi="Calibri"/>
+          <w:rFonts w:ascii="Arial" w:cs="Arial" w:eastAsia="Arial" w:hAnsi="Arial"/>
         </w:rPr>
         <w:t xml:space="preserve"> demostró que un ciberataque puede destruir o interrumpir infraestructura crítica.</w:t>
       </w:r>
@@ -3434,13 +3399,13 @@
       </w:pPr>
       <w:r>
         <w:rPr>
-          <w:rFonts w:ascii="Calibri" w:cs="Calibri" w:eastAsia="Calibri" w:hAnsi="Calibri"/>
+          <w:rFonts w:ascii="Arial" w:cs="Arial" w:eastAsia="Arial" w:hAnsi="Arial"/>
         </w:rPr>
         <w:t xml:space="preserve">Para evitar ataques, hay que </w:t>
       </w:r>
       <w:r>
         <w:rPr>
-          <w:rFonts w:ascii="Calibri" w:cs="Calibri" w:eastAsia="Calibri" w:hAnsi="Calibri"/>
+          <w:rFonts w:ascii="Arial" w:cs="Arial" w:eastAsia="Arial" w:hAnsi="Arial"/>
           <w:b/>
           <w:bCs/>
         </w:rPr>
@@ -3448,13 +3413,13 @@
       </w:r>
       <w:r>
         <w:rPr>
-          <w:rFonts w:ascii="Calibri" w:cs="Calibri" w:eastAsia="Calibri" w:hAnsi="Calibri"/>
+          <w:rFonts w:ascii="Arial" w:cs="Arial" w:eastAsia="Arial" w:hAnsi="Arial"/>
         </w:rPr>
         <w:t xml:space="preserve">, separando la red </w:t>
       </w:r>
       <w:r>
         <w:rPr>
-          <w:rFonts w:ascii="Calibri" w:cs="Calibri" w:eastAsia="Calibri" w:hAnsi="Calibri"/>
+          <w:rFonts w:ascii="Arial" w:cs="Arial" w:eastAsia="Arial" w:hAnsi="Arial"/>
           <w:b/>
           <w:bCs/>
         </w:rPr>
@@ -3462,19 +3427,20 @@
       </w:r>
       <w:r>
         <w:rPr>
-          <w:rFonts w:ascii="Calibri" w:cs="Calibri" w:eastAsia="Calibri" w:hAnsi="Calibri"/>
+          <w:rFonts w:ascii="Arial" w:cs="Arial" w:eastAsia="Arial" w:hAnsi="Arial"/>
         </w:rPr>
         <w:t xml:space="preserve"> de la LAN de la organización.</w:t>
       </w:r>
     </w:p>
     <w:p>
       <w:pPr>
-        <w:pStyle w:val="Heading3"/>
         <w:spacing w:after="80" w:before="160"/>
       </w:pPr>
       <w:r>
         <w:rPr>
-          <w:rFonts w:ascii="Calibri" w:cs="Calibri" w:eastAsia="Calibri" w:hAnsi="Calibri"/>
+          <w:rFonts w:ascii="Arial" w:cs="Arial" w:eastAsia="Arial" w:hAnsi="Arial"/>
+          <w:b/>
+          <w:bCs/>
         </w:rPr>
         <w:t xml:space="preserve">IoT</w:t>
       </w:r>
@@ -3490,7 +3456,7 @@
       </w:pPr>
       <w:r>
         <w:rPr>
-          <w:rFonts w:ascii="Calibri" w:cs="Calibri" w:eastAsia="Calibri" w:hAnsi="Calibri"/>
+          <w:rFonts w:ascii="Arial" w:cs="Arial" w:eastAsia="Arial" w:hAnsi="Arial"/>
         </w:rPr>
         <w:t xml:space="preserve">Es el conjunto de tecnologías que conectan varios dispositivos a Internet.</w:t>
       </w:r>
@@ -3506,13 +3472,13 @@
       </w:pPr>
       <w:r>
         <w:rPr>
-          <w:rFonts w:ascii="Calibri" w:cs="Calibri" w:eastAsia="Calibri" w:hAnsi="Calibri"/>
+          <w:rFonts w:ascii="Arial" w:cs="Arial" w:eastAsia="Arial" w:hAnsi="Arial"/>
         </w:rPr>
         <w:t xml:space="preserve">La mayoría se conecta por tecnología inalámbrica y usa </w:t>
       </w:r>
       <w:r>
         <w:rPr>
-          <w:rFonts w:ascii="Calibri" w:cs="Calibri" w:eastAsia="Calibri" w:hAnsi="Calibri"/>
+          <w:rFonts w:ascii="Arial" w:cs="Arial" w:eastAsia="Arial" w:hAnsi="Arial"/>
           <w:b/>
           <w:bCs/>
         </w:rPr>
@@ -3520,7 +3486,7 @@
       </w:r>
       <w:r>
         <w:rPr>
-          <w:rFonts w:ascii="Calibri" w:cs="Calibri" w:eastAsia="Calibri" w:hAnsi="Calibri"/>
+          <w:rFonts w:ascii="Arial" w:cs="Arial" w:eastAsia="Arial" w:hAnsi="Arial"/>
         </w:rPr>
         <w:t xml:space="preserve">.</w:t>
       </w:r>
@@ -3536,13 +3502,13 @@
       </w:pPr>
       <w:r>
         <w:rPr>
-          <w:rFonts w:ascii="Calibri" w:cs="Calibri" w:eastAsia="Calibri" w:hAnsi="Calibri"/>
+          <w:rFonts w:ascii="Arial" w:cs="Arial" w:eastAsia="Arial" w:hAnsi="Arial"/>
         </w:rPr>
         <w:t xml:space="preserve">La expansión de datos creó el </w:t>
       </w:r>
       <w:r>
         <w:rPr>
-          <w:rFonts w:ascii="Calibri" w:cs="Calibri" w:eastAsia="Calibri" w:hAnsi="Calibri"/>
+          <w:rFonts w:ascii="Arial" w:cs="Arial" w:eastAsia="Arial" w:hAnsi="Arial"/>
           <w:b/>
           <w:bCs/>
         </w:rPr>
@@ -3550,7 +3516,7 @@
       </w:r>
       <w:r>
         <w:rPr>
-          <w:rFonts w:ascii="Calibri" w:cs="Calibri" w:eastAsia="Calibri" w:hAnsi="Calibri"/>
+          <w:rFonts w:ascii="Arial" w:cs="Arial" w:eastAsia="Arial" w:hAnsi="Arial"/>
         </w:rPr>
         <w:t xml:space="preserve">.</w:t>
       </w:r>
@@ -3566,7 +3532,7 @@
       </w:pPr>
       <w:r>
         <w:rPr>
-          <w:rFonts w:ascii="Calibri" w:cs="Calibri" w:eastAsia="Calibri" w:hAnsi="Calibri"/>
+          <w:rFonts w:ascii="Arial" w:cs="Arial" w:eastAsia="Arial" w:hAnsi="Arial"/>
           <w:b/>
           <w:bCs/>
         </w:rPr>
@@ -3574,7 +3540,7 @@
       </w:r>
       <w:r>
         <w:rPr>
-          <w:rFonts w:ascii="Calibri" w:cs="Calibri" w:eastAsia="Calibri" w:hAnsi="Calibri"/>
+          <w:rFonts w:ascii="Arial" w:cs="Arial" w:eastAsia="Arial" w:hAnsi="Arial"/>
         </w:rPr>
         <w:t xml:space="preserve"> capturan, almacenan y acceden a datos.</w:t>
       </w:r>
@@ -3590,13 +3556,13 @@
       </w:pPr>
       <w:r>
         <w:rPr>
-          <w:rFonts w:ascii="Calibri" w:cs="Calibri" w:eastAsia="Calibri" w:hAnsi="Calibri"/>
+          <w:rFonts w:ascii="Arial" w:cs="Arial" w:eastAsia="Arial" w:hAnsi="Arial"/>
         </w:rPr>
         <w:t xml:space="preserve">Son susceptibles a </w:t>
       </w:r>
       <w:r>
         <w:rPr>
-          <w:rFonts w:ascii="Calibri" w:cs="Calibri" w:eastAsia="Calibri" w:hAnsi="Calibri"/>
+          <w:rFonts w:ascii="Arial" w:cs="Arial" w:eastAsia="Arial" w:hAnsi="Arial"/>
           <w:b/>
           <w:bCs/>
         </w:rPr>
@@ -3604,7 +3570,7 @@
       </w:r>
       <w:r>
         <w:rPr>
-          <w:rFonts w:ascii="Calibri" w:cs="Calibri" w:eastAsia="Calibri" w:hAnsi="Calibri"/>
+          <w:rFonts w:ascii="Arial" w:cs="Arial" w:eastAsia="Arial" w:hAnsi="Arial"/>
         </w:rPr>
         <w:t xml:space="preserve">: los atacantes descubren vulnerabilidades midiendo cuánto tarda el sistema en responder a distintas entradas.</w:t>
       </w:r>
@@ -3620,7 +3586,7 @@
       </w:pPr>
       <w:r>
         <w:rPr>
-          <w:rFonts w:ascii="Calibri" w:cs="Calibri" w:eastAsia="Calibri" w:hAnsi="Calibri"/>
+          <w:rFonts w:ascii="Arial" w:cs="Arial" w:eastAsia="Arial" w:hAnsi="Arial"/>
           <w:b/>
           <w:bCs/>
         </w:rPr>
@@ -3628,7 +3594,7 @@
       </w:r>
       <w:r>
         <w:rPr>
-          <w:rFonts w:ascii="Calibri" w:cs="Calibri" w:eastAsia="Calibri" w:hAnsi="Calibri"/>
+          <w:rFonts w:ascii="Arial" w:cs="Arial" w:eastAsia="Arial" w:hAnsi="Arial"/>
         </w:rPr>
         <w:t xml:space="preserve"> módulo de hardware de factor de forma pequeño (SFF). Ejemplos: Raspberry Pi y Arduino.</w:t>
       </w:r>
@@ -3644,13 +3610,13 @@
       </w:pPr>
       <w:r>
         <w:rPr>
-          <w:rFonts w:ascii="Calibri" w:cs="Calibri" w:eastAsia="Calibri" w:hAnsi="Calibri"/>
+          <w:rFonts w:ascii="Arial" w:cs="Arial" w:eastAsia="Arial" w:hAnsi="Arial"/>
         </w:rPr>
         <w:t xml:space="preserve">Estos dispositivos pueden implementarse con </w:t>
       </w:r>
       <w:r>
         <w:rPr>
-          <w:rFonts w:ascii="Calibri" w:cs="Calibri" w:eastAsia="Calibri" w:hAnsi="Calibri"/>
+          <w:rFonts w:ascii="Arial" w:cs="Arial" w:eastAsia="Arial" w:hAnsi="Arial"/>
           <w:b/>
           <w:bCs/>
         </w:rPr>
@@ -3658,7 +3624,7 @@
       </w:r>
       <w:r>
         <w:rPr>
-          <w:rFonts w:ascii="Calibri" w:cs="Calibri" w:eastAsia="Calibri" w:hAnsi="Calibri"/>
+          <w:rFonts w:ascii="Arial" w:cs="Arial" w:eastAsia="Arial" w:hAnsi="Arial"/>
         </w:rPr>
         <w:t xml:space="preserve">, un circuito integrado programable en campo.</w:t>
       </w:r>
@@ -3674,7 +3640,7 @@
       </w:pPr>
       <w:r>
         <w:rPr>
-          <w:rFonts w:ascii="Calibri" w:cs="Calibri" w:eastAsia="Calibri" w:hAnsi="Calibri"/>
+          <w:rFonts w:ascii="Arial" w:cs="Arial" w:eastAsia="Arial" w:hAnsi="Arial"/>
           <w:b/>
           <w:bCs/>
         </w:rPr>
@@ -3682,7 +3648,7 @@
       </w:r>
       <w:r>
         <w:rPr>
-          <w:rFonts w:ascii="Calibri" w:cs="Calibri" w:eastAsia="Calibri" w:hAnsi="Calibri"/>
+          <w:rFonts w:ascii="Arial" w:cs="Arial" w:eastAsia="Arial" w:hAnsi="Arial"/>
         </w:rPr>
         <w:t xml:space="preserve"> es un escáner de IoT. Con él es fácil saber si un dispositivo de domótica es vulnerable.</w:t>
       </w:r>
@@ -3698,19 +3664,20 @@
       </w:pPr>
       <w:r>
         <w:rPr>
-          <w:rFonts w:ascii="Calibri" w:cs="Calibri" w:eastAsia="Calibri" w:hAnsi="Calibri"/>
+          <w:rFonts w:ascii="Arial" w:cs="Arial" w:eastAsia="Arial" w:hAnsi="Arial"/>
         </w:rPr>
         <w:t xml:space="preserve">Comunicación del IoT: corto, mediano o largo alcance, celular (4G, 5G) o radio.</w:t>
       </w:r>
     </w:p>
     <w:p>
       <w:pPr>
-        <w:pStyle w:val="Heading3"/>
         <w:spacing w:after="80" w:before="160"/>
       </w:pPr>
       <w:r>
         <w:rPr>
-          <w:rFonts w:ascii="Calibri" w:cs="Calibri" w:eastAsia="Calibri" w:hAnsi="Calibri"/>
+          <w:rFonts w:ascii="Arial" w:cs="Arial" w:eastAsia="Arial" w:hAnsi="Arial"/>
+          <w:b/>
+          <w:bCs/>
         </w:rPr>
         <w:t xml:space="preserve">VoIP</w:t>
       </w:r>
@@ -3726,7 +3693,7 @@
       </w:pPr>
       <w:r>
         <w:rPr>
-          <w:rFonts w:ascii="Calibri" w:cs="Calibri" w:eastAsia="Calibri" w:hAnsi="Calibri"/>
+          <w:rFonts w:ascii="Arial" w:cs="Arial" w:eastAsia="Arial" w:hAnsi="Arial"/>
         </w:rPr>
         <w:t xml:space="preserve">Necesita conexión a Internet y teléfono.</w:t>
       </w:r>
@@ -3742,7 +3709,7 @@
       </w:pPr>
       <w:r>
         <w:rPr>
-          <w:rFonts w:ascii="Calibri" w:cs="Calibri" w:eastAsia="Calibri" w:hAnsi="Calibri"/>
+          <w:rFonts w:ascii="Arial" w:cs="Arial" w:eastAsia="Arial" w:hAnsi="Arial"/>
         </w:rPr>
         <w:t xml:space="preserve">Es tan confiable como la seguridad de la red subyacente.</w:t>
       </w:r>
@@ -3758,13 +3725,13 @@
       </w:pPr>
       <w:r>
         <w:rPr>
-          <w:rFonts w:ascii="Calibri" w:cs="Calibri" w:eastAsia="Calibri" w:hAnsi="Calibri"/>
+          <w:rFonts w:ascii="Arial" w:cs="Arial" w:eastAsia="Arial" w:hAnsi="Arial"/>
         </w:rPr>
         <w:t xml:space="preserve">Dos medidas: </w:t>
       </w:r>
       <w:r>
         <w:rPr>
-          <w:rFonts w:ascii="Calibri" w:cs="Calibri" w:eastAsia="Calibri" w:hAnsi="Calibri"/>
+          <w:rFonts w:ascii="Arial" w:cs="Arial" w:eastAsia="Arial" w:hAnsi="Arial"/>
           <w:b/>
           <w:bCs/>
         </w:rPr>
@@ -3772,13 +3739,13 @@
       </w:r>
       <w:r>
         <w:rPr>
-          <w:rFonts w:ascii="Calibri" w:cs="Calibri" w:eastAsia="Calibri" w:hAnsi="Calibri"/>
+          <w:rFonts w:ascii="Arial" w:cs="Arial" w:eastAsia="Arial" w:hAnsi="Arial"/>
         </w:rPr>
         <w:t xml:space="preserve"> contra escuchas y usar </w:t>
       </w:r>
       <w:r>
         <w:rPr>
-          <w:rFonts w:ascii="Calibri" w:cs="Calibri" w:eastAsia="Calibri" w:hAnsi="Calibri"/>
+          <w:rFonts w:ascii="Arial" w:cs="Arial" w:eastAsia="Arial" w:hAnsi="Arial"/>
           <w:b/>
           <w:bCs/>
         </w:rPr>
@@ -3786,19 +3753,20 @@
       </w:r>
       <w:r>
         <w:rPr>
-          <w:rFonts w:ascii="Calibri" w:cs="Calibri" w:eastAsia="Calibri" w:hAnsi="Calibri"/>
+          <w:rFonts w:ascii="Arial" w:cs="Arial" w:eastAsia="Arial" w:hAnsi="Arial"/>
         </w:rPr>
         <w:t xml:space="preserve"> para proteger gateways y switches.</w:t>
       </w:r>
     </w:p>
     <w:p>
       <w:pPr>
-        <w:pStyle w:val="Heading3"/>
         <w:spacing w:after="80" w:before="160"/>
       </w:pPr>
       <w:r>
         <w:rPr>
-          <w:rFonts w:ascii="Calibri" w:cs="Calibri" w:eastAsia="Calibri" w:hAnsi="Calibri"/>
+          <w:rFonts w:ascii="Arial" w:cs="Arial" w:eastAsia="Arial" w:hAnsi="Arial"/>
+          <w:b/>
+          <w:bCs/>
         </w:rPr>
         <w:t xml:space="preserve">Dispositivos médicos</w:t>
       </w:r>
@@ -3814,7 +3782,7 @@
       </w:pPr>
       <w:r>
         <w:rPr>
-          <w:rFonts w:ascii="Calibri" w:cs="Calibri" w:eastAsia="Calibri" w:hAnsi="Calibri"/>
+          <w:rFonts w:ascii="Arial" w:cs="Arial" w:eastAsia="Arial" w:hAnsi="Arial"/>
         </w:rPr>
         <w:t xml:space="preserve">Ejemplos: marcapasos, bombas de insulina, implantes médicos y desfibriladores con conectividad inalámbrica, monitoreo remoto y NFC.</w:t>
       </w:r>
@@ -3830,19 +3798,20 @@
       </w:pPr>
       <w:r>
         <w:rPr>
-          <w:rFonts w:ascii="Calibri" w:cs="Calibri" w:eastAsia="Calibri" w:hAnsi="Calibri"/>
+          <w:rFonts w:ascii="Arial" w:cs="Arial" w:eastAsia="Arial" w:hAnsi="Arial"/>
         </w:rPr>
         <w:t xml:space="preserve">Sus vulnerabilidades pueden generar problemas de seguridad para pacientes, filtración de historiales médicos o acceso a la red por ciberdelincuentes.</w:t>
       </w:r>
     </w:p>
     <w:p>
       <w:pPr>
-        <w:pStyle w:val="Heading3"/>
         <w:spacing w:after="80" w:before="160"/>
       </w:pPr>
       <w:r>
         <w:rPr>
-          <w:rFonts w:ascii="Calibri" w:cs="Calibri" w:eastAsia="Calibri" w:hAnsi="Calibri"/>
+          <w:rFonts w:ascii="Arial" w:cs="Arial" w:eastAsia="Arial" w:hAnsi="Arial"/>
+          <w:b/>
+          <w:bCs/>
         </w:rPr>
         <w:t xml:space="preserve">Vehículos</w:t>
       </w:r>
@@ -3858,7 +3827,7 @@
       </w:pPr>
       <w:r>
         <w:rPr>
-          <w:rFonts w:ascii="Calibri" w:cs="Calibri" w:eastAsia="Calibri" w:hAnsi="Calibri"/>
+          <w:rFonts w:ascii="Arial" w:cs="Arial" w:eastAsia="Arial" w:hAnsi="Arial"/>
         </w:rPr>
         <w:t xml:space="preserve">Los sistemas a bordo guardan los datos para su funcionamiento, el mantenimiento, la protección y la transmisión de contactos de emergencia.</w:t>
       </w:r>
@@ -3874,7 +3843,7 @@
       </w:pPr>
       <w:r>
         <w:rPr>
-          <w:rFonts w:ascii="Calibri" w:cs="Calibri" w:eastAsia="Calibri" w:hAnsi="Calibri"/>
+          <w:rFonts w:ascii="Arial" w:cs="Arial" w:eastAsia="Arial" w:hAnsi="Arial"/>
         </w:rPr>
         <w:t xml:space="preserve">La interfaz inalámbrica se conecta a Internet y a una interfaz de diagnóstico a bordo.</w:t>
       </w:r>
@@ -3890,13 +3859,13 @@
       </w:pPr>
       <w:r>
         <w:rPr>
-          <w:rFonts w:ascii="Calibri" w:cs="Calibri" w:eastAsia="Calibri" w:hAnsi="Calibri"/>
+          <w:rFonts w:ascii="Arial" w:cs="Arial" w:eastAsia="Arial" w:hAnsi="Arial"/>
         </w:rPr>
         <w:t xml:space="preserve">Defensa: </w:t>
       </w:r>
       <w:r>
         <w:rPr>
-          <w:rFonts w:ascii="Calibri" w:cs="Calibri" w:eastAsia="Calibri" w:hAnsi="Calibri"/>
+          <w:rFonts w:ascii="Arial" w:cs="Arial" w:eastAsia="Arial" w:hAnsi="Arial"/>
           <w:b/>
           <w:bCs/>
         </w:rPr>
@@ -3904,19 +3873,20 @@
       </w:r>
       <w:r>
         <w:rPr>
-          <w:rFonts w:ascii="Calibri" w:cs="Calibri" w:eastAsia="Calibri" w:hAnsi="Calibri"/>
+          <w:rFonts w:ascii="Arial" w:cs="Arial" w:eastAsia="Arial" w:hAnsi="Arial"/>
         </w:rPr>
         <w:t xml:space="preserve"> entre controladores y usar firewall.</w:t>
       </w:r>
     </w:p>
     <w:p>
       <w:pPr>
-        <w:pStyle w:val="Heading3"/>
         <w:spacing w:after="80" w:before="160"/>
       </w:pPr>
       <w:r>
         <w:rPr>
-          <w:rFonts w:ascii="Calibri" w:cs="Calibri" w:eastAsia="Calibri" w:hAnsi="Calibri"/>
+          <w:rFonts w:ascii="Arial" w:cs="Arial" w:eastAsia="Arial" w:hAnsi="Arial"/>
+          <w:b/>
+          <w:bCs/>
         </w:rPr>
         <w:t xml:space="preserve">Aviones</w:t>
       </w:r>
@@ -3932,7 +3902,7 @@
       </w:pPr>
       <w:r>
         <w:rPr>
-          <w:rFonts w:ascii="Calibri" w:cs="Calibri" w:eastAsia="Calibri" w:hAnsi="Calibri"/>
+          <w:rFonts w:ascii="Arial" w:cs="Arial" w:eastAsia="Arial" w:hAnsi="Arial"/>
         </w:rPr>
         <w:t xml:space="preserve">Tienen muchos sistemas de control embebidos, como el de vuelo y el de comunicación.</w:t>
       </w:r>
@@ -3948,19 +3918,20 @@
       </w:pPr>
       <w:r>
         <w:rPr>
-          <w:rFonts w:ascii="Calibri" w:cs="Calibri" w:eastAsia="Calibri" w:hAnsi="Calibri"/>
+          <w:rFonts w:ascii="Arial" w:cs="Arial" w:eastAsia="Arial" w:hAnsi="Arial"/>
         </w:rPr>
         <w:t xml:space="preserve">Problemas: credenciales de inicio de sesión codificadas (hardcoded), protocolos inseguros y puertas traseras.</w:t>
       </w:r>
     </w:p>
     <w:p>
       <w:pPr>
-        <w:pStyle w:val="Heading3"/>
         <w:spacing w:after="80" w:before="160"/>
       </w:pPr>
       <w:r>
         <w:rPr>
-          <w:rFonts w:ascii="Calibri" w:cs="Calibri" w:eastAsia="Calibri" w:hAnsi="Calibri"/>
+          <w:rFonts w:ascii="Arial" w:cs="Arial" w:eastAsia="Arial" w:hAnsi="Arial"/>
+          <w:b/>
+          <w:bCs/>
         </w:rPr>
         <w:t xml:space="preserve">Drones (UAV)</w:t>
       </w:r>
@@ -3976,7 +3947,7 @@
       </w:pPr>
       <w:r>
         <w:rPr>
-          <w:rFonts w:ascii="Calibri" w:cs="Calibri" w:eastAsia="Calibri" w:hAnsi="Calibri"/>
+          <w:rFonts w:ascii="Arial" w:cs="Arial" w:eastAsia="Arial" w:hAnsi="Arial"/>
         </w:rPr>
         <w:t xml:space="preserve">Se usan en aplicaciones militares, agrícolas y cartográficas, y en fotografía aérea, vigilancia y topografía.</w:t>
       </w:r>
@@ -3992,19 +3963,20 @@
       </w:pPr>
       <w:r>
         <w:rPr>
-          <w:rFonts w:ascii="Calibri" w:cs="Calibri" w:eastAsia="Calibri" w:hAnsi="Calibri"/>
+          <w:rFonts w:ascii="Arial" w:cs="Arial" w:eastAsia="Arial" w:hAnsi="Arial"/>
         </w:rPr>
         <w:t xml:space="preserve">Son susceptibles a secuestro, ataques de WiFi, suplantación de GPS, interferencias y ataques de desautenticación.</w:t>
       </w:r>
     </w:p>
     <w:p>
       <w:pPr>
-        <w:pStyle w:val="Heading3"/>
         <w:spacing w:after="80" w:before="160"/>
       </w:pPr>
       <w:r>
         <w:rPr>
-          <w:rFonts w:ascii="Calibri" w:cs="Calibri" w:eastAsia="Calibri" w:hAnsi="Calibri"/>
+          <w:rFonts w:ascii="Arial" w:cs="Arial" w:eastAsia="Arial" w:hAnsi="Arial"/>
+          <w:b/>
+          <w:bCs/>
         </w:rPr>
         <w:t xml:space="preserve">Tecnologías de engaño</w:t>
       </w:r>
@@ -4020,7 +3992,7 @@
       </w:pPr>
       <w:r>
         <w:rPr>
-          <w:rFonts w:ascii="Calibri" w:cs="Calibri" w:eastAsia="Calibri" w:hAnsi="Calibri"/>
+          <w:rFonts w:ascii="Arial" w:cs="Arial" w:eastAsia="Arial" w:hAnsi="Arial"/>
         </w:rPr>
         <w:t xml:space="preserve">Sirven para distraer a los atacantes de las redes de producción y para conocer sus métodos.</w:t>
       </w:r>
@@ -4036,7 +4008,7 @@
       </w:pPr>
       <w:r>
         <w:rPr>
-          <w:rFonts w:ascii="Calibri" w:cs="Calibri" w:eastAsia="Calibri" w:hAnsi="Calibri"/>
+          <w:rFonts w:ascii="Arial" w:cs="Arial" w:eastAsia="Arial" w:hAnsi="Arial"/>
         </w:rPr>
         <w:t xml:space="preserve">Agregan una capa falsa a la infraestructura.</w:t>
       </w:r>
@@ -4052,7 +4024,7 @@
       </w:pPr>
       <w:r>
         <w:rPr>
-          <w:rFonts w:ascii="Calibri" w:cs="Calibri" w:eastAsia="Calibri" w:hAnsi="Calibri"/>
+          <w:rFonts w:ascii="Arial" w:cs="Arial" w:eastAsia="Arial" w:hAnsi="Arial"/>
           <w:b/>
           <w:bCs/>
         </w:rPr>
@@ -4060,7 +4032,7 @@
       </w:r>
       <w:r>
         <w:rPr>
-          <w:rFonts w:ascii="Calibri" w:cs="Calibri" w:eastAsia="Calibri" w:hAnsi="Calibri"/>
+          <w:rFonts w:ascii="Arial" w:cs="Arial" w:eastAsia="Arial" w:hAnsi="Arial"/>
         </w:rPr>
         <w:t xml:space="preserve"> sistema señuelo que imita un servidor de la red. Se deja expuesto a propósito. Cuando el atacante lo persigue, sus actividades se registran y monitorean para revisarlas después.</w:t>
       </w:r>
@@ -4076,7 +4048,7 @@
       </w:pPr>
       <w:r>
         <w:rPr>
-          <w:rFonts w:ascii="Calibri" w:cs="Calibri" w:eastAsia="Calibri" w:hAnsi="Calibri"/>
+          <w:rFonts w:ascii="Arial" w:cs="Arial" w:eastAsia="Arial" w:hAnsi="Arial"/>
           <w:b/>
           <w:bCs/>
         </w:rPr>
@@ -4084,7 +4056,7 @@
       </w:r>
       <w:r>
         <w:rPr>
-          <w:rFonts w:ascii="Calibri" w:cs="Calibri" w:eastAsia="Calibri" w:hAnsi="Calibri"/>
+          <w:rFonts w:ascii="Arial" w:cs="Arial" w:eastAsia="Arial" w:hAnsi="Arial"/>
         </w:rPr>
         <w:t xml:space="preserve"> una colección de honeypots.</w:t>
       </w:r>
@@ -4100,7 +4072,7 @@
       </w:pPr>
       <w:r>
         <w:rPr>
-          <w:rFonts w:ascii="Calibri" w:cs="Calibri" w:eastAsia="Calibri" w:hAnsi="Calibri"/>
+          <w:rFonts w:ascii="Arial" w:cs="Arial" w:eastAsia="Arial" w:hAnsi="Arial"/>
           <w:b/>
           <w:bCs/>
         </w:rPr>
@@ -4108,7 +4080,7 @@
       </w:r>
       <w:r>
         <w:rPr>
-          <w:rFonts w:ascii="Calibri" w:cs="Calibri" w:eastAsia="Calibri" w:hAnsi="Calibri"/>
+          <w:rFonts w:ascii="Arial" w:cs="Arial" w:eastAsia="Arial" w:hAnsi="Arial"/>
         </w:rPr>
         <w:t xml:space="preserve"> impide la resolución de nombres de host de URL específicas y aleja a los usuarios de recursos maliciosos.</w:t>
       </w:r>
@@ -4328,9 +4300,9 @@
   <w:docDefaults>
     <w:rPrDefault>
       <w:rPr>
-        <w:rFonts w:ascii="Calibri" w:cs="Calibri" w:eastAsia="Calibri" w:hAnsi="Calibri"/>
-        <w:sz w:val="22"/>
-        <w:szCs w:val="22"/>
+        <w:rFonts w:ascii="Arial" w:cs="Arial" w:eastAsia="Arial" w:hAnsi="Arial"/>
+        <w:sz w:val="24"/>
+        <w:szCs w:val="24"/>
       </w:rPr>
     </w:rPrDefault>
     <w:pPrDefault/>
@@ -4515,12 +4487,12 @@
       <w:outlineLvl w:val="0"/>
     </w:pPr>
     <w:rPr>
-      <w:rFonts w:ascii="Calibri" w:cs="Calibri" w:eastAsia="Calibri" w:hAnsi="Calibri"/>
+      <w:rFonts w:ascii="Arial" w:cs="Arial" w:eastAsia="Arial" w:hAnsi="Arial"/>
       <w:b/>
       <w:bCs/>
-      <w:color w:val="1F4E79"/>
-      <w:sz w:val="30"/>
-      <w:szCs w:val="30"/>
+      <w:color w:val="000000"/>
+      <w:sz w:val="24"/>
+      <w:szCs w:val="24"/>
     </w:rPr>
   </w:style>
   <w:style w:type="paragraph" w:styleId="Heading3">
@@ -4532,10 +4504,10 @@
       <w:outlineLvl w:val="2"/>
     </w:pPr>
     <w:rPr>
-      <w:rFonts w:ascii="Calibri" w:cs="Calibri" w:eastAsia="Calibri" w:hAnsi="Calibri"/>
+      <w:rFonts w:ascii="Arial" w:cs="Arial" w:eastAsia="Arial" w:hAnsi="Arial"/>
       <w:b/>
       <w:bCs/>
-      <w:color w:val="2E75B6"/>
+      <w:color w:val="000000"/>
       <w:sz w:val="24"/>
       <w:szCs w:val="24"/>
     </w:rPr>

</xml_diff>

<commit_message>
Resúmenes en Calibri y sin líneas bajo los títulos
Co-Authored-By: Claude Sonnet 5.5 <noreply@anthropic.com>
Claude-Session: https://claude.ai/code/session_013iWwbBbHxw2c1QtKDe5PjZ
</commit_message>
<xml_diff>
--- a/Modulo12_Resumen.docx
+++ b/Modulo12_Resumen.docx
@@ -9,7 +9,7 @@
       </w:pPr>
       <w:r>
         <w:rPr>
-          <w:rFonts w:ascii="Arial" w:cs="Arial" w:eastAsia="Arial" w:hAnsi="Arial"/>
+          <w:rFonts w:ascii="Calibri" w:cs="Calibri" w:eastAsia="Calibri" w:hAnsi="Calibri"/>
           <w:b/>
           <w:bCs/>
           <w:color w:val="000000"/>
@@ -26,7 +26,7 @@
       </w:pPr>
       <w:r>
         <w:rPr>
-          <w:rFonts w:ascii="Arial" w:cs="Arial" w:eastAsia="Arial" w:hAnsi="Arial"/>
+          <w:rFonts w:ascii="Calibri" w:cs="Calibri" w:eastAsia="Calibri" w:hAnsi="Calibri"/>
           <w:color w:val="000000"/>
           <w:sz w:val="24"/>
           <w:szCs w:val="24"/>
@@ -36,14 +36,11 @@
     </w:p>
     <w:p>
       <w:pPr>
-        <w:pBdr>
-          <w:bottom w:val="single" w:color="000000" w:sz="8" w:space="2"/>
-        </w:pBdr>
         <w:spacing w:after="120" w:before="280"/>
       </w:pPr>
       <w:r>
         <w:rPr>
-          <w:rFonts w:ascii="Arial" w:cs="Arial" w:eastAsia="Arial" w:hAnsi="Arial"/>
+          <w:rFonts w:ascii="Calibri" w:cs="Calibri" w:eastAsia="Calibri" w:hAnsi="Calibri"/>
           <w:b/>
           <w:bCs/>
         </w:rPr>
@@ -61,13 +58,13 @@
       </w:pPr>
       <w:r>
         <w:rPr>
-          <w:rFonts w:ascii="Arial" w:cs="Arial" w:eastAsia="Arial" w:hAnsi="Arial"/>
+          <w:rFonts w:ascii="Calibri" w:cs="Calibri" w:eastAsia="Calibri" w:hAnsi="Calibri"/>
         </w:rPr>
         <w:t xml:space="preserve">Lo más común para proteger el acceso físico son las </w:t>
       </w:r>
       <w:r>
         <w:rPr>
-          <w:rFonts w:ascii="Arial" w:cs="Arial" w:eastAsia="Arial" w:hAnsi="Arial"/>
+          <w:rFonts w:ascii="Calibri" w:cs="Calibri" w:eastAsia="Calibri" w:hAnsi="Calibri"/>
           <w:b/>
           <w:bCs/>
         </w:rPr>
@@ -75,7 +72,7 @@
       </w:r>
       <w:r>
         <w:rPr>
-          <w:rFonts w:ascii="Arial" w:cs="Arial" w:eastAsia="Arial" w:hAnsi="Arial"/>
+          <w:rFonts w:ascii="Calibri" w:cs="Calibri" w:eastAsia="Calibri" w:hAnsi="Calibri"/>
         </w:rPr>
         <w:t xml:space="preserve">.</w:t>
       </w:r>
@@ -91,7 +88,7 @@
       </w:pPr>
       <w:r>
         <w:rPr>
-          <w:rFonts w:ascii="Arial" w:cs="Arial" w:eastAsia="Arial" w:hAnsi="Arial"/>
+          <w:rFonts w:ascii="Calibri" w:cs="Calibri" w:eastAsia="Calibri" w:hAnsi="Calibri"/>
           <w:b/>
           <w:bCs/>
         </w:rPr>
@@ -99,7 +96,7 @@
       </w:r>
       <w:r>
         <w:rPr>
-          <w:rFonts w:ascii="Arial" w:cs="Arial" w:eastAsia="Arial" w:hAnsi="Arial"/>
+          <w:rFonts w:ascii="Calibri" w:cs="Calibri" w:eastAsia="Calibri" w:hAnsi="Calibri"/>
         </w:rPr>
         <w:t xml:space="preserve"> características fisiológicas o de comportamiento de la persona. Se usa rostro, huellas, geometría de la mano, iris, retina, firma y voz.</w:t>
       </w:r>
@@ -115,13 +112,13 @@
       </w:pPr>
       <w:r>
         <w:rPr>
-          <w:rFonts w:ascii="Arial" w:cs="Arial" w:eastAsia="Arial" w:hAnsi="Arial"/>
+          <w:rFonts w:ascii="Calibri" w:cs="Calibri" w:eastAsia="Calibri" w:hAnsi="Calibri"/>
         </w:rPr>
         <w:t xml:space="preserve">La precisión de la biometría se mide con el </w:t>
       </w:r>
       <w:r>
         <w:rPr>
-          <w:rFonts w:ascii="Arial" w:cs="Arial" w:eastAsia="Arial" w:hAnsi="Arial"/>
+          <w:rFonts w:ascii="Calibri" w:cs="Calibri" w:eastAsia="Calibri" w:hAnsi="Calibri"/>
           <w:b/>
           <w:bCs/>
         </w:rPr>
@@ -129,7 +126,7 @@
       </w:r>
       <w:r>
         <w:rPr>
-          <w:rFonts w:ascii="Arial" w:cs="Arial" w:eastAsia="Arial" w:hAnsi="Arial"/>
+          <w:rFonts w:ascii="Calibri" w:cs="Calibri" w:eastAsia="Calibri" w:hAnsi="Calibri"/>
         </w:rPr>
         <w:t xml:space="preserve">, el índice de error de conexión cruzada. Es el método más usado.</w:t>
       </w:r>
@@ -145,7 +142,7 @@
       </w:pPr>
       <w:r>
         <w:rPr>
-          <w:rFonts w:ascii="Arial" w:cs="Arial" w:eastAsia="Arial" w:hAnsi="Arial"/>
+          <w:rFonts w:ascii="Calibri" w:cs="Calibri" w:eastAsia="Calibri" w:hAnsi="Calibri"/>
           <w:b/>
           <w:bCs/>
         </w:rPr>
@@ -153,7 +150,7 @@
       </w:r>
       <w:r>
         <w:rPr>
-          <w:rFonts w:ascii="Arial" w:cs="Arial" w:eastAsia="Arial" w:hAnsi="Arial"/>
+          <w:rFonts w:ascii="Calibri" w:cs="Calibri" w:eastAsia="Calibri" w:hAnsi="Calibri"/>
         </w:rPr>
         <w:t xml:space="preserve"> deja entrar a áreas con puntos de ingreso automatizados.</w:t>
       </w:r>
@@ -169,7 +166,7 @@
       </w:pPr>
       <w:r>
         <w:rPr>
-          <w:rFonts w:ascii="Arial" w:cs="Arial" w:eastAsia="Arial" w:hAnsi="Arial"/>
+          <w:rFonts w:ascii="Calibri" w:cs="Calibri" w:eastAsia="Calibri" w:hAnsi="Calibri"/>
           <w:b/>
           <w:bCs/>
         </w:rPr>
@@ -177,13 +174,13 @@
       </w:r>
       <w:r>
         <w:rPr>
-          <w:rFonts w:ascii="Arial" w:cs="Arial" w:eastAsia="Arial" w:hAnsi="Arial"/>
+          <w:rFonts w:ascii="Calibri" w:cs="Calibri" w:eastAsia="Calibri" w:hAnsi="Calibri"/>
         </w:rPr>
         <w:t xml:space="preserve"> dan respuesta instantánea y adecuada. La </w:t>
       </w:r>
       <w:r>
         <w:rPr>
-          <w:rFonts w:ascii="Arial" w:cs="Arial" w:eastAsia="Arial" w:hAnsi="Arial"/>
+          <w:rFonts w:ascii="Calibri" w:cs="Calibri" w:eastAsia="Calibri" w:hAnsi="Calibri"/>
           <w:b/>
           <w:bCs/>
         </w:rPr>
@@ -191,7 +188,7 @@
       </w:r>
       <w:r>
         <w:rPr>
-          <w:rFonts w:ascii="Arial" w:cs="Arial" w:eastAsia="Arial" w:hAnsi="Arial"/>
+          <w:rFonts w:ascii="Calibri" w:cs="Calibri" w:eastAsia="Calibri" w:hAnsi="Calibri"/>
         </w:rPr>
         <w:t xml:space="preserve"> y la vigilancia electrónica los complementan o, a veces, los reemplazan.</w:t>
       </w:r>
@@ -207,7 +204,7 @@
       </w:pPr>
       <w:r>
         <w:rPr>
-          <w:rFonts w:ascii="Arial" w:cs="Arial" w:eastAsia="Arial" w:hAnsi="Arial"/>
+          <w:rFonts w:ascii="Calibri" w:cs="Calibri" w:eastAsia="Calibri" w:hAnsi="Calibri"/>
           <w:b/>
           <w:bCs/>
         </w:rPr>
@@ -215,13 +212,13 @@
       </w:r>
       <w:r>
         <w:rPr>
-          <w:rFonts w:ascii="Arial" w:cs="Arial" w:eastAsia="Arial" w:hAnsi="Arial"/>
+          <w:rFonts w:ascii="Calibri" w:cs="Calibri" w:eastAsia="Calibri" w:hAnsi="Calibri"/>
         </w:rPr>
         <w:t xml:space="preserve"> rastrean cualquier activo que salga de una zona segura. Los sistemas nuevos leen </w:t>
       </w:r>
       <w:r>
         <w:rPr>
-          <w:rFonts w:ascii="Arial" w:cs="Arial" w:eastAsia="Arial" w:hAnsi="Arial"/>
+          <w:rFonts w:ascii="Calibri" w:cs="Calibri" w:eastAsia="Calibri" w:hAnsi="Calibri"/>
           <w:b/>
           <w:bCs/>
         </w:rPr>
@@ -229,21 +226,18 @@
       </w:r>
       <w:r>
         <w:rPr>
-          <w:rFonts w:ascii="Arial" w:cs="Arial" w:eastAsia="Arial" w:hAnsi="Arial"/>
+          <w:rFonts w:ascii="Calibri" w:cs="Calibri" w:eastAsia="Calibri" w:hAnsi="Calibri"/>
         </w:rPr>
         <w:t xml:space="preserve">.</w:t>
       </w:r>
     </w:p>
     <w:p>
       <w:pPr>
-        <w:pBdr>
-          <w:bottom w:val="single" w:color="000000" w:sz="8" w:space="2"/>
-        </w:pBdr>
         <w:spacing w:after="120" w:before="280"/>
       </w:pPr>
       <w:r>
         <w:rPr>
-          <w:rFonts w:ascii="Arial" w:cs="Arial" w:eastAsia="Arial" w:hAnsi="Arial"/>
+          <w:rFonts w:ascii="Calibri" w:cs="Calibri" w:eastAsia="Calibri" w:hAnsi="Calibri"/>
           <w:b/>
           <w:bCs/>
         </w:rPr>
@@ -256,7 +250,7 @@
       </w:pPr>
       <w:r>
         <w:rPr>
-          <w:rFonts w:ascii="Arial" w:cs="Arial" w:eastAsia="Arial" w:hAnsi="Arial"/>
+          <w:rFonts w:ascii="Calibri" w:cs="Calibri" w:eastAsia="Calibri" w:hAnsi="Calibri"/>
           <w:b/>
           <w:bCs/>
         </w:rPr>
@@ -274,7 +268,7 @@
       </w:pPr>
       <w:r>
         <w:rPr>
-          <w:rFonts w:ascii="Arial" w:cs="Arial" w:eastAsia="Arial" w:hAnsi="Arial"/>
+          <w:rFonts w:ascii="Calibri" w:cs="Calibri" w:eastAsia="Calibri" w:hAnsi="Calibri"/>
         </w:rPr>
         <w:t xml:space="preserve">Desarrollo y prueba</w:t>
       </w:r>
@@ -290,7 +284,7 @@
       </w:pPr>
       <w:r>
         <w:rPr>
-          <w:rFonts w:ascii="Arial" w:cs="Arial" w:eastAsia="Arial" w:hAnsi="Arial"/>
+          <w:rFonts w:ascii="Calibri" w:cs="Calibri" w:eastAsia="Calibri" w:hAnsi="Calibri"/>
         </w:rPr>
         <w:t xml:space="preserve">Preparación y producción</w:t>
       </w:r>
@@ -306,7 +300,7 @@
       </w:pPr>
       <w:r>
         <w:rPr>
-          <w:rFonts w:ascii="Arial" w:cs="Arial" w:eastAsia="Arial" w:hAnsi="Arial"/>
+          <w:rFonts w:ascii="Calibri" w:cs="Calibri" w:eastAsia="Calibri" w:hAnsi="Calibri"/>
         </w:rPr>
         <w:t xml:space="preserve">Aprovisionamiento y desaprovisionamiento</w:t>
       </w:r>
@@ -317,7 +311,7 @@
       </w:pPr>
       <w:r>
         <w:rPr>
-          <w:rFonts w:ascii="Arial" w:cs="Arial" w:eastAsia="Arial" w:hAnsi="Arial"/>
+          <w:rFonts w:ascii="Calibri" w:cs="Calibri" w:eastAsia="Calibri" w:hAnsi="Calibri"/>
           <w:b/>
           <w:bCs/>
         </w:rPr>
@@ -335,7 +329,7 @@
       </w:pPr>
       <w:r>
         <w:rPr>
-          <w:rFonts w:ascii="Arial" w:cs="Arial" w:eastAsia="Arial" w:hAnsi="Arial"/>
+          <w:rFonts w:ascii="Calibri" w:cs="Calibri" w:eastAsia="Calibri" w:hAnsi="Calibri"/>
         </w:rPr>
         <w:t xml:space="preserve">Normalización</w:t>
       </w:r>
@@ -351,7 +345,7 @@
       </w:pPr>
       <w:r>
         <w:rPr>
-          <w:rFonts w:ascii="Arial" w:cs="Arial" w:eastAsia="Arial" w:hAnsi="Arial"/>
+          <w:rFonts w:ascii="Calibri" w:cs="Calibri" w:eastAsia="Calibri" w:hAnsi="Calibri"/>
         </w:rPr>
         <w:t xml:space="preserve">Stored procedure</w:t>
       </w:r>
@@ -367,7 +361,7 @@
       </w:pPr>
       <w:r>
         <w:rPr>
-          <w:rFonts w:ascii="Arial" w:cs="Arial" w:eastAsia="Arial" w:hAnsi="Arial"/>
+          <w:rFonts w:ascii="Calibri" w:cs="Calibri" w:eastAsia="Calibri" w:hAnsi="Calibri"/>
         </w:rPr>
         <w:t xml:space="preserve">Ofuscación y camuflaje</w:t>
       </w:r>
@@ -383,7 +377,7 @@
       </w:pPr>
       <w:r>
         <w:rPr>
-          <w:rFonts w:ascii="Arial" w:cs="Arial" w:eastAsia="Arial" w:hAnsi="Arial"/>
+          <w:rFonts w:ascii="Calibri" w:cs="Calibri" w:eastAsia="Calibri" w:hAnsi="Calibri"/>
         </w:rPr>
         <w:t xml:space="preserve">Reutilización de código y SDK</w:t>
       </w:r>
@@ -394,7 +388,7 @@
       </w:pPr>
       <w:r>
         <w:rPr>
-          <w:rFonts w:ascii="Arial" w:cs="Arial" w:eastAsia="Arial" w:hAnsi="Arial"/>
+          <w:rFonts w:ascii="Calibri" w:cs="Calibri" w:eastAsia="Calibri" w:hAnsi="Calibri"/>
           <w:b/>
           <w:bCs/>
         </w:rPr>
@@ -412,13 +406,13 @@
       </w:pPr>
       <w:r>
         <w:rPr>
-          <w:rFonts w:ascii="Arial" w:cs="Arial" w:eastAsia="Arial" w:hAnsi="Arial"/>
+          <w:rFonts w:ascii="Calibri" w:cs="Calibri" w:eastAsia="Calibri" w:hAnsi="Calibri"/>
         </w:rPr>
         <w:t xml:space="preserve">Sirve para mantener la </w:t>
       </w:r>
       <w:r>
         <w:rPr>
-          <w:rFonts w:ascii="Arial" w:cs="Arial" w:eastAsia="Arial" w:hAnsi="Arial"/>
+          <w:rFonts w:ascii="Calibri" w:cs="Calibri" w:eastAsia="Calibri" w:hAnsi="Calibri"/>
           <w:b/>
           <w:bCs/>
         </w:rPr>
@@ -426,7 +420,7 @@
       </w:r>
       <w:r>
         <w:rPr>
-          <w:rFonts w:ascii="Arial" w:cs="Arial" w:eastAsia="Arial" w:hAnsi="Arial"/>
+          <w:rFonts w:ascii="Calibri" w:cs="Calibri" w:eastAsia="Calibri" w:hAnsi="Calibri"/>
         </w:rPr>
         <w:t xml:space="preserve">.</w:t>
       </w:r>
@@ -442,7 +436,7 @@
       </w:pPr>
       <w:r>
         <w:rPr>
-          <w:rFonts w:ascii="Arial" w:cs="Arial" w:eastAsia="Arial" w:hAnsi="Arial"/>
+          <w:rFonts w:ascii="Calibri" w:cs="Calibri" w:eastAsia="Calibri" w:hAnsi="Calibri"/>
         </w:rPr>
         <w:t xml:space="preserve">Muchos ataques insertan datos con formato incorrecto.</w:t>
       </w:r>
@@ -458,13 +452,13 @@
       </w:pPr>
       <w:r>
         <w:rPr>
-          <w:rFonts w:ascii="Arial" w:cs="Arial" w:eastAsia="Arial" w:hAnsi="Arial"/>
+          <w:rFonts w:ascii="Calibri" w:cs="Calibri" w:eastAsia="Calibri" w:hAnsi="Calibri"/>
         </w:rPr>
         <w:t xml:space="preserve">La </w:t>
       </w:r>
       <w:r>
         <w:rPr>
-          <w:rFonts w:ascii="Arial" w:cs="Arial" w:eastAsia="Arial" w:hAnsi="Arial"/>
+          <w:rFonts w:ascii="Calibri" w:cs="Calibri" w:eastAsia="Calibri" w:hAnsi="Calibri"/>
           <w:b/>
           <w:bCs/>
         </w:rPr>
@@ -472,7 +466,7 @@
       </w:r>
       <w:r>
         <w:rPr>
-          <w:rFonts w:ascii="Arial" w:cs="Arial" w:eastAsia="Arial" w:hAnsi="Arial"/>
+          <w:rFonts w:ascii="Calibri" w:cs="Calibri" w:eastAsia="Calibri" w:hAnsi="Calibri"/>
         </w:rPr>
         <w:t xml:space="preserve"> verifica que los datos cumplan los parámetros que definió el diseñador de la BD.</w:t>
       </w:r>
@@ -488,7 +482,7 @@
       </w:pPr>
       <w:r>
         <w:rPr>
-          <w:rFonts w:ascii="Arial" w:cs="Arial" w:eastAsia="Arial" w:hAnsi="Arial"/>
+          <w:rFonts w:ascii="Calibri" w:cs="Calibri" w:eastAsia="Calibri" w:hAnsi="Calibri"/>
         </w:rPr>
         <w:t xml:space="preserve">Esto garantiza integridad, exactitud y coherencia.</w:t>
       </w:r>
@@ -499,7 +493,7 @@
       </w:pPr>
       <w:r>
         <w:rPr>
-          <w:rFonts w:ascii="Arial" w:cs="Arial" w:eastAsia="Arial" w:hAnsi="Arial"/>
+          <w:rFonts w:ascii="Calibri" w:cs="Calibri" w:eastAsia="Calibri" w:hAnsi="Calibri"/>
           <w:b/>
           <w:bCs/>
         </w:rPr>
@@ -517,13 +511,13 @@
       </w:pPr>
       <w:r>
         <w:rPr>
-          <w:rFonts w:ascii="Arial" w:cs="Arial" w:eastAsia="Arial" w:hAnsi="Arial"/>
+          <w:rFonts w:ascii="Calibri" w:cs="Calibri" w:eastAsia="Calibri" w:hAnsi="Calibri"/>
         </w:rPr>
         <w:t xml:space="preserve">Usa una </w:t>
       </w:r>
       <w:r>
         <w:rPr>
-          <w:rFonts w:ascii="Arial" w:cs="Arial" w:eastAsia="Arial" w:hAnsi="Arial"/>
+          <w:rFonts w:ascii="Calibri" w:cs="Calibri" w:eastAsia="Calibri" w:hAnsi="Calibri"/>
           <w:b/>
           <w:bCs/>
         </w:rPr>
@@ -531,7 +525,7 @@
       </w:r>
       <w:r>
         <w:rPr>
-          <w:rFonts w:ascii="Arial" w:cs="Arial" w:eastAsia="Arial" w:hAnsi="Arial"/>
+          <w:rFonts w:ascii="Calibri" w:cs="Calibri" w:eastAsia="Calibri" w:hAnsi="Calibri"/>
         </w:rPr>
         <w:t xml:space="preserve"> para sacar una "foto" de los datos y comprobar que no cambiaron.</w:t>
       </w:r>
@@ -547,13 +541,13 @@
       </w:pPr>
       <w:r>
         <w:rPr>
-          <w:rFonts w:ascii="Arial" w:cs="Arial" w:eastAsia="Arial" w:hAnsi="Arial"/>
+          <w:rFonts w:ascii="Calibri" w:cs="Calibri" w:eastAsia="Calibri" w:hAnsi="Calibri"/>
         </w:rPr>
         <w:t xml:space="preserve">El </w:t>
       </w:r>
       <w:r>
         <w:rPr>
-          <w:rFonts w:ascii="Arial" w:cs="Arial" w:eastAsia="Arial" w:hAnsi="Arial"/>
+          <w:rFonts w:ascii="Calibri" w:cs="Calibri" w:eastAsia="Calibri" w:hAnsi="Calibri"/>
           <w:b/>
           <w:bCs/>
         </w:rPr>
@@ -561,7 +555,7 @@
       </w:r>
       <w:r>
         <w:rPr>
-          <w:rFonts w:ascii="Arial" w:cs="Arial" w:eastAsia="Arial" w:hAnsi="Arial"/>
+          <w:rFonts w:ascii="Calibri" w:cs="Calibri" w:eastAsia="Calibri" w:hAnsi="Calibri"/>
         </w:rPr>
         <w:t xml:space="preserve"> es un ejemplo de hash.</w:t>
       </w:r>
@@ -577,13 +571,13 @@
       </w:pPr>
       <w:r>
         <w:rPr>
-          <w:rFonts w:ascii="Arial" w:cs="Arial" w:eastAsia="Arial" w:hAnsi="Arial"/>
+          <w:rFonts w:ascii="Calibri" w:cs="Calibri" w:eastAsia="Calibri" w:hAnsi="Calibri"/>
         </w:rPr>
         <w:t xml:space="preserve">La </w:t>
       </w:r>
       <w:r>
         <w:rPr>
-          <w:rFonts w:ascii="Arial" w:cs="Arial" w:eastAsia="Arial" w:hAnsi="Arial"/>
+          <w:rFonts w:ascii="Calibri" w:cs="Calibri" w:eastAsia="Calibri" w:hAnsi="Calibri"/>
           <w:b/>
           <w:bCs/>
         </w:rPr>
@@ -591,7 +585,7 @@
       </w:r>
       <w:r>
         <w:rPr>
-          <w:rFonts w:ascii="Arial" w:cs="Arial" w:eastAsia="Arial" w:hAnsi="Arial"/>
+          <w:rFonts w:ascii="Calibri" w:cs="Calibri" w:eastAsia="Calibri" w:hAnsi="Calibri"/>
         </w:rPr>
         <w:t xml:space="preserve"> demuestra que el software es auténtico.</w:t>
       </w:r>
@@ -607,13 +601,13 @@
       </w:pPr>
       <w:r>
         <w:rPr>
-          <w:rFonts w:ascii="Arial" w:cs="Arial" w:eastAsia="Arial" w:hAnsi="Arial"/>
+          <w:rFonts w:ascii="Calibri" w:cs="Calibri" w:eastAsia="Calibri" w:hAnsi="Calibri"/>
         </w:rPr>
         <w:t xml:space="preserve">Usar </w:t>
       </w:r>
       <w:r>
         <w:rPr>
-          <w:rFonts w:ascii="Arial" w:cs="Arial" w:eastAsia="Arial" w:hAnsi="Arial"/>
+          <w:rFonts w:ascii="Calibri" w:cs="Calibri" w:eastAsia="Calibri" w:hAnsi="Calibri"/>
           <w:b/>
           <w:bCs/>
         </w:rPr>
@@ -621,7 +615,7 @@
       </w:r>
       <w:r>
         <w:rPr>
-          <w:rFonts w:ascii="Arial" w:cs="Arial" w:eastAsia="Arial" w:hAnsi="Arial"/>
+          <w:rFonts w:ascii="Calibri" w:cs="Calibri" w:eastAsia="Calibri" w:hAnsi="Calibri"/>
         </w:rPr>
         <w:t xml:space="preserve"> protege la información.</w:t>
       </w:r>
@@ -632,7 +626,7 @@
       </w:pPr>
       <w:r>
         <w:rPr>
-          <w:rFonts w:ascii="Arial" w:cs="Arial" w:eastAsia="Arial" w:hAnsi="Arial"/>
+          <w:rFonts w:ascii="Calibri" w:cs="Calibri" w:eastAsia="Calibri" w:hAnsi="Calibri"/>
           <w:b/>
           <w:bCs/>
         </w:rPr>
@@ -650,7 +644,7 @@
       </w:pPr>
       <w:r>
         <w:rPr>
-          <w:rFonts w:ascii="Arial" w:cs="Arial" w:eastAsia="Arial" w:hAnsi="Arial"/>
+          <w:rFonts w:ascii="Calibri" w:cs="Calibri" w:eastAsia="Calibri" w:hAnsi="Calibri"/>
         </w:rPr>
         <w:t xml:space="preserve">Políticas de acceso</w:t>
       </w:r>
@@ -666,7 +660,7 @@
       </w:pPr>
       <w:r>
         <w:rPr>
-          <w:rFonts w:ascii="Arial" w:cs="Arial" w:eastAsia="Arial" w:hAnsi="Arial"/>
+          <w:rFonts w:ascii="Calibri" w:cs="Calibri" w:eastAsia="Calibri" w:hAnsi="Calibri"/>
         </w:rPr>
         <w:t xml:space="preserve">Continuidad del negocio y recuperación ante desastres</w:t>
       </w:r>
@@ -682,7 +676,7 @@
       </w:pPr>
       <w:r>
         <w:rPr>
-          <w:rFonts w:ascii="Arial" w:cs="Arial" w:eastAsia="Arial" w:hAnsi="Arial"/>
+          <w:rFonts w:ascii="Calibri" w:cs="Calibri" w:eastAsia="Calibri" w:hAnsi="Calibri"/>
         </w:rPr>
         <w:t xml:space="preserve">Políticas de parches y actualizaciones</w:t>
       </w:r>
@@ -698,7 +692,7 @@
       </w:pPr>
       <w:r>
         <w:rPr>
-          <w:rFonts w:ascii="Arial" w:cs="Arial" w:eastAsia="Arial" w:hAnsi="Arial"/>
+          <w:rFonts w:ascii="Calibri" w:cs="Calibri" w:eastAsia="Calibri" w:hAnsi="Calibri"/>
         </w:rPr>
         <w:t xml:space="preserve">Control de MFA y de archivos de registro (logs)</w:t>
       </w:r>
@@ -714,7 +708,7 @@
       </w:pPr>
       <w:r>
         <w:rPr>
-          <w:rFonts w:ascii="Arial" w:cs="Arial" w:eastAsia="Arial" w:hAnsi="Arial"/>
+          <w:rFonts w:ascii="Calibri" w:cs="Calibri" w:eastAsia="Calibri" w:hAnsi="Calibri"/>
         </w:rPr>
         <w:t xml:space="preserve">Clasificación de datos</w:t>
       </w:r>
@@ -730,7 +724,7 @@
       </w:pPr>
       <w:r>
         <w:rPr>
-          <w:rFonts w:ascii="Arial" w:cs="Arial" w:eastAsia="Arial" w:hAnsi="Arial"/>
+          <w:rFonts w:ascii="Calibri" w:cs="Calibri" w:eastAsia="Calibri" w:hAnsi="Calibri"/>
         </w:rPr>
         <w:t xml:space="preserve">Copias de seguridad</w:t>
       </w:r>
@@ -746,21 +740,18 @@
       </w:pPr>
       <w:r>
         <w:rPr>
-          <w:rFonts w:ascii="Arial" w:cs="Arial" w:eastAsia="Arial" w:hAnsi="Arial"/>
+          <w:rFonts w:ascii="Calibri" w:cs="Calibri" w:eastAsia="Calibri" w:hAnsi="Calibri"/>
         </w:rPr>
         <w:t xml:space="preserve">Pruebas de software antes del lanzamiento</w:t>
       </w:r>
     </w:p>
     <w:p>
       <w:pPr>
-        <w:pBdr>
-          <w:bottom w:val="single" w:color="000000" w:sz="8" w:space="2"/>
-        </w:pBdr>
         <w:spacing w:after="120" w:before="280"/>
       </w:pPr>
       <w:r>
         <w:rPr>
-          <w:rFonts w:ascii="Arial" w:cs="Arial" w:eastAsia="Arial" w:hAnsi="Arial"/>
+          <w:rFonts w:ascii="Calibri" w:cs="Calibri" w:eastAsia="Calibri" w:hAnsi="Calibri"/>
           <w:b/>
           <w:bCs/>
         </w:rPr>
@@ -773,7 +764,7 @@
       </w:pPr>
       <w:r>
         <w:rPr>
-          <w:rFonts w:ascii="Arial" w:cs="Arial" w:eastAsia="Arial" w:hAnsi="Arial"/>
+          <w:rFonts w:ascii="Calibri" w:cs="Calibri" w:eastAsia="Calibri" w:hAnsi="Calibri"/>
         </w:rPr>
         <w:t xml:space="preserve">Los ciberdelincuentes aprovechan servicios de red vulnerables para atacar un dispositivo o usarlo como parte del ataque.</w:t>
       </w:r>
@@ -819,7 +810,7 @@
           <w:p>
             <w:r>
               <w:rPr>
-                <w:rFonts w:ascii="Arial" w:cs="Arial" w:eastAsia="Arial" w:hAnsi="Arial"/>
+                <w:rFonts w:ascii="Calibri" w:cs="Calibri" w:eastAsia="Calibri" w:hAnsi="Calibri"/>
                 <w:b/>
                 <w:bCs/>
                 <w:color w:val="000000"/>
@@ -848,7 +839,7 @@
           <w:p>
             <w:r>
               <w:rPr>
-                <w:rFonts w:ascii="Arial" w:cs="Arial" w:eastAsia="Arial" w:hAnsi="Arial"/>
+                <w:rFonts w:ascii="Calibri" w:cs="Calibri" w:eastAsia="Calibri" w:hAnsi="Calibri"/>
                 <w:b/>
                 <w:bCs/>
                 <w:color w:val="000000"/>
@@ -877,7 +868,7 @@
           <w:p>
             <w:r>
               <w:rPr>
-                <w:rFonts w:ascii="Arial" w:cs="Arial" w:eastAsia="Arial" w:hAnsi="Arial"/>
+                <w:rFonts w:ascii="Calibri" w:cs="Calibri" w:eastAsia="Calibri" w:hAnsi="Calibri"/>
                 <w:b/>
                 <w:bCs/>
                 <w:color w:val="000000"/>
@@ -908,7 +899,7 @@
           <w:p>
             <w:r>
               <w:rPr>
-                <w:rFonts w:ascii="Arial" w:cs="Arial" w:eastAsia="Arial" w:hAnsi="Arial"/>
+                <w:rFonts w:ascii="Calibri" w:cs="Calibri" w:eastAsia="Calibri" w:hAnsi="Calibri"/>
                 <w:b/>
                 <w:bCs/>
               </w:rPr>
@@ -936,7 +927,7 @@
           <w:p>
             <w:r>
               <w:rPr>
-                <w:rFonts w:ascii="Arial" w:cs="Arial" w:eastAsia="Arial" w:hAnsi="Arial"/>
+                <w:rFonts w:ascii="Calibri" w:cs="Calibri" w:eastAsia="Calibri" w:hAnsi="Calibri"/>
               </w:rPr>
               <w:t xml:space="preserve">Manda un mensaje a cada puerto y ve si responde, para saber si está abierto</w:t>
             </w:r>
@@ -962,7 +953,7 @@
           <w:p>
             <w:r>
               <w:rPr>
-                <w:rFonts w:ascii="Arial" w:cs="Arial" w:eastAsia="Arial" w:hAnsi="Arial"/>
+                <w:rFonts w:ascii="Calibri" w:cs="Calibri" w:eastAsia="Calibri" w:hAnsi="Calibri"/>
               </w:rPr>
               <w:t xml:space="preserve">Sirve para detectar puertos abiertos</w:t>
             </w:r>
@@ -990,7 +981,7 @@
           <w:p>
             <w:r>
               <w:rPr>
-                <w:rFonts w:ascii="Arial" w:cs="Arial" w:eastAsia="Arial" w:hAnsi="Arial"/>
+                <w:rFonts w:ascii="Calibri" w:cs="Calibri" w:eastAsia="Calibri" w:hAnsi="Calibri"/>
                 <w:b/>
                 <w:bCs/>
               </w:rPr>
@@ -1018,7 +1009,7 @@
           <w:p>
             <w:r>
               <w:rPr>
-                <w:rFonts w:ascii="Arial" w:cs="Arial" w:eastAsia="Arial" w:hAnsi="Arial"/>
+                <w:rFonts w:ascii="Calibri" w:cs="Calibri" w:eastAsia="Calibri" w:hAnsi="Calibri"/>
               </w:rPr>
               <w:t xml:space="preserve">Asigna IP y configuración a los dispositivos</w:t>
             </w:r>
@@ -1044,7 +1035,7 @@
           <w:p>
             <w:r>
               <w:rPr>
-                <w:rFonts w:ascii="Arial" w:cs="Arial" w:eastAsia="Arial" w:hAnsi="Arial"/>
+                <w:rFonts w:ascii="Calibri" w:cs="Calibri" w:eastAsia="Calibri" w:hAnsi="Calibri"/>
                 <w:b/>
                 <w:bCs/>
               </w:rPr>
@@ -1052,7 +1043,7 @@
             </w:r>
             <w:r>
               <w:rPr>
-                <w:rFonts w:ascii="Arial" w:cs="Arial" w:eastAsia="Arial" w:hAnsi="Arial"/>
+                <w:rFonts w:ascii="Calibri" w:cs="Calibri" w:eastAsia="Calibri" w:hAnsi="Calibri"/>
               </w:rPr>
               <w:t xml:space="preserve">: evita servidores DHCP no autorizados validando mensajes de fuentes no confiables</w:t>
             </w:r>
@@ -1080,7 +1071,7 @@
           <w:p>
             <w:r>
               <w:rPr>
-                <w:rFonts w:ascii="Arial" w:cs="Arial" w:eastAsia="Arial" w:hAnsi="Arial"/>
+                <w:rFonts w:ascii="Calibri" w:cs="Calibri" w:eastAsia="Calibri" w:hAnsi="Calibri"/>
                 <w:b/>
                 <w:bCs/>
               </w:rPr>
@@ -1108,7 +1099,7 @@
           <w:p>
             <w:r>
               <w:rPr>
-                <w:rFonts w:ascii="Arial" w:cs="Arial" w:eastAsia="Arial" w:hAnsi="Arial"/>
+                <w:rFonts w:ascii="Calibri" w:cs="Calibri" w:eastAsia="Calibri" w:hAnsi="Calibri"/>
               </w:rPr>
               <w:t xml:space="preserve">Resuelve nombres</w:t>
             </w:r>
@@ -1134,7 +1125,7 @@
           <w:p>
             <w:r>
               <w:rPr>
-                <w:rFonts w:ascii="Arial" w:cs="Arial" w:eastAsia="Arial" w:hAnsi="Arial"/>
+                <w:rFonts w:ascii="Calibri" w:cs="Calibri" w:eastAsia="Calibri" w:hAnsi="Calibri"/>
                 <w:b/>
                 <w:bCs/>
               </w:rPr>
@@ -1142,7 +1133,7 @@
             </w:r>
             <w:r>
               <w:rPr>
-                <w:rFonts w:ascii="Arial" w:cs="Arial" w:eastAsia="Arial" w:hAnsi="Arial"/>
+                <w:rFonts w:ascii="Calibri" w:cs="Calibri" w:eastAsia="Calibri" w:hAnsi="Calibri"/>
               </w:rPr>
               <w:t xml:space="preserve"> usa firmas digitales contra amenazas al DNS</w:t>
             </w:r>
@@ -1170,7 +1161,7 @@
           <w:p>
             <w:r>
               <w:rPr>
-                <w:rFonts w:ascii="Arial" w:cs="Arial" w:eastAsia="Arial" w:hAnsi="Arial"/>
+                <w:rFonts w:ascii="Calibri" w:cs="Calibri" w:eastAsia="Calibri" w:hAnsi="Calibri"/>
                 <w:b/>
                 <w:bCs/>
               </w:rPr>
@@ -1198,7 +1189,7 @@
           <w:p>
             <w:r>
               <w:rPr>
-                <w:rFonts w:ascii="Arial" w:cs="Arial" w:eastAsia="Arial" w:hAnsi="Arial"/>
+                <w:rFonts w:ascii="Calibri" w:cs="Calibri" w:eastAsia="Calibri" w:hAnsi="Calibri"/>
               </w:rPr>
               <w:t xml:space="preserve">Prueba la conexión con un host</w:t>
             </w:r>
@@ -1224,13 +1215,13 @@
           <w:p>
             <w:r>
               <w:rPr>
-                <w:rFonts w:ascii="Arial" w:cs="Arial" w:eastAsia="Arial" w:hAnsi="Arial"/>
+                <w:rFonts w:ascii="Calibri" w:cs="Calibri" w:eastAsia="Calibri" w:hAnsi="Calibri"/>
               </w:rPr>
               <w:t xml:space="preserve">Lo usan para reconocimiento, DoS y canal encubierto. </w:t>
             </w:r>
             <w:r>
               <w:rPr>
-                <w:rFonts w:ascii="Arial" w:cs="Arial" w:eastAsia="Arial" w:hAnsi="Arial"/>
+                <w:rFonts w:ascii="Calibri" w:cs="Calibri" w:eastAsia="Calibri" w:hAnsi="Calibri"/>
                 <w:b/>
                 <w:bCs/>
               </w:rPr>
@@ -1238,7 +1229,7 @@
             </w:r>
             <w:r>
               <w:rPr>
-                <w:rFonts w:ascii="Arial" w:cs="Arial" w:eastAsia="Arial" w:hAnsi="Arial"/>
+                <w:rFonts w:ascii="Calibri" w:cs="Calibri" w:eastAsia="Calibri" w:hAnsi="Calibri"/>
               </w:rPr>
               <w:t xml:space="preserve"> las solicitudes ICMP</w:t>
             </w:r>
@@ -1266,7 +1257,7 @@
           <w:p>
             <w:r>
               <w:rPr>
-                <w:rFonts w:ascii="Arial" w:cs="Arial" w:eastAsia="Arial" w:hAnsi="Arial"/>
+                <w:rFonts w:ascii="Calibri" w:cs="Calibri" w:eastAsia="Calibri" w:hAnsi="Calibri"/>
                 <w:b/>
                 <w:bCs/>
               </w:rPr>
@@ -1294,7 +1285,7 @@
           <w:p>
             <w:r>
               <w:rPr>
-                <w:rFonts w:ascii="Arial" w:cs="Arial" w:eastAsia="Arial" w:hAnsi="Arial"/>
+                <w:rFonts w:ascii="Calibri" w:cs="Calibri" w:eastAsia="Calibri" w:hAnsi="Calibri"/>
               </w:rPr>
               <w:t xml:space="preserve">Calcula la mejor ruta por conteo de saltos</w:t>
             </w:r>
@@ -1320,7 +1311,7 @@
           <w:p>
             <w:r>
               <w:rPr>
-                <w:rFonts w:ascii="Arial" w:cs="Arial" w:eastAsia="Arial" w:hAnsi="Arial"/>
+                <w:rFonts w:ascii="Calibri" w:cs="Calibri" w:eastAsia="Calibri" w:hAnsi="Calibri"/>
               </w:rPr>
               <w:t xml:space="preserve">Los atacantes apuntan a routers y a RIP. Usar servicios seguros con autenticación y parches</w:t>
             </w:r>
@@ -1348,7 +1339,7 @@
           <w:p>
             <w:r>
               <w:rPr>
-                <w:rFonts w:ascii="Arial" w:cs="Arial" w:eastAsia="Arial" w:hAnsi="Arial"/>
+                <w:rFonts w:ascii="Calibri" w:cs="Calibri" w:eastAsia="Calibri" w:hAnsi="Calibri"/>
                 <w:b/>
                 <w:bCs/>
               </w:rPr>
@@ -1376,7 +1367,7 @@
           <w:p>
             <w:r>
               <w:rPr>
-                <w:rFonts w:ascii="Arial" w:cs="Arial" w:eastAsia="Arial" w:hAnsi="Arial"/>
+                <w:rFonts w:ascii="Calibri" w:cs="Calibri" w:eastAsia="Calibri" w:hAnsi="Calibri"/>
               </w:rPr>
               <w:t xml:space="preserve">Sincroniza la hora con un servidor</w:t>
             </w:r>
@@ -1402,13 +1393,13 @@
           <w:p>
             <w:r>
               <w:rPr>
-                <w:rFonts w:ascii="Arial" w:cs="Arial" w:eastAsia="Arial" w:hAnsi="Arial"/>
+                <w:rFonts w:ascii="Calibri" w:cs="Calibri" w:eastAsia="Calibri" w:hAnsi="Calibri"/>
               </w:rPr>
               <w:t xml:space="preserve">Usar </w:t>
             </w:r>
             <w:r>
               <w:rPr>
-                <w:rFonts w:ascii="Arial" w:cs="Arial" w:eastAsia="Arial" w:hAnsi="Arial"/>
+                <w:rFonts w:ascii="Calibri" w:cs="Calibri" w:eastAsia="Calibri" w:hAnsi="Calibri"/>
                 <w:b/>
                 <w:bCs/>
               </w:rPr>
@@ -1416,7 +1407,7 @@
             </w:r>
             <w:r>
               <w:rPr>
-                <w:rFonts w:ascii="Arial" w:cs="Arial" w:eastAsia="Arial" w:hAnsi="Arial"/>
+                <w:rFonts w:ascii="Calibri" w:cs="Calibri" w:eastAsia="Calibri" w:hAnsi="Calibri"/>
               </w:rPr>
               <w:t xml:space="preserve"> para verificar que el servidor sea confiable</w:t>
             </w:r>
@@ -1444,7 +1435,7 @@
           <w:p>
             <w:r>
               <w:rPr>
-                <w:rFonts w:ascii="Arial" w:cs="Arial" w:eastAsia="Arial" w:hAnsi="Arial"/>
+                <w:rFonts w:ascii="Calibri" w:cs="Calibri" w:eastAsia="Calibri" w:hAnsi="Calibri"/>
                 <w:b/>
                 <w:bCs/>
               </w:rPr>
@@ -1472,13 +1463,13 @@
           <w:p>
             <w:r>
               <w:rPr>
-                <w:rFonts w:ascii="Arial" w:cs="Arial" w:eastAsia="Arial" w:hAnsi="Arial"/>
+                <w:rFonts w:ascii="Calibri" w:cs="Calibri" w:eastAsia="Calibri" w:hAnsi="Calibri"/>
               </w:rPr>
               <w:t xml:space="preserve">Conexión remota </w:t>
             </w:r>
             <w:r>
               <w:rPr>
-                <w:rFonts w:ascii="Arial" w:cs="Arial" w:eastAsia="Arial" w:hAnsi="Arial"/>
+                <w:rFonts w:ascii="Calibri" w:cs="Calibri" w:eastAsia="Calibri" w:hAnsi="Calibri"/>
                 <w:b/>
                 <w:bCs/>
               </w:rPr>
@@ -1486,13 +1477,13 @@
             </w:r>
             <w:r>
               <w:rPr>
-                <w:rFonts w:ascii="Arial" w:cs="Arial" w:eastAsia="Arial" w:hAnsi="Arial"/>
+                <w:rFonts w:ascii="Calibri" w:cs="Calibri" w:eastAsia="Calibri" w:hAnsi="Calibri"/>
               </w:rPr>
               <w:t xml:space="preserve">, puerto </w:t>
             </w:r>
             <w:r>
               <w:rPr>
-                <w:rFonts w:ascii="Arial" w:cs="Arial" w:eastAsia="Arial" w:hAnsi="Arial"/>
+                <w:rFonts w:ascii="Calibri" w:cs="Calibri" w:eastAsia="Calibri" w:hAnsi="Calibri"/>
                 <w:b/>
                 <w:bCs/>
               </w:rPr>
@@ -1520,13 +1511,13 @@
           <w:p>
             <w:r>
               <w:rPr>
-                <w:rFonts w:ascii="Arial" w:cs="Arial" w:eastAsia="Arial" w:hAnsi="Arial"/>
+                <w:rFonts w:ascii="Calibri" w:cs="Calibri" w:eastAsia="Calibri" w:hAnsi="Calibri"/>
               </w:rPr>
               <w:t xml:space="preserve">Usarlo </w:t>
             </w:r>
             <w:r>
               <w:rPr>
-                <w:rFonts w:ascii="Arial" w:cs="Arial" w:eastAsia="Arial" w:hAnsi="Arial"/>
+                <w:rFonts w:ascii="Calibri" w:cs="Calibri" w:eastAsia="Calibri" w:hAnsi="Calibri"/>
                 <w:b/>
                 <w:bCs/>
               </w:rPr>
@@ -1556,7 +1547,7 @@
           <w:p>
             <w:r>
               <w:rPr>
-                <w:rFonts w:ascii="Arial" w:cs="Arial" w:eastAsia="Arial" w:hAnsi="Arial"/>
+                <w:rFonts w:ascii="Calibri" w:cs="Calibri" w:eastAsia="Calibri" w:hAnsi="Calibri"/>
                 <w:b/>
                 <w:bCs/>
               </w:rPr>
@@ -1584,13 +1575,13 @@
           <w:p>
             <w:r>
               <w:rPr>
-                <w:rFonts w:ascii="Arial" w:cs="Arial" w:eastAsia="Arial" w:hAnsi="Arial"/>
+                <w:rFonts w:ascii="Calibri" w:cs="Calibri" w:eastAsia="Calibri" w:hAnsi="Calibri"/>
               </w:rPr>
               <w:t xml:space="preserve">Protocolo viejo en </w:t>
             </w:r>
             <w:r>
               <w:rPr>
-                <w:rFonts w:ascii="Arial" w:cs="Arial" w:eastAsia="Arial" w:hAnsi="Arial"/>
+                <w:rFonts w:ascii="Calibri" w:cs="Calibri" w:eastAsia="Calibri" w:hAnsi="Calibri"/>
                 <w:b/>
                 <w:bCs/>
               </w:rPr>
@@ -1598,13 +1589,13 @@
             </w:r>
             <w:r>
               <w:rPr>
-                <w:rFonts w:ascii="Arial" w:cs="Arial" w:eastAsia="Arial" w:hAnsi="Arial"/>
+                <w:rFonts w:ascii="Calibri" w:cs="Calibri" w:eastAsia="Calibri" w:hAnsi="Calibri"/>
               </w:rPr>
               <w:t xml:space="preserve">, puerto </w:t>
             </w:r>
             <w:r>
               <w:rPr>
-                <w:rFonts w:ascii="Arial" w:cs="Arial" w:eastAsia="Arial" w:hAnsi="Arial"/>
+                <w:rFonts w:ascii="Calibri" w:cs="Calibri" w:eastAsia="Calibri" w:hAnsi="Calibri"/>
                 <w:b/>
                 <w:bCs/>
               </w:rPr>
@@ -1632,7 +1623,7 @@
           <w:p>
             <w:r>
               <w:rPr>
-                <w:rFonts w:ascii="Arial" w:cs="Arial" w:eastAsia="Arial" w:hAnsi="Arial"/>
+                <w:rFonts w:ascii="Calibri" w:cs="Calibri" w:eastAsia="Calibri" w:hAnsi="Calibri"/>
               </w:rPr>
               <w:t xml:space="preserve">Inseguro</w:t>
             </w:r>
@@ -1660,7 +1651,7 @@
           <w:p>
             <w:r>
               <w:rPr>
-                <w:rFonts w:ascii="Arial" w:cs="Arial" w:eastAsia="Arial" w:hAnsi="Arial"/>
+                <w:rFonts w:ascii="Calibri" w:cs="Calibri" w:eastAsia="Calibri" w:hAnsi="Calibri"/>
                 <w:b/>
                 <w:bCs/>
               </w:rPr>
@@ -1688,7 +1679,7 @@
           <w:p>
             <w:r>
               <w:rPr>
-                <w:rFonts w:ascii="Arial" w:cs="Arial" w:eastAsia="Arial" w:hAnsi="Arial"/>
+                <w:rFonts w:ascii="Calibri" w:cs="Calibri" w:eastAsia="Calibri" w:hAnsi="Calibri"/>
               </w:rPr>
               <w:t xml:space="preserve">Transfiere datos usando SSH</w:t>
             </w:r>
@@ -1714,7 +1705,7 @@
           <w:p>
             <w:r>
               <w:rPr>
-                <w:rFonts w:ascii="Arial" w:cs="Arial" w:eastAsia="Arial" w:hAnsi="Arial"/>
+                <w:rFonts w:ascii="Calibri" w:cs="Calibri" w:eastAsia="Calibri" w:hAnsi="Calibri"/>
               </w:rPr>
               <w:t xml:space="preserve">Da autenticidad y confidencialidad en tránsito</w:t>
             </w:r>
@@ -1742,7 +1733,7 @@
           <w:p>
             <w:r>
               <w:rPr>
-                <w:rFonts w:ascii="Arial" w:cs="Arial" w:eastAsia="Arial" w:hAnsi="Arial"/>
+                <w:rFonts w:ascii="Calibri" w:cs="Calibri" w:eastAsia="Calibri" w:hAnsi="Calibri"/>
                 <w:b/>
                 <w:bCs/>
               </w:rPr>
@@ -1770,7 +1761,7 @@
           <w:p>
             <w:r>
               <w:rPr>
-                <w:rFonts w:ascii="Arial" w:cs="Arial" w:eastAsia="Arial" w:hAnsi="Arial"/>
+                <w:rFonts w:ascii="Calibri" w:cs="Calibri" w:eastAsia="Calibri" w:hAnsi="Calibri"/>
               </w:rPr>
               <w:t xml:space="preserve">Recopila estadísticas de dispositivos TCP/IP para monitorear la red</w:t>
             </w:r>
@@ -1796,7 +1787,7 @@
           <w:p>
             <w:r>
               <w:rPr>
-                <w:rFonts w:ascii="Arial" w:cs="Arial" w:eastAsia="Arial" w:hAnsi="Arial"/>
+                <w:rFonts w:ascii="Calibri" w:cs="Calibri" w:eastAsia="Calibri" w:hAnsi="Calibri"/>
                 <w:b/>
                 <w:bCs/>
               </w:rPr>
@@ -1804,7 +1795,7 @@
             </w:r>
             <w:r>
               <w:rPr>
-                <w:rFonts w:ascii="Arial" w:cs="Arial" w:eastAsia="Arial" w:hAnsi="Arial"/>
+                <w:rFonts w:ascii="Calibri" w:cs="Calibri" w:eastAsia="Calibri" w:hAnsi="Calibri"/>
               </w:rPr>
               <w:t xml:space="preserve"> es el estándar actual: cifra contra espionaje y manipulación</w:t>
             </w:r>
@@ -1832,7 +1823,7 @@
           <w:p>
             <w:r>
               <w:rPr>
-                <w:rFonts w:ascii="Arial" w:cs="Arial" w:eastAsia="Arial" w:hAnsi="Arial"/>
+                <w:rFonts w:ascii="Calibri" w:cs="Calibri" w:eastAsia="Calibri" w:hAnsi="Calibri"/>
                 <w:b/>
                 <w:bCs/>
               </w:rPr>
@@ -1860,13 +1851,13 @@
           <w:p>
             <w:r>
               <w:rPr>
-                <w:rFonts w:ascii="Arial" w:cs="Arial" w:eastAsia="Arial" w:hAnsi="Arial"/>
+                <w:rFonts w:ascii="Calibri" w:cs="Calibri" w:eastAsia="Calibri" w:hAnsi="Calibri"/>
               </w:rPr>
               <w:t xml:space="preserve">Conectividad web básica, puerto </w:t>
             </w:r>
             <w:r>
               <w:rPr>
-                <w:rFonts w:ascii="Arial" w:cs="Arial" w:eastAsia="Arial" w:hAnsi="Arial"/>
+                <w:rFonts w:ascii="Calibri" w:cs="Calibri" w:eastAsia="Calibri" w:hAnsi="Calibri"/>
                 <w:b/>
                 <w:bCs/>
               </w:rPr>
@@ -1894,13 +1885,13 @@
           <w:p>
             <w:r>
               <w:rPr>
-                <w:rFonts w:ascii="Arial" w:cs="Arial" w:eastAsia="Arial" w:hAnsi="Arial"/>
+                <w:rFonts w:ascii="Calibri" w:cs="Calibri" w:eastAsia="Calibri" w:hAnsi="Calibri"/>
               </w:rPr>
               <w:t xml:space="preserve">Usar </w:t>
             </w:r>
             <w:r>
               <w:rPr>
-                <w:rFonts w:ascii="Arial" w:cs="Arial" w:eastAsia="Arial" w:hAnsi="Arial"/>
+                <w:rFonts w:ascii="Calibri" w:cs="Calibri" w:eastAsia="Calibri" w:hAnsi="Calibri"/>
                 <w:b/>
                 <w:bCs/>
               </w:rPr>
@@ -1908,7 +1899,7 @@
             </w:r>
             <w:r>
               <w:rPr>
-                <w:rFonts w:ascii="Arial" w:cs="Arial" w:eastAsia="Arial" w:hAnsi="Arial"/>
+                <w:rFonts w:ascii="Calibri" w:cs="Calibri" w:eastAsia="Calibri" w:hAnsi="Calibri"/>
               </w:rPr>
               <w:t xml:space="preserve"> para más seguridad</w:t>
             </w:r>
@@ -1923,14 +1914,11 @@
     </w:p>
     <w:p>
       <w:pPr>
-        <w:pBdr>
-          <w:bottom w:val="single" w:color="000000" w:sz="8" w:space="2"/>
-        </w:pBdr>
         <w:spacing w:after="120" w:before="280"/>
       </w:pPr>
       <w:r>
         <w:rPr>
-          <w:rFonts w:ascii="Arial" w:cs="Arial" w:eastAsia="Arial" w:hAnsi="Arial"/>
+          <w:rFonts w:ascii="Calibri" w:cs="Calibri" w:eastAsia="Calibri" w:hAnsi="Calibri"/>
           <w:b/>
           <w:bCs/>
         </w:rPr>
@@ -1943,7 +1931,7 @@
       </w:pPr>
       <w:r>
         <w:rPr>
-          <w:rFonts w:ascii="Arial" w:cs="Arial" w:eastAsia="Arial" w:hAnsi="Arial"/>
+          <w:rFonts w:ascii="Calibri" w:cs="Calibri" w:eastAsia="Calibri" w:hAnsi="Calibri"/>
           <w:b/>
           <w:bCs/>
         </w:rPr>
@@ -1961,7 +1949,7 @@
       </w:pPr>
       <w:r>
         <w:rPr>
-          <w:rFonts w:ascii="Arial" w:cs="Arial" w:eastAsia="Arial" w:hAnsi="Arial"/>
+          <w:rFonts w:ascii="Calibri" w:cs="Calibri" w:eastAsia="Calibri" w:hAnsi="Calibri"/>
         </w:rPr>
         <w:t xml:space="preserve">Agrupan dispositivos dentro de una LAN y en switches individuales.</w:t>
       </w:r>
@@ -1977,13 +1965,13 @@
       </w:pPr>
       <w:r>
         <w:rPr>
-          <w:rFonts w:ascii="Arial" w:cs="Arial" w:eastAsia="Arial" w:hAnsi="Arial"/>
+          <w:rFonts w:ascii="Calibri" w:cs="Calibri" w:eastAsia="Calibri" w:hAnsi="Calibri"/>
         </w:rPr>
         <w:t xml:space="preserve">Se basan en conexiones </w:t>
       </w:r>
       <w:r>
         <w:rPr>
-          <w:rFonts w:ascii="Arial" w:cs="Arial" w:eastAsia="Arial" w:hAnsi="Arial"/>
+          <w:rFonts w:ascii="Calibri" w:cs="Calibri" w:eastAsia="Calibri" w:hAnsi="Calibri"/>
           <w:b/>
           <w:bCs/>
         </w:rPr>
@@ -1991,13 +1979,13 @@
       </w:r>
       <w:r>
         <w:rPr>
-          <w:rFonts w:ascii="Arial" w:cs="Arial" w:eastAsia="Arial" w:hAnsi="Arial"/>
+          <w:rFonts w:ascii="Calibri" w:cs="Calibri" w:eastAsia="Calibri" w:hAnsi="Calibri"/>
         </w:rPr>
         <w:t xml:space="preserve">, mientras que las LAN se basan en conexiones </w:t>
       </w:r>
       <w:r>
         <w:rPr>
-          <w:rFonts w:ascii="Arial" w:cs="Arial" w:eastAsia="Arial" w:hAnsi="Arial"/>
+          <w:rFonts w:ascii="Calibri" w:cs="Calibri" w:eastAsia="Calibri" w:hAnsi="Calibri"/>
           <w:b/>
           <w:bCs/>
         </w:rPr>
@@ -2005,7 +1993,7 @@
       </w:r>
       <w:r>
         <w:rPr>
-          <w:rFonts w:ascii="Arial" w:cs="Arial" w:eastAsia="Arial" w:hAnsi="Arial"/>
+          <w:rFonts w:ascii="Calibri" w:cs="Calibri" w:eastAsia="Calibri" w:hAnsi="Calibri"/>
         </w:rPr>
         <w:t xml:space="preserve">.</w:t>
       </w:r>
@@ -2021,7 +2009,7 @@
       </w:pPr>
       <w:r>
         <w:rPr>
-          <w:rFonts w:ascii="Arial" w:cs="Arial" w:eastAsia="Arial" w:hAnsi="Arial"/>
+          <w:rFonts w:ascii="Calibri" w:cs="Calibri" w:eastAsia="Calibri" w:hAnsi="Calibri"/>
         </w:rPr>
         <w:t xml:space="preserve">Cada puerto del switch se puede asignar a una VLAN.</w:t>
       </w:r>
@@ -2037,13 +2025,13 @@
       </w:pPr>
       <w:r>
         <w:rPr>
-          <w:rFonts w:ascii="Arial" w:cs="Arial" w:eastAsia="Arial" w:hAnsi="Arial"/>
+          <w:rFonts w:ascii="Calibri" w:cs="Calibri" w:eastAsia="Calibri" w:hAnsi="Calibri"/>
         </w:rPr>
         <w:t xml:space="preserve">Los </w:t>
       </w:r>
       <w:r>
         <w:rPr>
-          <w:rFonts w:ascii="Arial" w:cs="Arial" w:eastAsia="Arial" w:hAnsi="Arial"/>
+          <w:rFonts w:ascii="Calibri" w:cs="Calibri" w:eastAsia="Calibri" w:hAnsi="Calibri"/>
           <w:b/>
           <w:bCs/>
         </w:rPr>
@@ -2051,7 +2039,7 @@
       </w:r>
       <w:r>
         <w:rPr>
-          <w:rFonts w:ascii="Arial" w:cs="Arial" w:eastAsia="Arial" w:hAnsi="Arial"/>
+          <w:rFonts w:ascii="Calibri" w:cs="Calibri" w:eastAsia="Calibri" w:hAnsi="Calibri"/>
         </w:rPr>
         <w:t xml:space="preserve"> conectan switches y dejan pasar tráfico de varias VLAN.</w:t>
       </w:r>
@@ -2067,7 +2055,7 @@
       </w:pPr>
       <w:r>
         <w:rPr>
-          <w:rFonts w:ascii="Arial" w:cs="Arial" w:eastAsia="Arial" w:hAnsi="Arial"/>
+          <w:rFonts w:ascii="Calibri" w:cs="Calibri" w:eastAsia="Calibri" w:hAnsi="Calibri"/>
         </w:rPr>
         <w:t xml:space="preserve">Permiten segmentar. Por ejemplo, separan los datos sensibles del resto de la red y bajan el riesgo de filtraciones.</w:t>
       </w:r>
@@ -2083,7 +2071,7 @@
       </w:pPr>
       <w:r>
         <w:rPr>
-          <w:rFonts w:ascii="Arial" w:cs="Arial" w:eastAsia="Arial" w:hAnsi="Arial"/>
+          <w:rFonts w:ascii="Calibri" w:cs="Calibri" w:eastAsia="Calibri" w:hAnsi="Calibri"/>
         </w:rPr>
         <w:t xml:space="preserve">Para protegerlas: supervisar su rendimiento, usar configuraciones avanzadas y aplicar parches y actualizaciones.</w:t>
       </w:r>
@@ -2094,7 +2082,7 @@
       </w:pPr>
       <w:r>
         <w:rPr>
-          <w:rFonts w:ascii="Arial" w:cs="Arial" w:eastAsia="Arial" w:hAnsi="Arial"/>
+          <w:rFonts w:ascii="Calibri" w:cs="Calibri" w:eastAsia="Calibri" w:hAnsi="Calibri"/>
           <w:b/>
           <w:bCs/>
         </w:rPr>
@@ -2112,7 +2100,7 @@
       </w:pPr>
       <w:r>
         <w:rPr>
-          <w:rFonts w:ascii="Arial" w:cs="Arial" w:eastAsia="Arial" w:hAnsi="Arial"/>
+          <w:rFonts w:ascii="Calibri" w:cs="Calibri" w:eastAsia="Calibri" w:hAnsi="Calibri"/>
         </w:rPr>
         <w:t xml:space="preserve">Es una red pequeña entre la red privada confiable e Internet.</w:t>
       </w:r>
@@ -2128,13 +2116,13 @@
       </w:pPr>
       <w:r>
         <w:rPr>
-          <w:rFonts w:ascii="Arial" w:cs="Arial" w:eastAsia="Arial" w:hAnsi="Arial"/>
+          <w:rFonts w:ascii="Calibri" w:cs="Calibri" w:eastAsia="Calibri" w:hAnsi="Calibri"/>
         </w:rPr>
         <w:t xml:space="preserve">Ahí se ponen los </w:t>
       </w:r>
       <w:r>
         <w:rPr>
-          <w:rFonts w:ascii="Arial" w:cs="Arial" w:eastAsia="Arial" w:hAnsi="Arial"/>
+          <w:rFonts w:ascii="Calibri" w:cs="Calibri" w:eastAsia="Calibri" w:hAnsi="Calibri"/>
           <w:b/>
           <w:bCs/>
         </w:rPr>
@@ -2142,7 +2130,7 @@
       </w:r>
       <w:r>
         <w:rPr>
-          <w:rFonts w:ascii="Arial" w:cs="Arial" w:eastAsia="Arial" w:hAnsi="Arial"/>
+          <w:rFonts w:ascii="Calibri" w:cs="Calibri" w:eastAsia="Calibri" w:hAnsi="Calibri"/>
         </w:rPr>
         <w:t xml:space="preserve">, así los usuarios llegan a una red no confiable sin comprometer la interna.</w:t>
       </w:r>
@@ -2158,13 +2146,13 @@
       </w:pPr>
       <w:r>
         <w:rPr>
-          <w:rFonts w:ascii="Arial" w:cs="Arial" w:eastAsia="Arial" w:hAnsi="Arial"/>
+          <w:rFonts w:ascii="Calibri" w:cs="Calibri" w:eastAsia="Calibri" w:hAnsi="Calibri"/>
         </w:rPr>
         <w:t xml:space="preserve">Casi todas las redes tienen de </w:t>
       </w:r>
       <w:r>
         <w:rPr>
-          <w:rFonts w:ascii="Arial" w:cs="Arial" w:eastAsia="Arial" w:hAnsi="Arial"/>
+          <w:rFonts w:ascii="Calibri" w:cs="Calibri" w:eastAsia="Calibri" w:hAnsi="Calibri"/>
           <w:b/>
           <w:bCs/>
         </w:rPr>
@@ -2172,7 +2160,7 @@
       </w:r>
       <w:r>
         <w:rPr>
-          <w:rFonts w:ascii="Arial" w:cs="Arial" w:eastAsia="Arial" w:hAnsi="Arial"/>
+          <w:rFonts w:ascii="Calibri" w:cs="Calibri" w:eastAsia="Calibri" w:hAnsi="Calibri"/>
         </w:rPr>
         <w:t xml:space="preserve">: LAN privada confiable, DMZ, Internet y extranet.</w:t>
       </w:r>
@@ -2183,7 +2171,7 @@
       </w:pPr>
       <w:r>
         <w:rPr>
-          <w:rFonts w:ascii="Arial" w:cs="Arial" w:eastAsia="Arial" w:hAnsi="Arial"/>
+          <w:rFonts w:ascii="Calibri" w:cs="Calibri" w:eastAsia="Calibri" w:hAnsi="Calibri"/>
           <w:b/>
           <w:bCs/>
         </w:rPr>
@@ -2201,7 +2189,7 @@
       </w:pPr>
       <w:r>
         <w:rPr>
-          <w:rFonts w:ascii="Arial" w:cs="Arial" w:eastAsia="Arial" w:hAnsi="Arial"/>
+          <w:rFonts w:ascii="Calibri" w:cs="Calibri" w:eastAsia="Calibri" w:hAnsi="Calibri"/>
         </w:rPr>
         <w:t xml:space="preserve">Confiar automáticamente en usuarios y terminales pone en riesgo toda la red. Un usuario "de confianza" se puede mover por toda la red hasta llegar a los datos.</w:t>
       </w:r>
@@ -2217,13 +2205,13 @@
       </w:pPr>
       <w:r>
         <w:rPr>
-          <w:rFonts w:ascii="Arial" w:cs="Arial" w:eastAsia="Arial" w:hAnsi="Arial"/>
+          <w:rFonts w:ascii="Calibri" w:cs="Calibri" w:eastAsia="Calibri" w:hAnsi="Calibri"/>
         </w:rPr>
         <w:t xml:space="preserve">Zero Trust </w:t>
       </w:r>
       <w:r>
         <w:rPr>
-          <w:rFonts w:ascii="Arial" w:cs="Arial" w:eastAsia="Arial" w:hAnsi="Arial"/>
+          <w:rFonts w:ascii="Calibri" w:cs="Calibri" w:eastAsia="Calibri" w:hAnsi="Calibri"/>
           <w:b/>
           <w:bCs/>
         </w:rPr>
@@ -2231,21 +2219,18 @@
       </w:r>
       <w:r>
         <w:rPr>
-          <w:rFonts w:ascii="Arial" w:cs="Arial" w:eastAsia="Arial" w:hAnsi="Arial"/>
+          <w:rFonts w:ascii="Calibri" w:cs="Calibri" w:eastAsia="Calibri" w:hAnsi="Calibri"/>
         </w:rPr>
         <w:t xml:space="preserve">, sin importar su estado o función.</w:t>
       </w:r>
     </w:p>
     <w:p>
       <w:pPr>
-        <w:pBdr>
-          <w:bottom w:val="single" w:color="000000" w:sz="8" w:space="2"/>
-        </w:pBdr>
         <w:spacing w:after="120" w:before="280"/>
       </w:pPr>
       <w:r>
         <w:rPr>
-          <w:rFonts w:ascii="Arial" w:cs="Arial" w:eastAsia="Arial" w:hAnsi="Arial"/>
+          <w:rFonts w:ascii="Calibri" w:cs="Calibri" w:eastAsia="Calibri" w:hAnsi="Calibri"/>
           <w:b/>
           <w:bCs/>
         </w:rPr>
@@ -2258,7 +2243,7 @@
       </w:pPr>
       <w:r>
         <w:rPr>
-          <w:rFonts w:ascii="Arial" w:cs="Arial" w:eastAsia="Arial" w:hAnsi="Arial"/>
+          <w:rFonts w:ascii="Calibri" w:cs="Calibri" w:eastAsia="Calibri" w:hAnsi="Calibri"/>
           <w:b/>
           <w:bCs/>
         </w:rPr>
@@ -2276,7 +2261,7 @@
       </w:pPr>
       <w:r>
         <w:rPr>
-          <w:rFonts w:ascii="Arial" w:cs="Arial" w:eastAsia="Arial" w:hAnsi="Arial"/>
+          <w:rFonts w:ascii="Calibri" w:cs="Calibri" w:eastAsia="Calibri" w:hAnsi="Calibri"/>
           <w:b/>
           <w:bCs/>
         </w:rPr>
@@ -2284,13 +2269,13 @@
       </w:r>
       <w:r>
         <w:rPr>
-          <w:rFonts w:ascii="Arial" w:cs="Arial" w:eastAsia="Arial" w:hAnsi="Arial"/>
+          <w:rFonts w:ascii="Calibri" w:cs="Calibri" w:eastAsia="Calibri" w:hAnsi="Calibri"/>
         </w:rPr>
         <w:t xml:space="preserve"> fue el primero y lo reemplazó </w:t>
       </w:r>
       <w:r>
         <w:rPr>
-          <w:rFonts w:ascii="Arial" w:cs="Arial" w:eastAsia="Arial" w:hAnsi="Arial"/>
+          <w:rFonts w:ascii="Calibri" w:cs="Calibri" w:eastAsia="Calibri" w:hAnsi="Calibri"/>
           <w:b/>
           <w:bCs/>
         </w:rPr>
@@ -2298,7 +2283,7 @@
       </w:r>
       <w:r>
         <w:rPr>
-          <w:rFonts w:ascii="Arial" w:cs="Arial" w:eastAsia="Arial" w:hAnsi="Arial"/>
+          <w:rFonts w:ascii="Calibri" w:cs="Calibri" w:eastAsia="Calibri" w:hAnsi="Calibri"/>
         </w:rPr>
         <w:t xml:space="preserve">. Después vinieron WPA2, WPA3 y WPS.</w:t>
       </w:r>
@@ -2314,7 +2299,7 @@
       </w:pPr>
       <w:r>
         <w:rPr>
-          <w:rFonts w:ascii="Arial" w:cs="Arial" w:eastAsia="Arial" w:hAnsi="Arial"/>
+          <w:rFonts w:ascii="Calibri" w:cs="Calibri" w:eastAsia="Calibri" w:hAnsi="Calibri"/>
           <w:b/>
           <w:bCs/>
         </w:rPr>
@@ -2322,7 +2307,7 @@
       </w:r>
       <w:r>
         <w:rPr>
-          <w:rFonts w:ascii="Arial" w:cs="Arial" w:eastAsia="Arial" w:hAnsi="Arial"/>
+          <w:rFonts w:ascii="Calibri" w:cs="Calibri" w:eastAsia="Calibri" w:hAnsi="Calibri"/>
         </w:rPr>
         <w:t xml:space="preserve"> cualquier dispositivo se conecta.</w:t>
       </w:r>
@@ -2338,7 +2323,7 @@
       </w:pPr>
       <w:r>
         <w:rPr>
-          <w:rFonts w:ascii="Arial" w:cs="Arial" w:eastAsia="Arial" w:hAnsi="Arial"/>
+          <w:rFonts w:ascii="Calibri" w:cs="Calibri" w:eastAsia="Calibri" w:hAnsi="Calibri"/>
           <w:b/>
           <w:bCs/>
         </w:rPr>
@@ -2346,7 +2331,7 @@
       </w:r>
       <w:r>
         <w:rPr>
-          <w:rFonts w:ascii="Arial" w:cs="Arial" w:eastAsia="Arial" w:hAnsi="Arial"/>
+          <w:rFonts w:ascii="Calibri" w:cs="Calibri" w:eastAsia="Calibri" w:hAnsi="Calibri"/>
         </w:rPr>
         <w:t xml:space="preserve"> autentica y cifra entre el cliente y el AP o router.</w:t>
       </w:r>
@@ -2362,7 +2347,7 @@
       </w:pPr>
       <w:r>
         <w:rPr>
-          <w:rFonts w:ascii="Arial" w:cs="Arial" w:eastAsia="Arial" w:hAnsi="Arial"/>
+          <w:rFonts w:ascii="Calibri" w:cs="Calibri" w:eastAsia="Calibri" w:hAnsi="Calibri"/>
           <w:b/>
           <w:bCs/>
         </w:rPr>
@@ -2370,7 +2355,7 @@
       </w:r>
       <w:r>
         <w:rPr>
-          <w:rFonts w:ascii="Arial" w:cs="Arial" w:eastAsia="Arial" w:hAnsi="Arial"/>
+          <w:rFonts w:ascii="Calibri" w:cs="Calibri" w:eastAsia="Calibri" w:hAnsi="Calibri"/>
         </w:rPr>
         <w:t xml:space="preserve"> es un marco de autenticación. Incluye EAP-TLS, PEAP, EAP-TTLS y EAP-FAST.</w:t>
       </w:r>
@@ -2386,7 +2371,7 @@
       </w:pPr>
       <w:r>
         <w:rPr>
-          <w:rFonts w:ascii="Arial" w:cs="Arial" w:eastAsia="Arial" w:hAnsi="Arial"/>
+          <w:rFonts w:ascii="Calibri" w:cs="Calibri" w:eastAsia="Calibri" w:hAnsi="Calibri"/>
           <w:b/>
           <w:bCs/>
         </w:rPr>
@@ -2394,7 +2379,7 @@
       </w:r>
       <w:r>
         <w:rPr>
-          <w:rFonts w:ascii="Arial" w:cs="Arial" w:eastAsia="Arial" w:hAnsi="Arial"/>
+          <w:rFonts w:ascii="Calibri" w:cs="Calibri" w:eastAsia="Calibri" w:hAnsi="Calibri"/>
         </w:rPr>
         <w:t xml:space="preserve"> imita a uno autorizado, hace que los usuarios se conecten a él y les puede robar los datos.</w:t>
       </w:r>
@@ -2410,7 +2395,7 @@
       </w:pPr>
       <w:r>
         <w:rPr>
-          <w:rFonts w:ascii="Arial" w:cs="Arial" w:eastAsia="Arial" w:hAnsi="Arial"/>
+          <w:rFonts w:ascii="Calibri" w:cs="Calibri" w:eastAsia="Calibri" w:hAnsi="Calibri"/>
           <w:b/>
           <w:bCs/>
         </w:rPr>
@@ -2418,7 +2403,7 @@
       </w:r>
       <w:r>
         <w:rPr>
-          <w:rFonts w:ascii="Arial" w:cs="Arial" w:eastAsia="Arial" w:hAnsi="Arial"/>
+          <w:rFonts w:ascii="Calibri" w:cs="Calibri" w:eastAsia="Calibri" w:hAnsi="Calibri"/>
         </w:rPr>
         <w:t xml:space="preserve"> es bidireccional, o sea que ambas partes se autentican antes de conectarse.</w:t>
       </w:r>
@@ -2429,7 +2414,7 @@
       </w:pPr>
       <w:r>
         <w:rPr>
-          <w:rFonts w:ascii="Arial" w:cs="Arial" w:eastAsia="Arial" w:hAnsi="Arial"/>
+          <w:rFonts w:ascii="Calibri" w:cs="Calibri" w:eastAsia="Calibri" w:hAnsi="Calibri"/>
           <w:b/>
           <w:bCs/>
         </w:rPr>
@@ -2447,7 +2432,7 @@
       </w:pPr>
       <w:r>
         <w:rPr>
-          <w:rFonts w:ascii="Arial" w:cs="Arial" w:eastAsia="Arial" w:hAnsi="Arial"/>
+          <w:rFonts w:ascii="Calibri" w:cs="Calibri" w:eastAsia="Calibri" w:hAnsi="Calibri"/>
           <w:b/>
           <w:bCs/>
         </w:rPr>
@@ -2455,7 +2440,7 @@
       </w:r>
       <w:r>
         <w:rPr>
-          <w:rFonts w:ascii="Arial" w:cs="Arial" w:eastAsia="Arial" w:hAnsi="Arial"/>
+          <w:rFonts w:ascii="Calibri" w:cs="Calibri" w:eastAsia="Calibri" w:hAnsi="Calibri"/>
         </w:rPr>
         <w:t xml:space="preserve"> son señales inalámbricas.</w:t>
       </w:r>
@@ -2471,7 +2456,7 @@
       </w:pPr>
       <w:r>
         <w:rPr>
-          <w:rFonts w:ascii="Arial" w:cs="Arial" w:eastAsia="Arial" w:hAnsi="Arial"/>
+          <w:rFonts w:ascii="Calibri" w:cs="Calibri" w:eastAsia="Calibri" w:hAnsi="Calibri"/>
           <w:b/>
           <w:bCs/>
         </w:rPr>
@@ -2479,7 +2464,7 @@
       </w:r>
       <w:r>
         <w:rPr>
-          <w:rFonts w:ascii="Arial" w:cs="Arial" w:eastAsia="Arial" w:hAnsi="Arial"/>
+          <w:rFonts w:ascii="Calibri" w:cs="Calibri" w:eastAsia="Calibri" w:hAnsi="Calibri"/>
         </w:rPr>
         <w:t xml:space="preserve"> comunicación sin contacto entre dispositivos.</w:t>
       </w:r>
@@ -2495,7 +2480,7 @@
       </w:pPr>
       <w:r>
         <w:rPr>
-          <w:rFonts w:ascii="Arial" w:cs="Arial" w:eastAsia="Arial" w:hAnsi="Arial"/>
+          <w:rFonts w:ascii="Calibri" w:cs="Calibri" w:eastAsia="Calibri" w:hAnsi="Calibri"/>
           <w:b/>
           <w:bCs/>
         </w:rPr>
@@ -2503,7 +2488,7 @@
       </w:r>
       <w:r>
         <w:rPr>
-          <w:rFonts w:ascii="Arial" w:cs="Arial" w:eastAsia="Arial" w:hAnsi="Arial"/>
+          <w:rFonts w:ascii="Calibri" w:cs="Calibri" w:eastAsia="Calibri" w:hAnsi="Calibri"/>
         </w:rPr>
         <w:t xml:space="preserve"> comunicación de corto alcance con un receptor de infrarrojos.</w:t>
       </w:r>
@@ -2519,7 +2504,7 @@
       </w:pPr>
       <w:r>
         <w:rPr>
-          <w:rFonts w:ascii="Arial" w:cs="Arial" w:eastAsia="Arial" w:hAnsi="Arial"/>
+          <w:rFonts w:ascii="Calibri" w:cs="Calibri" w:eastAsia="Calibri" w:hAnsi="Calibri"/>
           <w:b/>
           <w:bCs/>
         </w:rPr>
@@ -2527,7 +2512,7 @@
       </w:r>
       <w:r>
         <w:rPr>
-          <w:rFonts w:ascii="Arial" w:cs="Arial" w:eastAsia="Arial" w:hAnsi="Arial"/>
+          <w:rFonts w:ascii="Calibri" w:cs="Calibri" w:eastAsia="Calibri" w:hAnsi="Calibri"/>
         </w:rPr>
         <w:t xml:space="preserve"> el único tipo de comunicación por cable de la lista.</w:t>
       </w:r>
@@ -2538,7 +2523,7 @@
       </w:pPr>
       <w:r>
         <w:rPr>
-          <w:rFonts w:ascii="Arial" w:cs="Arial" w:eastAsia="Arial" w:hAnsi="Arial"/>
+          <w:rFonts w:ascii="Calibri" w:cs="Calibri" w:eastAsia="Calibri" w:hAnsi="Calibri"/>
           <w:b/>
           <w:bCs/>
         </w:rPr>
@@ -2556,7 +2541,7 @@
       </w:pPr>
       <w:r>
         <w:rPr>
-          <w:rFonts w:ascii="Arial" w:cs="Arial" w:eastAsia="Arial" w:hAnsi="Arial"/>
+          <w:rFonts w:ascii="Calibri" w:cs="Calibri" w:eastAsia="Calibri" w:hAnsi="Calibri"/>
           <w:b/>
           <w:bCs/>
         </w:rPr>
@@ -2564,7 +2549,7 @@
       </w:r>
       <w:r>
         <w:rPr>
-          <w:rFonts w:ascii="Arial" w:cs="Arial" w:eastAsia="Arial" w:hAnsi="Arial"/>
+          <w:rFonts w:ascii="Calibri" w:cs="Calibri" w:eastAsia="Calibri" w:hAnsi="Calibri"/>
         </w:rPr>
         <w:t xml:space="preserve"> separan lo personal de lo laboral en el mismo dispositivo. Dan un área autenticada y cifrada para la info de la empresa.</w:t>
       </w:r>
@@ -2580,7 +2565,7 @@
       </w:pPr>
       <w:r>
         <w:rPr>
-          <w:rFonts w:ascii="Arial" w:cs="Arial" w:eastAsia="Arial" w:hAnsi="Arial"/>
+          <w:rFonts w:ascii="Calibri" w:cs="Calibri" w:eastAsia="Calibri" w:hAnsi="Calibri"/>
         </w:rPr>
         <w:t xml:space="preserve">Hay riesgo con las apps que comparten datos, como Dropbox, Box, Google Drive e iCloud.</w:t>
       </w:r>
@@ -2596,13 +2581,13 @@
       </w:pPr>
       <w:r>
         <w:rPr>
-          <w:rFonts w:ascii="Arial" w:cs="Arial" w:eastAsia="Arial" w:hAnsi="Arial"/>
+          <w:rFonts w:ascii="Calibri" w:cs="Calibri" w:eastAsia="Calibri" w:hAnsi="Calibri"/>
         </w:rPr>
         <w:t xml:space="preserve">Un sistema de </w:t>
       </w:r>
       <w:r>
         <w:rPr>
-          <w:rFonts w:ascii="Arial" w:cs="Arial" w:eastAsia="Arial" w:hAnsi="Arial"/>
+          <w:rFonts w:ascii="Calibri" w:cs="Calibri" w:eastAsia="Calibri" w:hAnsi="Calibri"/>
           <w:b/>
           <w:bCs/>
         </w:rPr>
@@ -2610,7 +2595,7 @@
       </w:r>
       <w:r>
         <w:rPr>
-          <w:rFonts w:ascii="Arial" w:cs="Arial" w:eastAsia="Arial" w:hAnsi="Arial"/>
+          <w:rFonts w:ascii="Calibri" w:cs="Calibri" w:eastAsia="Calibri" w:hAnsi="Calibri"/>
         </w:rPr>
         <w:t xml:space="preserve"> controla qué datos accede cada usuario.</w:t>
       </w:r>
@@ -2626,7 +2611,7 @@
       </w:pPr>
       <w:r>
         <w:rPr>
-          <w:rFonts w:ascii="Arial" w:cs="Arial" w:eastAsia="Arial" w:hAnsi="Arial"/>
+          <w:rFonts w:ascii="Calibri" w:cs="Calibri" w:eastAsia="Calibri" w:hAnsi="Calibri"/>
           <w:b/>
           <w:bCs/>
         </w:rPr>
@@ -2634,7 +2619,7 @@
       </w:r>
       <w:r>
         <w:rPr>
-          <w:rFonts w:ascii="Arial" w:cs="Arial" w:eastAsia="Arial" w:hAnsi="Arial"/>
+          <w:rFonts w:ascii="Calibri" w:cs="Calibri" w:eastAsia="Calibri" w:hAnsi="Calibri"/>
         </w:rPr>
         <w:t xml:space="preserve"> se firman las apps digitalmente para autorizar cuáles se pueden instalar.</w:t>
       </w:r>
@@ -2650,7 +2635,7 @@
       </w:pPr>
       <w:r>
         <w:rPr>
-          <w:rFonts w:ascii="Arial" w:cs="Arial" w:eastAsia="Arial" w:hAnsi="Arial"/>
+          <w:rFonts w:ascii="Calibri" w:cs="Calibri" w:eastAsia="Calibri" w:hAnsi="Calibri"/>
           <w:b/>
           <w:bCs/>
         </w:rPr>
@@ -2658,7 +2643,7 @@
       </w:r>
       <w:r>
         <w:rPr>
-          <w:rFonts w:ascii="Arial" w:cs="Arial" w:eastAsia="Arial" w:hAnsi="Arial"/>
+          <w:rFonts w:ascii="Calibri" w:cs="Calibri" w:eastAsia="Calibri" w:hAnsi="Calibri"/>
         </w:rPr>
         <w:t xml:space="preserve"> formas de saltarse las restricciones del dispositivo.</w:t>
       </w:r>
@@ -2674,7 +2659,7 @@
       </w:pPr>
       <w:r>
         <w:rPr>
-          <w:rFonts w:ascii="Arial" w:cs="Arial" w:eastAsia="Arial" w:hAnsi="Arial"/>
+          <w:rFonts w:ascii="Calibri" w:cs="Calibri" w:eastAsia="Calibri" w:hAnsi="Calibri"/>
           <w:b/>
           <w:bCs/>
         </w:rPr>
@@ -2682,7 +2667,7 @@
       </w:r>
       <w:r>
         <w:rPr>
-          <w:rFonts w:ascii="Arial" w:cs="Arial" w:eastAsia="Arial" w:hAnsi="Arial"/>
+          <w:rFonts w:ascii="Calibri" w:cs="Calibri" w:eastAsia="Calibri" w:hAnsi="Calibri"/>
         </w:rPr>
         <w:t xml:space="preserve"> bloqueo de pantalla, biometría, autenticación sensible al contexto, borrado remoto y cifrado completo del dispositivo.</w:t>
       </w:r>
@@ -2698,7 +2683,7 @@
       </w:pPr>
       <w:r>
         <w:rPr>
-          <w:rFonts w:ascii="Arial" w:cs="Arial" w:eastAsia="Arial" w:hAnsi="Arial"/>
+          <w:rFonts w:ascii="Calibri" w:cs="Calibri" w:eastAsia="Calibri" w:hAnsi="Calibri"/>
           <w:b/>
           <w:bCs/>
         </w:rPr>
@@ -2706,21 +2691,18 @@
       </w:r>
       <w:r>
         <w:rPr>
-          <w:rFonts w:ascii="Arial" w:cs="Arial" w:eastAsia="Arial" w:hAnsi="Arial"/>
+          <w:rFonts w:ascii="Calibri" w:cs="Calibri" w:eastAsia="Calibri" w:hAnsi="Calibri"/>
         </w:rPr>
         <w:t xml:space="preserve"> usa satélites y computadoras para ubicar el dispositivo.</w:t>
       </w:r>
     </w:p>
     <w:p>
       <w:pPr>
-        <w:pBdr>
-          <w:bottom w:val="single" w:color="000000" w:sz="8" w:space="2"/>
-        </w:pBdr>
         <w:spacing w:after="120" w:before="280"/>
       </w:pPr>
       <w:r>
         <w:rPr>
-          <w:rFonts w:ascii="Arial" w:cs="Arial" w:eastAsia="Arial" w:hAnsi="Arial"/>
+          <w:rFonts w:ascii="Calibri" w:cs="Calibri" w:eastAsia="Calibri" w:hAnsi="Calibri"/>
           <w:b/>
           <w:bCs/>
         </w:rPr>
@@ -2733,7 +2715,7 @@
       </w:pPr>
       <w:r>
         <w:rPr>
-          <w:rFonts w:ascii="Arial" w:cs="Arial" w:eastAsia="Arial" w:hAnsi="Arial"/>
+          <w:rFonts w:ascii="Calibri" w:cs="Calibri" w:eastAsia="Calibri" w:hAnsi="Calibri"/>
           <w:b/>
           <w:bCs/>
         </w:rPr>
@@ -2751,13 +2733,13 @@
       </w:pPr>
       <w:r>
         <w:rPr>
-          <w:rFonts w:ascii="Arial" w:cs="Arial" w:eastAsia="Arial" w:hAnsi="Arial"/>
+          <w:rFonts w:ascii="Calibri" w:cs="Calibri" w:eastAsia="Calibri" w:hAnsi="Calibri"/>
         </w:rPr>
         <w:t xml:space="preserve">Se basa en </w:t>
       </w:r>
       <w:r>
         <w:rPr>
-          <w:rFonts w:ascii="Arial" w:cs="Arial" w:eastAsia="Arial" w:hAnsi="Arial"/>
+          <w:rFonts w:ascii="Calibri" w:cs="Calibri" w:eastAsia="Calibri" w:hAnsi="Calibri"/>
           <w:b/>
           <w:bCs/>
         </w:rPr>
@@ -2765,7 +2747,7 @@
       </w:r>
       <w:r>
         <w:rPr>
-          <w:rFonts w:ascii="Arial" w:cs="Arial" w:eastAsia="Arial" w:hAnsi="Arial"/>
+          <w:rFonts w:ascii="Calibri" w:cs="Calibri" w:eastAsia="Calibri" w:hAnsi="Calibri"/>
         </w:rPr>
         <w:t xml:space="preserve">: eliminar puntos únicos de falla, dar un crossover confiable y detectar fallas a medida que ocurren.</w:t>
       </w:r>
@@ -2781,13 +2763,13 @@
       </w:pPr>
       <w:r>
         <w:rPr>
-          <w:rFonts w:ascii="Arial" w:cs="Arial" w:eastAsia="Arial" w:hAnsi="Arial"/>
+          <w:rFonts w:ascii="Calibri" w:cs="Calibri" w:eastAsia="Calibri" w:hAnsi="Calibri"/>
         </w:rPr>
         <w:t xml:space="preserve">Los </w:t>
       </w:r>
       <w:r>
         <w:rPr>
-          <w:rFonts w:ascii="Arial" w:cs="Arial" w:eastAsia="Arial" w:hAnsi="Arial"/>
+          <w:rFonts w:ascii="Calibri" w:cs="Calibri" w:eastAsia="Calibri" w:hAnsi="Calibri"/>
           <w:b/>
           <w:bCs/>
         </w:rPr>
@@ -2795,7 +2777,7 @@
       </w:r>
       <w:r>
         <w:rPr>
-          <w:rFonts w:ascii="Arial" w:cs="Arial" w:eastAsia="Arial" w:hAnsi="Arial"/>
+          <w:rFonts w:ascii="Calibri" w:cs="Calibri" w:eastAsia="Calibri" w:hAnsi="Calibri"/>
         </w:rPr>
         <w:t xml:space="preserve"> son 99,999 % de disponibilidad.</w:t>
       </w:r>
@@ -2811,7 +2793,7 @@
       </w:pPr>
       <w:r>
         <w:rPr>
-          <w:rFonts w:ascii="Arial" w:cs="Arial" w:eastAsia="Arial" w:hAnsi="Arial"/>
+          <w:rFonts w:ascii="Calibri" w:cs="Calibri" w:eastAsia="Calibri" w:hAnsi="Calibri"/>
           <w:b/>
           <w:bCs/>
         </w:rPr>
@@ -2819,7 +2801,7 @@
       </w:r>
       <w:r>
         <w:rPr>
-          <w:rFonts w:ascii="Arial" w:cs="Arial" w:eastAsia="Arial" w:hAnsi="Arial"/>
+          <w:rFonts w:ascii="Calibri" w:cs="Calibri" w:eastAsia="Calibri" w:hAnsi="Calibri"/>
         </w:rPr>
         <w:t xml:space="preserve"> usar los mismos componentes.</w:t>
       </w:r>
@@ -2835,7 +2817,7 @@
       </w:pPr>
       <w:r>
         <w:rPr>
-          <w:rFonts w:ascii="Arial" w:cs="Arial" w:eastAsia="Arial" w:hAnsi="Arial"/>
+          <w:rFonts w:ascii="Calibri" w:cs="Calibri" w:eastAsia="Calibri" w:hAnsi="Calibri"/>
           <w:b/>
           <w:bCs/>
         </w:rPr>
@@ -2843,7 +2825,7 @@
       </w:r>
       <w:r>
         <w:rPr>
-          <w:rFonts w:ascii="Arial" w:cs="Arial" w:eastAsia="Arial" w:hAnsi="Arial"/>
+          <w:rFonts w:ascii="Calibri" w:cs="Calibri" w:eastAsia="Calibri" w:hAnsi="Calibri"/>
         </w:rPr>
         <w:t xml:space="preserve"> varios dispositivos agrupados que, para el usuario, parecen una sola entidad.</w:t>
       </w:r>
@@ -2859,7 +2841,7 @@
       </w:pPr>
       <w:r>
         <w:rPr>
-          <w:rFonts w:ascii="Arial" w:cs="Arial" w:eastAsia="Arial" w:hAnsi="Arial"/>
+          <w:rFonts w:ascii="Calibri" w:cs="Calibri" w:eastAsia="Calibri" w:hAnsi="Calibri"/>
           <w:b/>
           <w:bCs/>
         </w:rPr>
@@ -2867,7 +2849,7 @@
       </w:r>
       <w:r>
         <w:rPr>
-          <w:rFonts w:ascii="Arial" w:cs="Arial" w:eastAsia="Arial" w:hAnsi="Arial"/>
+          <w:rFonts w:ascii="Calibri" w:cs="Calibri" w:eastAsia="Calibri" w:hAnsi="Calibri"/>
         </w:rPr>
         <w:t xml:space="preserve"> un sistema completo puede sustituir a otro que falló.</w:t>
       </w:r>
@@ -2878,7 +2860,7 @@
       </w:pPr>
       <w:r>
         <w:rPr>
-          <w:rFonts w:ascii="Arial" w:cs="Arial" w:eastAsia="Arial" w:hAnsi="Arial"/>
+          <w:rFonts w:ascii="Calibri" w:cs="Calibri" w:eastAsia="Calibri" w:hAnsi="Calibri"/>
           <w:b/>
           <w:bCs/>
         </w:rPr>
@@ -2896,7 +2878,7 @@
       </w:pPr>
       <w:r>
         <w:rPr>
-          <w:rFonts w:ascii="Arial" w:cs="Arial" w:eastAsia="Arial" w:hAnsi="Arial"/>
+          <w:rFonts w:ascii="Calibri" w:cs="Calibri" w:eastAsia="Calibri" w:hAnsi="Calibri"/>
         </w:rPr>
         <w:t xml:space="preserve">Puede ser una pieza de hardware, un proceso, un dato específico o una utilidad esencial.</w:t>
       </w:r>
@@ -2912,13 +2894,13 @@
       </w:pPr>
       <w:r>
         <w:rPr>
-          <w:rFonts w:ascii="Arial" w:cs="Arial" w:eastAsia="Arial" w:hAnsi="Arial"/>
+          <w:rFonts w:ascii="Calibri" w:cs="Calibri" w:eastAsia="Calibri" w:hAnsi="Calibri"/>
         </w:rPr>
         <w:t xml:space="preserve">La solución es modificar la operación crítica para que no dependa de un solo elemento, usando </w:t>
       </w:r>
       <w:r>
         <w:rPr>
-          <w:rFonts w:ascii="Arial" w:cs="Arial" w:eastAsia="Arial" w:hAnsi="Arial"/>
+          <w:rFonts w:ascii="Calibri" w:cs="Calibri" w:eastAsia="Calibri" w:hAnsi="Calibri"/>
           <w:b/>
           <w:bCs/>
         </w:rPr>
@@ -2926,7 +2908,7 @@
       </w:r>
       <w:r>
         <w:rPr>
-          <w:rFonts w:ascii="Arial" w:cs="Arial" w:eastAsia="Arial" w:hAnsi="Arial"/>
+          <w:rFonts w:ascii="Calibri" w:cs="Calibri" w:eastAsia="Calibri" w:hAnsi="Calibri"/>
         </w:rPr>
         <w:t xml:space="preserve">.</w:t>
       </w:r>
@@ -2942,7 +2924,7 @@
       </w:pPr>
       <w:r>
         <w:rPr>
-          <w:rFonts w:ascii="Arial" w:cs="Arial" w:eastAsia="Arial" w:hAnsi="Arial"/>
+          <w:rFonts w:ascii="Calibri" w:cs="Calibri" w:eastAsia="Calibri" w:hAnsi="Calibri"/>
           <w:b/>
           <w:bCs/>
         </w:rPr>
@@ -2950,7 +2932,7 @@
       </w:r>
       <w:r>
         <w:rPr>
-          <w:rFonts w:ascii="Arial" w:cs="Arial" w:eastAsia="Arial" w:hAnsi="Arial"/>
+          <w:rFonts w:ascii="Calibri" w:cs="Calibri" w:eastAsia="Calibri" w:hAnsi="Calibri"/>
         </w:rPr>
         <w:t xml:space="preserve"> los componentes (N) necesitan al menos un componente de respaldo (+1).</w:t>
       </w:r>
@@ -2961,7 +2943,7 @@
       </w:pPr>
       <w:r>
         <w:rPr>
-          <w:rFonts w:ascii="Arial" w:cs="Arial" w:eastAsia="Arial" w:hAnsi="Arial"/>
+          <w:rFonts w:ascii="Calibri" w:cs="Calibri" w:eastAsia="Calibri" w:hAnsi="Calibri"/>
           <w:b/>
           <w:bCs/>
         </w:rPr>
@@ -2979,7 +2961,7 @@
       </w:pPr>
       <w:r>
         <w:rPr>
-          <w:rFonts w:ascii="Arial" w:cs="Arial" w:eastAsia="Arial" w:hAnsi="Arial"/>
+          <w:rFonts w:ascii="Calibri" w:cs="Calibri" w:eastAsia="Calibri" w:hAnsi="Calibri"/>
         </w:rPr>
         <w:t xml:space="preserve">Es una matriz redundante de discos independientes.</w:t>
       </w:r>
@@ -2995,13 +2977,13 @@
       </w:pPr>
       <w:r>
         <w:rPr>
-          <w:rFonts w:ascii="Arial" w:cs="Arial" w:eastAsia="Arial" w:hAnsi="Arial"/>
+          <w:rFonts w:ascii="Calibri" w:cs="Calibri" w:eastAsia="Calibri" w:hAnsi="Calibri"/>
         </w:rPr>
         <w:t xml:space="preserve">Toma datos de un solo disco y los </w:t>
       </w:r>
       <w:r>
         <w:rPr>
-          <w:rFonts w:ascii="Arial" w:cs="Arial" w:eastAsia="Arial" w:hAnsi="Arial"/>
+          <w:rFonts w:ascii="Calibri" w:cs="Calibri" w:eastAsia="Calibri" w:hAnsi="Calibri"/>
           <w:b/>
           <w:bCs/>
         </w:rPr>
@@ -3009,7 +2991,7 @@
       </w:r>
       <w:r>
         <w:rPr>
-          <w:rFonts w:ascii="Arial" w:cs="Arial" w:eastAsia="Arial" w:hAnsi="Arial"/>
+          <w:rFonts w:ascii="Calibri" w:cs="Calibri" w:eastAsia="Calibri" w:hAnsi="Calibri"/>
         </w:rPr>
         <w:t xml:space="preserve">.</w:t>
       </w:r>
@@ -3025,13 +3007,13 @@
       </w:pPr>
       <w:r>
         <w:rPr>
-          <w:rFonts w:ascii="Arial" w:cs="Arial" w:eastAsia="Arial" w:hAnsi="Arial"/>
+          <w:rFonts w:ascii="Calibri" w:cs="Calibri" w:eastAsia="Calibri" w:hAnsi="Calibri"/>
         </w:rPr>
         <w:t xml:space="preserve">Excepto en </w:t>
       </w:r>
       <w:r>
         <w:rPr>
-          <w:rFonts w:ascii="Arial" w:cs="Arial" w:eastAsia="Arial" w:hAnsi="Arial"/>
+          <w:rFonts w:ascii="Calibri" w:cs="Calibri" w:eastAsia="Calibri" w:hAnsi="Calibri"/>
           <w:b/>
           <w:bCs/>
         </w:rPr>
@@ -3039,7 +3021,7 @@
       </w:r>
       <w:r>
         <w:rPr>
-          <w:rFonts w:ascii="Arial" w:cs="Arial" w:eastAsia="Arial" w:hAnsi="Arial"/>
+          <w:rFonts w:ascii="Calibri" w:cs="Calibri" w:eastAsia="Calibri" w:hAnsi="Calibri"/>
         </w:rPr>
         <w:t xml:space="preserve">, si se pierde un disco los datos se recuperan de los otros.</w:t>
       </w:r>
@@ -3050,7 +3032,7 @@
       </w:pPr>
       <w:r>
         <w:rPr>
-          <w:rFonts w:ascii="Arial" w:cs="Arial" w:eastAsia="Arial" w:hAnsi="Arial"/>
+          <w:rFonts w:ascii="Calibri" w:cs="Calibri" w:eastAsia="Calibri" w:hAnsi="Calibri"/>
           <w:b/>
           <w:bCs/>
         </w:rPr>
@@ -3068,7 +3050,7 @@
       </w:pPr>
       <w:r>
         <w:rPr>
-          <w:rFonts w:ascii="Arial" w:cs="Arial" w:eastAsia="Arial" w:hAnsi="Arial"/>
+          <w:rFonts w:ascii="Calibri" w:cs="Calibri" w:eastAsia="Calibri" w:hAnsi="Calibri"/>
           <w:b/>
           <w:bCs/>
         </w:rPr>
@@ -3076,7 +3058,7 @@
       </w:r>
       <w:r>
         <w:rPr>
-          <w:rFonts w:ascii="Arial" w:cs="Arial" w:eastAsia="Arial" w:hAnsi="Arial"/>
+          <w:rFonts w:ascii="Calibri" w:cs="Calibri" w:eastAsia="Calibri" w:hAnsi="Calibri"/>
         </w:rPr>
         <w:t xml:space="preserve"> evita bucles cuando los switches se interconectan por varias rutas. Deja una sola ruta lógica activa entre los destinos.</w:t>
       </w:r>
@@ -3092,7 +3074,7 @@
       </w:pPr>
       <w:r>
         <w:rPr>
-          <w:rFonts w:ascii="Arial" w:cs="Arial" w:eastAsia="Arial" w:hAnsi="Arial"/>
+          <w:rFonts w:ascii="Calibri" w:cs="Calibri" w:eastAsia="Calibri" w:hAnsi="Calibri"/>
           <w:b/>
           <w:bCs/>
         </w:rPr>
@@ -3100,13 +3082,13 @@
       </w:r>
       <w:r>
         <w:rPr>
-          <w:rFonts w:ascii="Arial" w:cs="Arial" w:eastAsia="Arial" w:hAnsi="Arial"/>
+          <w:rFonts w:ascii="Calibri" w:cs="Calibri" w:eastAsia="Calibri" w:hAnsi="Calibri"/>
         </w:rPr>
         <w:t xml:space="preserve"> es el router que da acceso al resto de la red o a Internet. Si hay uno solo, es un punto único de falla, así que hay que instalar </w:t>
       </w:r>
       <w:r>
         <w:rPr>
-          <w:rFonts w:ascii="Arial" w:cs="Arial" w:eastAsia="Arial" w:hAnsi="Arial"/>
+          <w:rFonts w:ascii="Calibri" w:cs="Calibri" w:eastAsia="Calibri" w:hAnsi="Calibri"/>
           <w:b/>
           <w:bCs/>
         </w:rPr>
@@ -3114,7 +3096,7 @@
       </w:r>
       <w:r>
         <w:rPr>
-          <w:rFonts w:ascii="Arial" w:cs="Arial" w:eastAsia="Arial" w:hAnsi="Arial"/>
+          <w:rFonts w:ascii="Calibri" w:cs="Calibri" w:eastAsia="Calibri" w:hAnsi="Calibri"/>
         </w:rPr>
         <w:t xml:space="preserve">.</w:t>
       </w:r>
@@ -3125,7 +3107,7 @@
       </w:pPr>
       <w:r>
         <w:rPr>
-          <w:rFonts w:ascii="Arial" w:cs="Arial" w:eastAsia="Arial" w:hAnsi="Arial"/>
+          <w:rFonts w:ascii="Calibri" w:cs="Calibri" w:eastAsia="Calibri" w:hAnsi="Calibri"/>
           <w:b/>
           <w:bCs/>
         </w:rPr>
@@ -3143,13 +3125,13 @@
       </w:pPr>
       <w:r>
         <w:rPr>
-          <w:rFonts w:ascii="Arial" w:cs="Arial" w:eastAsia="Arial" w:hAnsi="Arial"/>
+          <w:rFonts w:ascii="Calibri" w:cs="Calibri" w:eastAsia="Calibri" w:hAnsi="Calibri"/>
         </w:rPr>
         <w:t xml:space="preserve">Tipos de replicación: </w:t>
       </w:r>
       <w:r>
         <w:rPr>
-          <w:rFonts w:ascii="Arial" w:cs="Arial" w:eastAsia="Arial" w:hAnsi="Arial"/>
+          <w:rFonts w:ascii="Calibri" w:cs="Calibri" w:eastAsia="Calibri" w:hAnsi="Calibri"/>
           <w:b/>
           <w:bCs/>
         </w:rPr>
@@ -3157,13 +3139,13 @@
       </w:r>
       <w:r>
         <w:rPr>
-          <w:rFonts w:ascii="Arial" w:cs="Arial" w:eastAsia="Arial" w:hAnsi="Arial"/>
+          <w:rFonts w:ascii="Calibri" w:cs="Calibri" w:eastAsia="Calibri" w:hAnsi="Calibri"/>
         </w:rPr>
         <w:t xml:space="preserve">, </w:t>
       </w:r>
       <w:r>
         <w:rPr>
-          <w:rFonts w:ascii="Arial" w:cs="Arial" w:eastAsia="Arial" w:hAnsi="Arial"/>
+          <w:rFonts w:ascii="Calibri" w:cs="Calibri" w:eastAsia="Calibri" w:hAnsi="Calibri"/>
           <w:b/>
           <w:bCs/>
         </w:rPr>
@@ -3171,13 +3153,13 @@
       </w:r>
       <w:r>
         <w:rPr>
-          <w:rFonts w:ascii="Arial" w:cs="Arial" w:eastAsia="Arial" w:hAnsi="Arial"/>
+          <w:rFonts w:ascii="Calibri" w:cs="Calibri" w:eastAsia="Calibri" w:hAnsi="Calibri"/>
         </w:rPr>
         <w:t xml:space="preserve"> y </w:t>
       </w:r>
       <w:r>
         <w:rPr>
-          <w:rFonts w:ascii="Arial" w:cs="Arial" w:eastAsia="Arial" w:hAnsi="Arial"/>
+          <w:rFonts w:ascii="Calibri" w:cs="Calibri" w:eastAsia="Calibri" w:hAnsi="Calibri"/>
           <w:b/>
           <w:bCs/>
         </w:rPr>
@@ -3185,7 +3167,7 @@
       </w:r>
       <w:r>
         <w:rPr>
-          <w:rFonts w:ascii="Arial" w:cs="Arial" w:eastAsia="Arial" w:hAnsi="Arial"/>
+          <w:rFonts w:ascii="Calibri" w:cs="Calibri" w:eastAsia="Calibri" w:hAnsi="Calibri"/>
         </w:rPr>
         <w:t xml:space="preserve">.</w:t>
       </w:r>
@@ -3201,7 +3183,7 @@
       </w:pPr>
       <w:r>
         <w:rPr>
-          <w:rFonts w:ascii="Arial" w:cs="Arial" w:eastAsia="Arial" w:hAnsi="Arial"/>
+          <w:rFonts w:ascii="Calibri" w:cs="Calibri" w:eastAsia="Calibri" w:hAnsi="Calibri"/>
         </w:rPr>
         <w:t xml:space="preserve">Soluciones de resiliencia para aplicaciones: hardware tolerante a fallas, arquitectura de clúster y copia de respaldo y restauración.</w:t>
       </w:r>
@@ -3217,13 +3199,13 @@
       </w:pPr>
       <w:r>
         <w:rPr>
-          <w:rFonts w:ascii="Arial" w:cs="Arial" w:eastAsia="Arial" w:hAnsi="Arial"/>
+          <w:rFonts w:ascii="Calibri" w:cs="Calibri" w:eastAsia="Calibri" w:hAnsi="Calibri"/>
         </w:rPr>
         <w:t xml:space="preserve">Las copias de seguridad deben hacerse </w:t>
       </w:r>
       <w:r>
         <w:rPr>
-          <w:rFonts w:ascii="Arial" w:cs="Arial" w:eastAsia="Arial" w:hAnsi="Arial"/>
+          <w:rFonts w:ascii="Calibri" w:cs="Calibri" w:eastAsia="Calibri" w:hAnsi="Calibri"/>
           <w:b/>
           <w:bCs/>
         </w:rPr>
@@ -3231,13 +3213,13 @@
       </w:r>
       <w:r>
         <w:rPr>
-          <w:rFonts w:ascii="Arial" w:cs="Arial" w:eastAsia="Arial" w:hAnsi="Arial"/>
+          <w:rFonts w:ascii="Calibri" w:cs="Calibri" w:eastAsia="Calibri" w:hAnsi="Calibri"/>
         </w:rPr>
         <w:t xml:space="preserve"> y guardarse </w:t>
       </w:r>
       <w:r>
         <w:rPr>
-          <w:rFonts w:ascii="Arial" w:cs="Arial" w:eastAsia="Arial" w:hAnsi="Arial"/>
+          <w:rFonts w:ascii="Calibri" w:cs="Calibri" w:eastAsia="Calibri" w:hAnsi="Calibri"/>
           <w:b/>
           <w:bCs/>
         </w:rPr>
@@ -3245,7 +3227,7 @@
       </w:r>
       <w:r>
         <w:rPr>
-          <w:rFonts w:ascii="Arial" w:cs="Arial" w:eastAsia="Arial" w:hAnsi="Arial"/>
+          <w:rFonts w:ascii="Calibri" w:cs="Calibri" w:eastAsia="Calibri" w:hAnsi="Calibri"/>
         </w:rPr>
         <w:t xml:space="preserve">, por si pasa algo en las principales.</w:t>
       </w:r>
@@ -3256,7 +3238,7 @@
       </w:pPr>
       <w:r>
         <w:rPr>
-          <w:rFonts w:ascii="Arial" w:cs="Arial" w:eastAsia="Arial" w:hAnsi="Arial"/>
+          <w:rFonts w:ascii="Calibri" w:cs="Calibri" w:eastAsia="Calibri" w:hAnsi="Calibri"/>
           <w:b/>
           <w:bCs/>
         </w:rPr>
@@ -3274,7 +3256,7 @@
       </w:pPr>
       <w:r>
         <w:rPr>
-          <w:rFonts w:ascii="Arial" w:cs="Arial" w:eastAsia="Arial" w:hAnsi="Arial"/>
+          <w:rFonts w:ascii="Calibri" w:cs="Calibri" w:eastAsia="Calibri" w:hAnsi="Calibri"/>
         </w:rPr>
         <w:t xml:space="preserve">Se necesita suministro continuo de energía eléctrica.</w:t>
       </w:r>
@@ -3290,7 +3272,7 @@
       </w:pPr>
       <w:r>
         <w:rPr>
-          <w:rFonts w:ascii="Arial" w:cs="Arial" w:eastAsia="Arial" w:hAnsi="Arial"/>
+          <w:rFonts w:ascii="Calibri" w:cs="Calibri" w:eastAsia="Calibri" w:hAnsi="Calibri"/>
           <w:b/>
           <w:bCs/>
         </w:rPr>
@@ -3298,7 +3280,7 @@
       </w:r>
       <w:r>
         <w:rPr>
-          <w:rFonts w:ascii="Arial" w:cs="Arial" w:eastAsia="Arial" w:hAnsi="Arial"/>
+          <w:rFonts w:ascii="Calibri" w:cs="Calibri" w:eastAsia="Calibri" w:hAnsi="Calibri"/>
         </w:rPr>
         <w:t xml:space="preserve"> (calefacción, ventilación y aire acondicionado): controla temperatura, humedad y flujo de aire.</w:t>
       </w:r>
@@ -3314,7 +3296,7 @@
       </w:pPr>
       <w:r>
         <w:rPr>
-          <w:rFonts w:ascii="Arial" w:cs="Arial" w:eastAsia="Arial" w:hAnsi="Arial"/>
+          <w:rFonts w:ascii="Calibri" w:cs="Calibri" w:eastAsia="Calibri" w:hAnsi="Calibri"/>
         </w:rPr>
         <w:t xml:space="preserve">Se debe manejar junto con hardware, cableado, almacenamiento, protección contra incendios, seguridad física y alimentación.</w:t>
       </w:r>
@@ -3330,21 +3312,18 @@
       </w:pPr>
       <w:r>
         <w:rPr>
-          <w:rFonts w:ascii="Arial" w:cs="Arial" w:eastAsia="Arial" w:hAnsi="Arial"/>
+          <w:rFonts w:ascii="Calibri" w:cs="Calibri" w:eastAsia="Calibri" w:hAnsi="Calibri"/>
         </w:rPr>
         <w:t xml:space="preserve">Los requisitos ambientales están en las especificaciones del producto y las guías de planificación física.</w:t>
       </w:r>
     </w:p>
     <w:p>
       <w:pPr>
-        <w:pBdr>
-          <w:bottom w:val="single" w:color="000000" w:sz="8" w:space="2"/>
-        </w:pBdr>
         <w:spacing w:after="120" w:before="280"/>
       </w:pPr>
       <w:r>
         <w:rPr>
-          <w:rFonts w:ascii="Arial" w:cs="Arial" w:eastAsia="Arial" w:hAnsi="Arial"/>
+          <w:rFonts w:ascii="Calibri" w:cs="Calibri" w:eastAsia="Calibri" w:hAnsi="Calibri"/>
           <w:b/>
           <w:bCs/>
         </w:rPr>
@@ -3357,7 +3336,7 @@
       </w:pPr>
       <w:r>
         <w:rPr>
-          <w:rFonts w:ascii="Arial" w:cs="Arial" w:eastAsia="Arial" w:hAnsi="Arial"/>
+          <w:rFonts w:ascii="Calibri" w:cs="Calibri" w:eastAsia="Calibri" w:hAnsi="Calibri"/>
           <w:b/>
           <w:bCs/>
         </w:rPr>
@@ -3375,7 +3354,7 @@
       </w:pPr>
       <w:r>
         <w:rPr>
-          <w:rFonts w:ascii="Arial" w:cs="Arial" w:eastAsia="Arial" w:hAnsi="Arial"/>
+          <w:rFonts w:ascii="Calibri" w:cs="Calibri" w:eastAsia="Calibri" w:hAnsi="Calibri"/>
           <w:b/>
           <w:bCs/>
         </w:rPr>
@@ -3383,7 +3362,7 @@
       </w:r>
       <w:r>
         <w:rPr>
-          <w:rFonts w:ascii="Arial" w:cs="Arial" w:eastAsia="Arial" w:hAnsi="Arial"/>
+          <w:rFonts w:ascii="Calibri" w:cs="Calibri" w:eastAsia="Calibri" w:hAnsi="Calibri"/>
         </w:rPr>
         <w:t xml:space="preserve"> demostró que un ciberataque puede destruir o interrumpir infraestructura crítica.</w:t>
       </w:r>
@@ -3399,13 +3378,13 @@
       </w:pPr>
       <w:r>
         <w:rPr>
-          <w:rFonts w:ascii="Arial" w:cs="Arial" w:eastAsia="Arial" w:hAnsi="Arial"/>
+          <w:rFonts w:ascii="Calibri" w:cs="Calibri" w:eastAsia="Calibri" w:hAnsi="Calibri"/>
         </w:rPr>
         <w:t xml:space="preserve">Para evitar ataques, hay que </w:t>
       </w:r>
       <w:r>
         <w:rPr>
-          <w:rFonts w:ascii="Arial" w:cs="Arial" w:eastAsia="Arial" w:hAnsi="Arial"/>
+          <w:rFonts w:ascii="Calibri" w:cs="Calibri" w:eastAsia="Calibri" w:hAnsi="Calibri"/>
           <w:b/>
           <w:bCs/>
         </w:rPr>
@@ -3413,13 +3392,13 @@
       </w:r>
       <w:r>
         <w:rPr>
-          <w:rFonts w:ascii="Arial" w:cs="Arial" w:eastAsia="Arial" w:hAnsi="Arial"/>
+          <w:rFonts w:ascii="Calibri" w:cs="Calibri" w:eastAsia="Calibri" w:hAnsi="Calibri"/>
         </w:rPr>
         <w:t xml:space="preserve">, separando la red </w:t>
       </w:r>
       <w:r>
         <w:rPr>
-          <w:rFonts w:ascii="Arial" w:cs="Arial" w:eastAsia="Arial" w:hAnsi="Arial"/>
+          <w:rFonts w:ascii="Calibri" w:cs="Calibri" w:eastAsia="Calibri" w:hAnsi="Calibri"/>
           <w:b/>
           <w:bCs/>
         </w:rPr>
@@ -3427,7 +3406,7 @@
       </w:r>
       <w:r>
         <w:rPr>
-          <w:rFonts w:ascii="Arial" w:cs="Arial" w:eastAsia="Arial" w:hAnsi="Arial"/>
+          <w:rFonts w:ascii="Calibri" w:cs="Calibri" w:eastAsia="Calibri" w:hAnsi="Calibri"/>
         </w:rPr>
         <w:t xml:space="preserve"> de la LAN de la organización.</w:t>
       </w:r>
@@ -3438,7 +3417,7 @@
       </w:pPr>
       <w:r>
         <w:rPr>
-          <w:rFonts w:ascii="Arial" w:cs="Arial" w:eastAsia="Arial" w:hAnsi="Arial"/>
+          <w:rFonts w:ascii="Calibri" w:cs="Calibri" w:eastAsia="Calibri" w:hAnsi="Calibri"/>
           <w:b/>
           <w:bCs/>
         </w:rPr>
@@ -3456,7 +3435,7 @@
       </w:pPr>
       <w:r>
         <w:rPr>
-          <w:rFonts w:ascii="Arial" w:cs="Arial" w:eastAsia="Arial" w:hAnsi="Arial"/>
+          <w:rFonts w:ascii="Calibri" w:cs="Calibri" w:eastAsia="Calibri" w:hAnsi="Calibri"/>
         </w:rPr>
         <w:t xml:space="preserve">Es el conjunto de tecnologías que conectan varios dispositivos a Internet.</w:t>
       </w:r>
@@ -3472,13 +3451,13 @@
       </w:pPr>
       <w:r>
         <w:rPr>
-          <w:rFonts w:ascii="Arial" w:cs="Arial" w:eastAsia="Arial" w:hAnsi="Arial"/>
+          <w:rFonts w:ascii="Calibri" w:cs="Calibri" w:eastAsia="Calibri" w:hAnsi="Calibri"/>
         </w:rPr>
         <w:t xml:space="preserve">La mayoría se conecta por tecnología inalámbrica y usa </w:t>
       </w:r>
       <w:r>
         <w:rPr>
-          <w:rFonts w:ascii="Arial" w:cs="Arial" w:eastAsia="Arial" w:hAnsi="Arial"/>
+          <w:rFonts w:ascii="Calibri" w:cs="Calibri" w:eastAsia="Calibri" w:hAnsi="Calibri"/>
           <w:b/>
           <w:bCs/>
         </w:rPr>
@@ -3486,7 +3465,7 @@
       </w:r>
       <w:r>
         <w:rPr>
-          <w:rFonts w:ascii="Arial" w:cs="Arial" w:eastAsia="Arial" w:hAnsi="Arial"/>
+          <w:rFonts w:ascii="Calibri" w:cs="Calibri" w:eastAsia="Calibri" w:hAnsi="Calibri"/>
         </w:rPr>
         <w:t xml:space="preserve">.</w:t>
       </w:r>
@@ -3502,13 +3481,13 @@
       </w:pPr>
       <w:r>
         <w:rPr>
-          <w:rFonts w:ascii="Arial" w:cs="Arial" w:eastAsia="Arial" w:hAnsi="Arial"/>
+          <w:rFonts w:ascii="Calibri" w:cs="Calibri" w:eastAsia="Calibri" w:hAnsi="Calibri"/>
         </w:rPr>
         <w:t xml:space="preserve">La expansión de datos creó el </w:t>
       </w:r>
       <w:r>
         <w:rPr>
-          <w:rFonts w:ascii="Arial" w:cs="Arial" w:eastAsia="Arial" w:hAnsi="Arial"/>
+          <w:rFonts w:ascii="Calibri" w:cs="Calibri" w:eastAsia="Calibri" w:hAnsi="Calibri"/>
           <w:b/>
           <w:bCs/>
         </w:rPr>
@@ -3516,7 +3495,7 @@
       </w:r>
       <w:r>
         <w:rPr>
-          <w:rFonts w:ascii="Arial" w:cs="Arial" w:eastAsia="Arial" w:hAnsi="Arial"/>
+          <w:rFonts w:ascii="Calibri" w:cs="Calibri" w:eastAsia="Calibri" w:hAnsi="Calibri"/>
         </w:rPr>
         <w:t xml:space="preserve">.</w:t>
       </w:r>
@@ -3532,7 +3511,7 @@
       </w:pPr>
       <w:r>
         <w:rPr>
-          <w:rFonts w:ascii="Arial" w:cs="Arial" w:eastAsia="Arial" w:hAnsi="Arial"/>
+          <w:rFonts w:ascii="Calibri" w:cs="Calibri" w:eastAsia="Calibri" w:hAnsi="Calibri"/>
           <w:b/>
           <w:bCs/>
         </w:rPr>
@@ -3540,7 +3519,7 @@
       </w:r>
       <w:r>
         <w:rPr>
-          <w:rFonts w:ascii="Arial" w:cs="Arial" w:eastAsia="Arial" w:hAnsi="Arial"/>
+          <w:rFonts w:ascii="Calibri" w:cs="Calibri" w:eastAsia="Calibri" w:hAnsi="Calibri"/>
         </w:rPr>
         <w:t xml:space="preserve"> capturan, almacenan y acceden a datos.</w:t>
       </w:r>
@@ -3556,13 +3535,13 @@
       </w:pPr>
       <w:r>
         <w:rPr>
-          <w:rFonts w:ascii="Arial" w:cs="Arial" w:eastAsia="Arial" w:hAnsi="Arial"/>
+          <w:rFonts w:ascii="Calibri" w:cs="Calibri" w:eastAsia="Calibri" w:hAnsi="Calibri"/>
         </w:rPr>
         <w:t xml:space="preserve">Son susceptibles a </w:t>
       </w:r>
       <w:r>
         <w:rPr>
-          <w:rFonts w:ascii="Arial" w:cs="Arial" w:eastAsia="Arial" w:hAnsi="Arial"/>
+          <w:rFonts w:ascii="Calibri" w:cs="Calibri" w:eastAsia="Calibri" w:hAnsi="Calibri"/>
           <w:b/>
           <w:bCs/>
         </w:rPr>
@@ -3570,7 +3549,7 @@
       </w:r>
       <w:r>
         <w:rPr>
-          <w:rFonts w:ascii="Arial" w:cs="Arial" w:eastAsia="Arial" w:hAnsi="Arial"/>
+          <w:rFonts w:ascii="Calibri" w:cs="Calibri" w:eastAsia="Calibri" w:hAnsi="Calibri"/>
         </w:rPr>
         <w:t xml:space="preserve">: los atacantes descubren vulnerabilidades midiendo cuánto tarda el sistema en responder a distintas entradas.</w:t>
       </w:r>
@@ -3586,7 +3565,7 @@
       </w:pPr>
       <w:r>
         <w:rPr>
-          <w:rFonts w:ascii="Arial" w:cs="Arial" w:eastAsia="Arial" w:hAnsi="Arial"/>
+          <w:rFonts w:ascii="Calibri" w:cs="Calibri" w:eastAsia="Calibri" w:hAnsi="Calibri"/>
           <w:b/>
           <w:bCs/>
         </w:rPr>
@@ -3594,7 +3573,7 @@
       </w:r>
       <w:r>
         <w:rPr>
-          <w:rFonts w:ascii="Arial" w:cs="Arial" w:eastAsia="Arial" w:hAnsi="Arial"/>
+          <w:rFonts w:ascii="Calibri" w:cs="Calibri" w:eastAsia="Calibri" w:hAnsi="Calibri"/>
         </w:rPr>
         <w:t xml:space="preserve"> módulo de hardware de factor de forma pequeño (SFF). Ejemplos: Raspberry Pi y Arduino.</w:t>
       </w:r>
@@ -3610,13 +3589,13 @@
       </w:pPr>
       <w:r>
         <w:rPr>
-          <w:rFonts w:ascii="Arial" w:cs="Arial" w:eastAsia="Arial" w:hAnsi="Arial"/>
+          <w:rFonts w:ascii="Calibri" w:cs="Calibri" w:eastAsia="Calibri" w:hAnsi="Calibri"/>
         </w:rPr>
         <w:t xml:space="preserve">Estos dispositivos pueden implementarse con </w:t>
       </w:r>
       <w:r>
         <w:rPr>
-          <w:rFonts w:ascii="Arial" w:cs="Arial" w:eastAsia="Arial" w:hAnsi="Arial"/>
+          <w:rFonts w:ascii="Calibri" w:cs="Calibri" w:eastAsia="Calibri" w:hAnsi="Calibri"/>
           <w:b/>
           <w:bCs/>
         </w:rPr>
@@ -3624,7 +3603,7 @@
       </w:r>
       <w:r>
         <w:rPr>
-          <w:rFonts w:ascii="Arial" w:cs="Arial" w:eastAsia="Arial" w:hAnsi="Arial"/>
+          <w:rFonts w:ascii="Calibri" w:cs="Calibri" w:eastAsia="Calibri" w:hAnsi="Calibri"/>
         </w:rPr>
         <w:t xml:space="preserve">, un circuito integrado programable en campo.</w:t>
       </w:r>
@@ -3640,7 +3619,7 @@
       </w:pPr>
       <w:r>
         <w:rPr>
-          <w:rFonts w:ascii="Arial" w:cs="Arial" w:eastAsia="Arial" w:hAnsi="Arial"/>
+          <w:rFonts w:ascii="Calibri" w:cs="Calibri" w:eastAsia="Calibri" w:hAnsi="Calibri"/>
           <w:b/>
           <w:bCs/>
         </w:rPr>
@@ -3648,7 +3627,7 @@
       </w:r>
       <w:r>
         <w:rPr>
-          <w:rFonts w:ascii="Arial" w:cs="Arial" w:eastAsia="Arial" w:hAnsi="Arial"/>
+          <w:rFonts w:ascii="Calibri" w:cs="Calibri" w:eastAsia="Calibri" w:hAnsi="Calibri"/>
         </w:rPr>
         <w:t xml:space="preserve"> es un escáner de IoT. Con él es fácil saber si un dispositivo de domótica es vulnerable.</w:t>
       </w:r>
@@ -3664,7 +3643,7 @@
       </w:pPr>
       <w:r>
         <w:rPr>
-          <w:rFonts w:ascii="Arial" w:cs="Arial" w:eastAsia="Arial" w:hAnsi="Arial"/>
+          <w:rFonts w:ascii="Calibri" w:cs="Calibri" w:eastAsia="Calibri" w:hAnsi="Calibri"/>
         </w:rPr>
         <w:t xml:space="preserve">Comunicación del IoT: corto, mediano o largo alcance, celular (4G, 5G) o radio.</w:t>
       </w:r>
@@ -3675,7 +3654,7 @@
       </w:pPr>
       <w:r>
         <w:rPr>
-          <w:rFonts w:ascii="Arial" w:cs="Arial" w:eastAsia="Arial" w:hAnsi="Arial"/>
+          <w:rFonts w:ascii="Calibri" w:cs="Calibri" w:eastAsia="Calibri" w:hAnsi="Calibri"/>
           <w:b/>
           <w:bCs/>
         </w:rPr>
@@ -3693,7 +3672,7 @@
       </w:pPr>
       <w:r>
         <w:rPr>
-          <w:rFonts w:ascii="Arial" w:cs="Arial" w:eastAsia="Arial" w:hAnsi="Arial"/>
+          <w:rFonts w:ascii="Calibri" w:cs="Calibri" w:eastAsia="Calibri" w:hAnsi="Calibri"/>
         </w:rPr>
         <w:t xml:space="preserve">Necesita conexión a Internet y teléfono.</w:t>
       </w:r>
@@ -3709,7 +3688,7 @@
       </w:pPr>
       <w:r>
         <w:rPr>
-          <w:rFonts w:ascii="Arial" w:cs="Arial" w:eastAsia="Arial" w:hAnsi="Arial"/>
+          <w:rFonts w:ascii="Calibri" w:cs="Calibri" w:eastAsia="Calibri" w:hAnsi="Calibri"/>
         </w:rPr>
         <w:t xml:space="preserve">Es tan confiable como la seguridad de la red subyacente.</w:t>
       </w:r>
@@ -3725,13 +3704,13 @@
       </w:pPr>
       <w:r>
         <w:rPr>
-          <w:rFonts w:ascii="Arial" w:cs="Arial" w:eastAsia="Arial" w:hAnsi="Arial"/>
+          <w:rFonts w:ascii="Calibri" w:cs="Calibri" w:eastAsia="Calibri" w:hAnsi="Calibri"/>
         </w:rPr>
         <w:t xml:space="preserve">Dos medidas: </w:t>
       </w:r>
       <w:r>
         <w:rPr>
-          <w:rFonts w:ascii="Arial" w:cs="Arial" w:eastAsia="Arial" w:hAnsi="Arial"/>
+          <w:rFonts w:ascii="Calibri" w:cs="Calibri" w:eastAsia="Calibri" w:hAnsi="Calibri"/>
           <w:b/>
           <w:bCs/>
         </w:rPr>
@@ -3739,13 +3718,13 @@
       </w:r>
       <w:r>
         <w:rPr>
-          <w:rFonts w:ascii="Arial" w:cs="Arial" w:eastAsia="Arial" w:hAnsi="Arial"/>
+          <w:rFonts w:ascii="Calibri" w:cs="Calibri" w:eastAsia="Calibri" w:hAnsi="Calibri"/>
         </w:rPr>
         <w:t xml:space="preserve"> contra escuchas y usar </w:t>
       </w:r>
       <w:r>
         <w:rPr>
-          <w:rFonts w:ascii="Arial" w:cs="Arial" w:eastAsia="Arial" w:hAnsi="Arial"/>
+          <w:rFonts w:ascii="Calibri" w:cs="Calibri" w:eastAsia="Calibri" w:hAnsi="Calibri"/>
           <w:b/>
           <w:bCs/>
         </w:rPr>
@@ -3753,7 +3732,7 @@
       </w:r>
       <w:r>
         <w:rPr>
-          <w:rFonts w:ascii="Arial" w:cs="Arial" w:eastAsia="Arial" w:hAnsi="Arial"/>
+          <w:rFonts w:ascii="Calibri" w:cs="Calibri" w:eastAsia="Calibri" w:hAnsi="Calibri"/>
         </w:rPr>
         <w:t xml:space="preserve"> para proteger gateways y switches.</w:t>
       </w:r>
@@ -3764,7 +3743,7 @@
       </w:pPr>
       <w:r>
         <w:rPr>
-          <w:rFonts w:ascii="Arial" w:cs="Arial" w:eastAsia="Arial" w:hAnsi="Arial"/>
+          <w:rFonts w:ascii="Calibri" w:cs="Calibri" w:eastAsia="Calibri" w:hAnsi="Calibri"/>
           <w:b/>
           <w:bCs/>
         </w:rPr>
@@ -3782,7 +3761,7 @@
       </w:pPr>
       <w:r>
         <w:rPr>
-          <w:rFonts w:ascii="Arial" w:cs="Arial" w:eastAsia="Arial" w:hAnsi="Arial"/>
+          <w:rFonts w:ascii="Calibri" w:cs="Calibri" w:eastAsia="Calibri" w:hAnsi="Calibri"/>
         </w:rPr>
         <w:t xml:space="preserve">Ejemplos: marcapasos, bombas de insulina, implantes médicos y desfibriladores con conectividad inalámbrica, monitoreo remoto y NFC.</w:t>
       </w:r>
@@ -3798,7 +3777,7 @@
       </w:pPr>
       <w:r>
         <w:rPr>
-          <w:rFonts w:ascii="Arial" w:cs="Arial" w:eastAsia="Arial" w:hAnsi="Arial"/>
+          <w:rFonts w:ascii="Calibri" w:cs="Calibri" w:eastAsia="Calibri" w:hAnsi="Calibri"/>
         </w:rPr>
         <w:t xml:space="preserve">Sus vulnerabilidades pueden generar problemas de seguridad para pacientes, filtración de historiales médicos o acceso a la red por ciberdelincuentes.</w:t>
       </w:r>
@@ -3809,7 +3788,7 @@
       </w:pPr>
       <w:r>
         <w:rPr>
-          <w:rFonts w:ascii="Arial" w:cs="Arial" w:eastAsia="Arial" w:hAnsi="Arial"/>
+          <w:rFonts w:ascii="Calibri" w:cs="Calibri" w:eastAsia="Calibri" w:hAnsi="Calibri"/>
           <w:b/>
           <w:bCs/>
         </w:rPr>
@@ -3827,7 +3806,7 @@
       </w:pPr>
       <w:r>
         <w:rPr>
-          <w:rFonts w:ascii="Arial" w:cs="Arial" w:eastAsia="Arial" w:hAnsi="Arial"/>
+          <w:rFonts w:ascii="Calibri" w:cs="Calibri" w:eastAsia="Calibri" w:hAnsi="Calibri"/>
         </w:rPr>
         <w:t xml:space="preserve">Los sistemas a bordo guardan los datos para su funcionamiento, el mantenimiento, la protección y la transmisión de contactos de emergencia.</w:t>
       </w:r>
@@ -3843,7 +3822,7 @@
       </w:pPr>
       <w:r>
         <w:rPr>
-          <w:rFonts w:ascii="Arial" w:cs="Arial" w:eastAsia="Arial" w:hAnsi="Arial"/>
+          <w:rFonts w:ascii="Calibri" w:cs="Calibri" w:eastAsia="Calibri" w:hAnsi="Calibri"/>
         </w:rPr>
         <w:t xml:space="preserve">La interfaz inalámbrica se conecta a Internet y a una interfaz de diagnóstico a bordo.</w:t>
       </w:r>
@@ -3859,13 +3838,13 @@
       </w:pPr>
       <w:r>
         <w:rPr>
-          <w:rFonts w:ascii="Arial" w:cs="Arial" w:eastAsia="Arial" w:hAnsi="Arial"/>
+          <w:rFonts w:ascii="Calibri" w:cs="Calibri" w:eastAsia="Calibri" w:hAnsi="Calibri"/>
         </w:rPr>
         <w:t xml:space="preserve">Defensa: </w:t>
       </w:r>
       <w:r>
         <w:rPr>
-          <w:rFonts w:ascii="Arial" w:cs="Arial" w:eastAsia="Arial" w:hAnsi="Arial"/>
+          <w:rFonts w:ascii="Calibri" w:cs="Calibri" w:eastAsia="Calibri" w:hAnsi="Calibri"/>
           <w:b/>
           <w:bCs/>
         </w:rPr>
@@ -3873,7 +3852,7 @@
       </w:r>
       <w:r>
         <w:rPr>
-          <w:rFonts w:ascii="Arial" w:cs="Arial" w:eastAsia="Arial" w:hAnsi="Arial"/>
+          <w:rFonts w:ascii="Calibri" w:cs="Calibri" w:eastAsia="Calibri" w:hAnsi="Calibri"/>
         </w:rPr>
         <w:t xml:space="preserve"> entre controladores y usar firewall.</w:t>
       </w:r>
@@ -3884,7 +3863,7 @@
       </w:pPr>
       <w:r>
         <w:rPr>
-          <w:rFonts w:ascii="Arial" w:cs="Arial" w:eastAsia="Arial" w:hAnsi="Arial"/>
+          <w:rFonts w:ascii="Calibri" w:cs="Calibri" w:eastAsia="Calibri" w:hAnsi="Calibri"/>
           <w:b/>
           <w:bCs/>
         </w:rPr>
@@ -3902,7 +3881,7 @@
       </w:pPr>
       <w:r>
         <w:rPr>
-          <w:rFonts w:ascii="Arial" w:cs="Arial" w:eastAsia="Arial" w:hAnsi="Arial"/>
+          <w:rFonts w:ascii="Calibri" w:cs="Calibri" w:eastAsia="Calibri" w:hAnsi="Calibri"/>
         </w:rPr>
         <w:t xml:space="preserve">Tienen muchos sistemas de control embebidos, como el de vuelo y el de comunicación.</w:t>
       </w:r>
@@ -3918,7 +3897,7 @@
       </w:pPr>
       <w:r>
         <w:rPr>
-          <w:rFonts w:ascii="Arial" w:cs="Arial" w:eastAsia="Arial" w:hAnsi="Arial"/>
+          <w:rFonts w:ascii="Calibri" w:cs="Calibri" w:eastAsia="Calibri" w:hAnsi="Calibri"/>
         </w:rPr>
         <w:t xml:space="preserve">Problemas: credenciales de inicio de sesión codificadas (hardcoded), protocolos inseguros y puertas traseras.</w:t>
       </w:r>
@@ -3929,7 +3908,7 @@
       </w:pPr>
       <w:r>
         <w:rPr>
-          <w:rFonts w:ascii="Arial" w:cs="Arial" w:eastAsia="Arial" w:hAnsi="Arial"/>
+          <w:rFonts w:ascii="Calibri" w:cs="Calibri" w:eastAsia="Calibri" w:hAnsi="Calibri"/>
           <w:b/>
           <w:bCs/>
         </w:rPr>
@@ -3947,7 +3926,7 @@
       </w:pPr>
       <w:r>
         <w:rPr>
-          <w:rFonts w:ascii="Arial" w:cs="Arial" w:eastAsia="Arial" w:hAnsi="Arial"/>
+          <w:rFonts w:ascii="Calibri" w:cs="Calibri" w:eastAsia="Calibri" w:hAnsi="Calibri"/>
         </w:rPr>
         <w:t xml:space="preserve">Se usan en aplicaciones militares, agrícolas y cartográficas, y en fotografía aérea, vigilancia y topografía.</w:t>
       </w:r>
@@ -3963,7 +3942,7 @@
       </w:pPr>
       <w:r>
         <w:rPr>
-          <w:rFonts w:ascii="Arial" w:cs="Arial" w:eastAsia="Arial" w:hAnsi="Arial"/>
+          <w:rFonts w:ascii="Calibri" w:cs="Calibri" w:eastAsia="Calibri" w:hAnsi="Calibri"/>
         </w:rPr>
         <w:t xml:space="preserve">Son susceptibles a secuestro, ataques de WiFi, suplantación de GPS, interferencias y ataques de desautenticación.</w:t>
       </w:r>
@@ -3974,7 +3953,7 @@
       </w:pPr>
       <w:r>
         <w:rPr>
-          <w:rFonts w:ascii="Arial" w:cs="Arial" w:eastAsia="Arial" w:hAnsi="Arial"/>
+          <w:rFonts w:ascii="Calibri" w:cs="Calibri" w:eastAsia="Calibri" w:hAnsi="Calibri"/>
           <w:b/>
           <w:bCs/>
         </w:rPr>
@@ -3992,7 +3971,7 @@
       </w:pPr>
       <w:r>
         <w:rPr>
-          <w:rFonts w:ascii="Arial" w:cs="Arial" w:eastAsia="Arial" w:hAnsi="Arial"/>
+          <w:rFonts w:ascii="Calibri" w:cs="Calibri" w:eastAsia="Calibri" w:hAnsi="Calibri"/>
         </w:rPr>
         <w:t xml:space="preserve">Sirven para distraer a los atacantes de las redes de producción y para conocer sus métodos.</w:t>
       </w:r>
@@ -4008,7 +3987,7 @@
       </w:pPr>
       <w:r>
         <w:rPr>
-          <w:rFonts w:ascii="Arial" w:cs="Arial" w:eastAsia="Arial" w:hAnsi="Arial"/>
+          <w:rFonts w:ascii="Calibri" w:cs="Calibri" w:eastAsia="Calibri" w:hAnsi="Calibri"/>
         </w:rPr>
         <w:t xml:space="preserve">Agregan una capa falsa a la infraestructura.</w:t>
       </w:r>
@@ -4024,7 +4003,7 @@
       </w:pPr>
       <w:r>
         <w:rPr>
-          <w:rFonts w:ascii="Arial" w:cs="Arial" w:eastAsia="Arial" w:hAnsi="Arial"/>
+          <w:rFonts w:ascii="Calibri" w:cs="Calibri" w:eastAsia="Calibri" w:hAnsi="Calibri"/>
           <w:b/>
           <w:bCs/>
         </w:rPr>
@@ -4032,7 +4011,7 @@
       </w:r>
       <w:r>
         <w:rPr>
-          <w:rFonts w:ascii="Arial" w:cs="Arial" w:eastAsia="Arial" w:hAnsi="Arial"/>
+          <w:rFonts w:ascii="Calibri" w:cs="Calibri" w:eastAsia="Calibri" w:hAnsi="Calibri"/>
         </w:rPr>
         <w:t xml:space="preserve"> sistema señuelo que imita un servidor de la red. Se deja expuesto a propósito. Cuando el atacante lo persigue, sus actividades se registran y monitorean para revisarlas después.</w:t>
       </w:r>
@@ -4048,7 +4027,7 @@
       </w:pPr>
       <w:r>
         <w:rPr>
-          <w:rFonts w:ascii="Arial" w:cs="Arial" w:eastAsia="Arial" w:hAnsi="Arial"/>
+          <w:rFonts w:ascii="Calibri" w:cs="Calibri" w:eastAsia="Calibri" w:hAnsi="Calibri"/>
           <w:b/>
           <w:bCs/>
         </w:rPr>
@@ -4056,7 +4035,7 @@
       </w:r>
       <w:r>
         <w:rPr>
-          <w:rFonts w:ascii="Arial" w:cs="Arial" w:eastAsia="Arial" w:hAnsi="Arial"/>
+          <w:rFonts w:ascii="Calibri" w:cs="Calibri" w:eastAsia="Calibri" w:hAnsi="Calibri"/>
         </w:rPr>
         <w:t xml:space="preserve"> una colección de honeypots.</w:t>
       </w:r>
@@ -4072,7 +4051,7 @@
       </w:pPr>
       <w:r>
         <w:rPr>
-          <w:rFonts w:ascii="Arial" w:cs="Arial" w:eastAsia="Arial" w:hAnsi="Arial"/>
+          <w:rFonts w:ascii="Calibri" w:cs="Calibri" w:eastAsia="Calibri" w:hAnsi="Calibri"/>
           <w:b/>
           <w:bCs/>
         </w:rPr>
@@ -4080,7 +4059,7 @@
       </w:r>
       <w:r>
         <w:rPr>
-          <w:rFonts w:ascii="Arial" w:cs="Arial" w:eastAsia="Arial" w:hAnsi="Arial"/>
+          <w:rFonts w:ascii="Calibri" w:cs="Calibri" w:eastAsia="Calibri" w:hAnsi="Calibri"/>
         </w:rPr>
         <w:t xml:space="preserve"> impide la resolución de nombres de host de URL específicas y aleja a los usuarios de recursos maliciosos.</w:t>
       </w:r>
@@ -4300,7 +4279,7 @@
   <w:docDefaults>
     <w:rPrDefault>
       <w:rPr>
-        <w:rFonts w:ascii="Arial" w:cs="Arial" w:eastAsia="Arial" w:hAnsi="Arial"/>
+        <w:rFonts w:ascii="Calibri" w:cs="Calibri" w:eastAsia="Calibri" w:hAnsi="Calibri"/>
         <w:sz w:val="24"/>
         <w:szCs w:val="24"/>
       </w:rPr>
@@ -4487,7 +4466,7 @@
       <w:outlineLvl w:val="0"/>
     </w:pPr>
     <w:rPr>
-      <w:rFonts w:ascii="Arial" w:cs="Arial" w:eastAsia="Arial" w:hAnsi="Arial"/>
+      <w:rFonts w:ascii="Calibri" w:cs="Calibri" w:eastAsia="Calibri" w:hAnsi="Calibri"/>
       <w:b/>
       <w:bCs/>
       <w:color w:val="000000"/>
@@ -4504,7 +4483,7 @@
       <w:outlineLvl w:val="2"/>
     </w:pPr>
     <w:rPr>
-      <w:rFonts w:ascii="Arial" w:cs="Arial" w:eastAsia="Arial" w:hAnsi="Arial"/>
+      <w:rFonts w:ascii="Calibri" w:cs="Calibri" w:eastAsia="Calibri" w:hAnsi="Calibri"/>
       <w:b/>
       <w:bCs/>
       <w:color w:val="000000"/>

</xml_diff>